<commit_message>
Update CAT2 and FAT to full official columns - S.No to Seat No - A4 beautiful format
</commit_message>
<xml_diff>
--- a/FAT/FAT_Exam_Schedule_2026.docx
+++ b/FAT/FAT_Exam_Schedule_2026.docx
@@ -4,28 +4,28 @@
   <w:body>
     <w:p>
       <w:pPr>
-        <w:spacing w:after="60"/>
+        <w:spacing w:after="40"/>
       </w:pPr>
       <w:r>
         <w:rPr>
           <w:rFonts w:ascii="Liberation Sans" w:hAnsi="Liberation Sans"/>
           <w:b/>
           <w:color w:val="007F83"/>
-          <w:sz w:val="18"/>
+          <w:sz w:val="16"/>
         </w:rPr>
         <w:t>ACADEMIC PLANNER  /  FALL 2026</w:t>
       </w:r>
     </w:p>
     <w:p>
       <w:pPr>
-        <w:spacing w:after="60"/>
+        <w:spacing w:after="40"/>
       </w:pPr>
       <w:r>
         <w:rPr>
           <w:rFonts w:ascii="Liberation Sans" w:hAnsi="Liberation Sans"/>
           <w:b/>
           <w:color w:val="172E46"/>
-          <w:sz w:val="58"/>
+          <w:sz w:val="44"/>
         </w:rPr>
         <w:t>FAT</w:t>
       </w:r>
@@ -33,20 +33,20 @@
         <w:rPr>
           <w:rFonts w:ascii="Liberation Sans" w:hAnsi="Liberation Sans"/>
           <w:color w:val="172E46"/>
-          <w:sz w:val="46"/>
+          <w:sz w:val="36"/>
         </w:rPr>
         <w:t xml:space="preserve">  Examination Schedule</w:t>
       </w:r>
     </w:p>
     <w:p>
       <w:pPr>
-        <w:spacing w:after="280"/>
+        <w:spacing w:after="160"/>
       </w:pPr>
       <w:r>
         <w:rPr>
           <w:rFonts w:ascii="Liberation Sans" w:hAnsi="Liberation Sans"/>
           <w:color w:val="526579"/>
-          <w:sz w:val="22"/>
+          <w:sz w:val="18"/>
         </w:rPr>
         <w:t>12 November – 01 December 2026   •   7 examinations   •   Date-wise ascending order</w:t>
       </w:r>
@@ -59,28 +59,35 @@
         <w:tblLook w:firstColumn="1" w:firstRow="1" w:lastColumn="0" w:lastRow="0" w:noHBand="0" w:noVBand="1" w:val="04A0"/>
       </w:tblPr>
       <w:tblGrid>
-        <w:gridCol w:w="1613"/>
-        <w:gridCol w:w="4536"/>
-        <w:gridCol w:w="2030"/>
-        <w:gridCol w:w="1253"/>
-        <w:gridCol w:w="1181"/>
-        <w:gridCol w:w="1656"/>
-        <w:gridCol w:w="2837"/>
+        <w:gridCol w:w="504"/>
+        <w:gridCol w:w="1080"/>
+        <w:gridCol w:w="2664"/>
+        <w:gridCol w:w="792"/>
+        <w:gridCol w:w="1368"/>
+        <w:gridCol w:w="792"/>
+        <w:gridCol w:w="1080"/>
+        <w:gridCol w:w="864"/>
+        <w:gridCol w:w="1008"/>
+        <w:gridCol w:w="1368"/>
+        <w:gridCol w:w="648"/>
+        <w:gridCol w:w="792"/>
+        <w:gridCol w:w="648"/>
       </w:tblGrid>
       <w:tr>
         <w:trPr>
           <w:tblHeader/>
+          <w:cantSplit/>
         </w:trPr>
         <w:tc>
           <w:tcPr>
-            <w:tcW w:type="dxa" w:w="1613"/>
+            <w:tcW w:type="dxa" w:w="504"/>
+            <w:tcMar>
+              <w:top w:w="60" w:type="dxa"/>
+              <w:bottom w:w="60" w:type="dxa"/>
+              <w:left w:w="40" w:type="dxa"/>
+              <w:right w:w="40" w:type="dxa"/>
+            </w:tcMar>
             <w:shd w:fill="172E46"/>
-            <w:tcMar>
-              <w:top w:w="115" w:type="dxa"/>
-              <w:bottom w:w="115" w:type="dxa"/>
-              <w:left w:w="95" w:type="dxa"/>
-              <w:right w:w="75" w:type="dxa"/>
-            </w:tcMar>
             <w:vAlign w:val="center"/>
           </w:tcPr>
           <w:p>
@@ -89,22 +96,22 @@
                 <w:rFonts w:ascii="Liberation Sans" w:hAnsi="Liberation Sans"/>
                 <w:b/>
                 <w:color w:val="FFFFFF"/>
-                <w:sz w:val="17"/>
+                <w:sz w:val="13"/>
               </w:rPr>
-              <w:t>DATE / DAY</w:t>
+              <w:t>S.No</w:t>
             </w:r>
           </w:p>
         </w:tc>
         <w:tc>
           <w:tcPr>
-            <w:tcW w:type="dxa" w:w="4536"/>
+            <w:tcW w:type="dxa" w:w="1080"/>
+            <w:tcMar>
+              <w:top w:w="60" w:type="dxa"/>
+              <w:bottom w:w="60" w:type="dxa"/>
+              <w:left w:w="40" w:type="dxa"/>
+              <w:right w:w="40" w:type="dxa"/>
+            </w:tcMar>
             <w:shd w:fill="172E46"/>
-            <w:tcMar>
-              <w:top w:w="115" w:type="dxa"/>
-              <w:bottom w:w="115" w:type="dxa"/>
-              <w:left w:w="95" w:type="dxa"/>
-              <w:right w:w="75" w:type="dxa"/>
-            </w:tcMar>
             <w:vAlign w:val="center"/>
           </w:tcPr>
           <w:p>
@@ -113,22 +120,22 @@
                 <w:rFonts w:ascii="Liberation Sans" w:hAnsi="Liberation Sans"/>
                 <w:b/>
                 <w:color w:val="FFFFFF"/>
-                <w:sz w:val="17"/>
+                <w:sz w:val="13"/>
               </w:rPr>
-              <w:t>COURSE</w:t>
+              <w:t>Course Code</w:t>
             </w:r>
           </w:p>
         </w:tc>
         <w:tc>
           <w:tcPr>
-            <w:tcW w:type="dxa" w:w="2030"/>
+            <w:tcW w:type="dxa" w:w="2664"/>
+            <w:tcMar>
+              <w:top w:w="60" w:type="dxa"/>
+              <w:bottom w:w="60" w:type="dxa"/>
+              <w:left w:w="40" w:type="dxa"/>
+              <w:right w:w="40" w:type="dxa"/>
+            </w:tcMar>
             <w:shd w:fill="172E46"/>
-            <w:tcMar>
-              <w:top w:w="115" w:type="dxa"/>
-              <w:bottom w:w="115" w:type="dxa"/>
-              <w:left w:w="95" w:type="dxa"/>
-              <w:right w:w="75" w:type="dxa"/>
-            </w:tcMar>
             <w:vAlign w:val="center"/>
           </w:tcPr>
           <w:p>
@@ -137,22 +144,22 @@
                 <w:rFonts w:ascii="Liberation Sans" w:hAnsi="Liberation Sans"/>
                 <w:b/>
                 <w:color w:val="FFFFFF"/>
-                <w:sz w:val="17"/>
+                <w:sz w:val="13"/>
               </w:rPr>
-              <w:t>CLASS ID</w:t>
+              <w:t>Course Title</w:t>
             </w:r>
           </w:p>
         </w:tc>
         <w:tc>
           <w:tcPr>
-            <w:tcW w:type="dxa" w:w="1253"/>
+            <w:tcW w:type="dxa" w:w="792"/>
+            <w:tcMar>
+              <w:top w:w="60" w:type="dxa"/>
+              <w:bottom w:w="60" w:type="dxa"/>
+              <w:left w:w="40" w:type="dxa"/>
+              <w:right w:w="40" w:type="dxa"/>
+            </w:tcMar>
             <w:shd w:fill="172E46"/>
-            <w:tcMar>
-              <w:top w:w="115" w:type="dxa"/>
-              <w:bottom w:w="115" w:type="dxa"/>
-              <w:left w:w="95" w:type="dxa"/>
-              <w:right w:w="75" w:type="dxa"/>
-            </w:tcMar>
             <w:vAlign w:val="center"/>
           </w:tcPr>
           <w:p>
@@ -161,22 +168,22 @@
                 <w:rFonts w:ascii="Liberation Sans" w:hAnsi="Liberation Sans"/>
                 <w:b/>
                 <w:color w:val="FFFFFF"/>
-                <w:sz w:val="17"/>
+                <w:sz w:val="13"/>
               </w:rPr>
-              <w:t>SLOT</w:t>
+              <w:t>Course Type</w:t>
             </w:r>
           </w:p>
         </w:tc>
         <w:tc>
           <w:tcPr>
-            <w:tcW w:type="dxa" w:w="1181"/>
+            <w:tcW w:type="dxa" w:w="1368"/>
+            <w:tcMar>
+              <w:top w:w="60" w:type="dxa"/>
+              <w:bottom w:w="60" w:type="dxa"/>
+              <w:left w:w="40" w:type="dxa"/>
+              <w:right w:w="40" w:type="dxa"/>
+            </w:tcMar>
             <w:shd w:fill="172E46"/>
-            <w:tcMar>
-              <w:top w:w="115" w:type="dxa"/>
-              <w:bottom w:w="115" w:type="dxa"/>
-              <w:left w:w="95" w:type="dxa"/>
-              <w:right w:w="75" w:type="dxa"/>
-            </w:tcMar>
             <w:vAlign w:val="center"/>
           </w:tcPr>
           <w:p>
@@ -185,22 +192,22 @@
                 <w:rFonts w:ascii="Liberation Sans" w:hAnsi="Liberation Sans"/>
                 <w:b/>
                 <w:color w:val="FFFFFF"/>
-                <w:sz w:val="17"/>
+                <w:sz w:val="13"/>
               </w:rPr>
-              <w:t>SESSION</w:t>
+              <w:t>Class ID</w:t>
             </w:r>
           </w:p>
         </w:tc>
         <w:tc>
           <w:tcPr>
-            <w:tcW w:type="dxa" w:w="1656"/>
+            <w:tcW w:type="dxa" w:w="792"/>
+            <w:tcMar>
+              <w:top w:w="60" w:type="dxa"/>
+              <w:bottom w:w="60" w:type="dxa"/>
+              <w:left w:w="40" w:type="dxa"/>
+              <w:right w:w="40" w:type="dxa"/>
+            </w:tcMar>
             <w:shd w:fill="172E46"/>
-            <w:tcMar>
-              <w:top w:w="115" w:type="dxa"/>
-              <w:bottom w:w="115" w:type="dxa"/>
-              <w:left w:w="95" w:type="dxa"/>
-              <w:right w:w="75" w:type="dxa"/>
-            </w:tcMar>
             <w:vAlign w:val="center"/>
           </w:tcPr>
           <w:p>
@@ -209,22 +216,22 @@
                 <w:rFonts w:ascii="Liberation Sans" w:hAnsi="Liberation Sans"/>
                 <w:b/>
                 <w:color w:val="FFFFFF"/>
-                <w:sz w:val="17"/>
+                <w:sz w:val="13"/>
               </w:rPr>
-              <w:t>REPORTING*</w:t>
+              <w:t>Slot</w:t>
             </w:r>
           </w:p>
         </w:tc>
         <w:tc>
           <w:tcPr>
-            <w:tcW w:type="dxa" w:w="2837"/>
+            <w:tcW w:type="dxa" w:w="1080"/>
+            <w:tcMar>
+              <w:top w:w="60" w:type="dxa"/>
+              <w:bottom w:w="60" w:type="dxa"/>
+              <w:left w:w="40" w:type="dxa"/>
+              <w:right w:w="40" w:type="dxa"/>
+            </w:tcMar>
             <w:shd w:fill="172E46"/>
-            <w:tcMar>
-              <w:top w:w="115" w:type="dxa"/>
-              <w:bottom w:w="115" w:type="dxa"/>
-              <w:left w:w="95" w:type="dxa"/>
-              <w:right w:w="75" w:type="dxa"/>
-            </w:tcMar>
             <w:vAlign w:val="center"/>
           </w:tcPr>
           <w:p>
@@ -233,9 +240,153 @@
                 <w:rFonts w:ascii="Liberation Sans" w:hAnsi="Liberation Sans"/>
                 <w:b/>
                 <w:color w:val="FFFFFF"/>
-                <w:sz w:val="17"/>
+                <w:sz w:val="13"/>
               </w:rPr>
-              <w:t>EXAMINATION TIME</w:t>
+              <w:t>Exam Date</w:t>
+            </w:r>
+          </w:p>
+        </w:tc>
+        <w:tc>
+          <w:tcPr>
+            <w:tcW w:type="dxa" w:w="864"/>
+            <w:tcMar>
+              <w:top w:w="60" w:type="dxa"/>
+              <w:bottom w:w="60" w:type="dxa"/>
+              <w:left w:w="40" w:type="dxa"/>
+              <w:right w:w="40" w:type="dxa"/>
+            </w:tcMar>
+            <w:shd w:fill="172E46"/>
+            <w:vAlign w:val="center"/>
+          </w:tcPr>
+          <w:p>
+            <w:r>
+              <w:rPr>
+                <w:rFonts w:ascii="Liberation Sans" w:hAnsi="Liberation Sans"/>
+                <w:b/>
+                <w:color w:val="FFFFFF"/>
+                <w:sz w:val="13"/>
+              </w:rPr>
+              <w:t>Exam Session</w:t>
+            </w:r>
+          </w:p>
+        </w:tc>
+        <w:tc>
+          <w:tcPr>
+            <w:tcW w:type="dxa" w:w="1008"/>
+            <w:tcMar>
+              <w:top w:w="60" w:type="dxa"/>
+              <w:bottom w:w="60" w:type="dxa"/>
+              <w:left w:w="40" w:type="dxa"/>
+              <w:right w:w="40" w:type="dxa"/>
+            </w:tcMar>
+            <w:shd w:fill="172E46"/>
+            <w:vAlign w:val="center"/>
+          </w:tcPr>
+          <w:p>
+            <w:r>
+              <w:rPr>
+                <w:rFonts w:ascii="Liberation Sans" w:hAnsi="Liberation Sans"/>
+                <w:b/>
+                <w:color w:val="FFFFFF"/>
+                <w:sz w:val="13"/>
+              </w:rPr>
+              <w:t>Reporting Time</w:t>
+            </w:r>
+          </w:p>
+        </w:tc>
+        <w:tc>
+          <w:tcPr>
+            <w:tcW w:type="dxa" w:w="1368"/>
+            <w:tcMar>
+              <w:top w:w="60" w:type="dxa"/>
+              <w:bottom w:w="60" w:type="dxa"/>
+              <w:left w:w="40" w:type="dxa"/>
+              <w:right w:w="40" w:type="dxa"/>
+            </w:tcMar>
+            <w:shd w:fill="172E46"/>
+            <w:vAlign w:val="center"/>
+          </w:tcPr>
+          <w:p>
+            <w:r>
+              <w:rPr>
+                <w:rFonts w:ascii="Liberation Sans" w:hAnsi="Liberation Sans"/>
+                <w:b/>
+                <w:color w:val="FFFFFF"/>
+                <w:sz w:val="13"/>
+              </w:rPr>
+              <w:t>Exam Time</w:t>
+            </w:r>
+          </w:p>
+        </w:tc>
+        <w:tc>
+          <w:tcPr>
+            <w:tcW w:type="dxa" w:w="648"/>
+            <w:tcMar>
+              <w:top w:w="60" w:type="dxa"/>
+              <w:bottom w:w="60" w:type="dxa"/>
+              <w:left w:w="40" w:type="dxa"/>
+              <w:right w:w="40" w:type="dxa"/>
+            </w:tcMar>
+            <w:shd w:fill="172E46"/>
+            <w:vAlign w:val="center"/>
+          </w:tcPr>
+          <w:p>
+            <w:r>
+              <w:rPr>
+                <w:rFonts w:ascii="Liberation Sans" w:hAnsi="Liberation Sans"/>
+                <w:b/>
+                <w:color w:val="FFFFFF"/>
+                <w:sz w:val="13"/>
+              </w:rPr>
+              <w:t>Venue</w:t>
+            </w:r>
+          </w:p>
+        </w:tc>
+        <w:tc>
+          <w:tcPr>
+            <w:tcW w:type="dxa" w:w="792"/>
+            <w:tcMar>
+              <w:top w:w="60" w:type="dxa"/>
+              <w:bottom w:w="60" w:type="dxa"/>
+              <w:left w:w="40" w:type="dxa"/>
+              <w:right w:w="40" w:type="dxa"/>
+            </w:tcMar>
+            <w:shd w:fill="172E46"/>
+            <w:vAlign w:val="center"/>
+          </w:tcPr>
+          <w:p>
+            <w:r>
+              <w:rPr>
+                <w:rFonts w:ascii="Liberation Sans" w:hAnsi="Liberation Sans"/>
+                <w:b/>
+                <w:color w:val="FFFFFF"/>
+                <w:sz w:val="13"/>
+              </w:rPr>
+              <w:t>Seat Location</w:t>
+            </w:r>
+          </w:p>
+        </w:tc>
+        <w:tc>
+          <w:tcPr>
+            <w:tcW w:type="dxa" w:w="648"/>
+            <w:tcMar>
+              <w:top w:w="60" w:type="dxa"/>
+              <w:bottom w:w="60" w:type="dxa"/>
+              <w:left w:w="40" w:type="dxa"/>
+              <w:right w:w="40" w:type="dxa"/>
+            </w:tcMar>
+            <w:shd w:fill="172E46"/>
+            <w:vAlign w:val="center"/>
+          </w:tcPr>
+          <w:p>
+            <w:r>
+              <w:rPr>
+                <w:rFonts w:ascii="Liberation Sans" w:hAnsi="Liberation Sans"/>
+                <w:b/>
+                <w:color w:val="FFFFFF"/>
+                <w:sz w:val="13"/>
+              </w:rPr>
+              <w:t>Seat No.</w:t>
             </w:r>
           </w:p>
         </w:tc>
@@ -246,28 +397,177 @@
         </w:trPr>
         <w:tc>
           <w:tcPr>
-            <w:tcW w:type="dxa" w:w="1613"/>
+            <w:tcW w:type="dxa" w:w="504"/>
             <w:tcMar>
-              <w:top w:w="115" w:type="dxa"/>
-              <w:bottom w:w="115" w:type="dxa"/>
-              <w:left w:w="95" w:type="dxa"/>
-              <w:right w:w="75" w:type="dxa"/>
+              <w:top w:w="60" w:type="dxa"/>
+              <w:bottom w:w="60" w:type="dxa"/>
+              <w:left w:w="40" w:type="dxa"/>
+              <w:right w:w="40" w:type="dxa"/>
             </w:tcMar>
             <w:shd w:fill="F0F5F8"/>
             <w:vAlign w:val="center"/>
           </w:tcPr>
           <w:p>
-            <w:pPr>
-              <w:spacing w:line="259" w:lineRule="auto"/>
-            </w:pPr>
             <w:r>
               <w:rPr>
                 <w:rFonts w:ascii="Liberation Sans" w:hAnsi="Liberation Sans"/>
                 <w:b/>
-                <w:color w:val="007F83"/>
-                <w:sz w:val="22"/>
+                <w:color w:val="172E46"/>
+                <w:sz w:val="14"/>
               </w:rPr>
-              <w:t>12 Nov</w:t>
+              <w:t>1</w:t>
+            </w:r>
+          </w:p>
+        </w:tc>
+        <w:tc>
+          <w:tcPr>
+            <w:tcW w:type="dxa" w:w="1080"/>
+            <w:tcMar>
+              <w:top w:w="60" w:type="dxa"/>
+              <w:bottom w:w="60" w:type="dxa"/>
+              <w:left w:w="40" w:type="dxa"/>
+              <w:right w:w="40" w:type="dxa"/>
+            </w:tcMar>
+            <w:shd w:fill="F0F5F8"/>
+            <w:vAlign w:val="center"/>
+          </w:tcPr>
+          <w:p>
+            <w:r>
+              <w:rPr>
+                <w:rFonts w:ascii="Liberation Sans" w:hAnsi="Liberation Sans"/>
+                <w:b/>
+                <w:color w:val="172E46"/>
+                <w:sz w:val="14"/>
+              </w:rPr>
+              <w:t>MACSE502</w:t>
+            </w:r>
+          </w:p>
+        </w:tc>
+        <w:tc>
+          <w:tcPr>
+            <w:tcW w:type="dxa" w:w="2664"/>
+            <w:tcMar>
+              <w:top w:w="60" w:type="dxa"/>
+              <w:bottom w:w="60" w:type="dxa"/>
+              <w:left w:w="40" w:type="dxa"/>
+              <w:right w:w="40" w:type="dxa"/>
+            </w:tcMar>
+            <w:shd w:fill="F0F5F8"/>
+            <w:vAlign w:val="center"/>
+          </w:tcPr>
+          <w:p>
+            <w:r>
+              <w:rPr>
+                <w:rFonts w:ascii="Liberation Sans" w:hAnsi="Liberation Sans"/>
+                <w:b w:val="0"/>
+                <w:color w:val="172E46"/>
+                <w:sz w:val="14"/>
+              </w:rPr>
+              <w:t>Programming for Data Science</w:t>
+            </w:r>
+          </w:p>
+        </w:tc>
+        <w:tc>
+          <w:tcPr>
+            <w:tcW w:type="dxa" w:w="792"/>
+            <w:tcMar>
+              <w:top w:w="60" w:type="dxa"/>
+              <w:bottom w:w="60" w:type="dxa"/>
+              <w:left w:w="40" w:type="dxa"/>
+              <w:right w:w="40" w:type="dxa"/>
+            </w:tcMar>
+            <w:shd w:fill="F0F5F8"/>
+            <w:vAlign w:val="center"/>
+          </w:tcPr>
+          <w:p>
+            <w:r>
+              <w:rPr>
+                <w:rFonts w:ascii="Liberation Sans" w:hAnsi="Liberation Sans"/>
+                <w:b w:val="0"/>
+                <w:color w:val="172E46"/>
+                <w:sz w:val="14"/>
+              </w:rPr>
+              <w:t>ETH</w:t>
+            </w:r>
+          </w:p>
+        </w:tc>
+        <w:tc>
+          <w:tcPr>
+            <w:tcW w:type="dxa" w:w="1368"/>
+            <w:tcMar>
+              <w:top w:w="60" w:type="dxa"/>
+              <w:bottom w:w="60" w:type="dxa"/>
+              <w:left w:w="40" w:type="dxa"/>
+              <w:right w:w="40" w:type="dxa"/>
+            </w:tcMar>
+            <w:shd w:fill="F0F5F8"/>
+            <w:vAlign w:val="center"/>
+          </w:tcPr>
+          <w:p>
+            <w:r>
+              <w:rPr>
+                <w:rFonts w:ascii="Liberation Sans" w:hAnsi="Liberation Sans"/>
+                <w:b w:val="0"/>
+                <w:color w:val="172E46"/>
+                <w:sz w:val="12"/>
+              </w:rPr>
+              <w:t>VL2026270106067</w:t>
+            </w:r>
+          </w:p>
+        </w:tc>
+        <w:tc>
+          <w:tcPr>
+            <w:tcW w:type="dxa" w:w="792"/>
+            <w:tcMar>
+              <w:top w:w="60" w:type="dxa"/>
+              <w:bottom w:w="60" w:type="dxa"/>
+              <w:left w:w="40" w:type="dxa"/>
+              <w:right w:w="40" w:type="dxa"/>
+            </w:tcMar>
+            <w:shd w:fill="F0F5F8"/>
+            <w:vAlign w:val="center"/>
+          </w:tcPr>
+          <w:p>
+            <w:r>
+              <w:rPr>
+                <w:rFonts w:ascii="Liberation Sans" w:hAnsi="Liberation Sans"/>
+                <w:b w:val="0"/>
+                <w:color w:val="172E46"/>
+                <w:sz w:val="14"/>
+              </w:rPr>
+              <w:t>A1+TA1</w:t>
+            </w:r>
+          </w:p>
+        </w:tc>
+        <w:tc>
+          <w:tcPr>
+            <w:tcW w:type="dxa" w:w="1080"/>
+            <w:tcMar>
+              <w:top w:w="60" w:type="dxa"/>
+              <w:bottom w:w="60" w:type="dxa"/>
+              <w:left w:w="40" w:type="dxa"/>
+              <w:right w:w="40" w:type="dxa"/>
+            </w:tcMar>
+            <w:shd w:fill="F0F5F8"/>
+            <w:vAlign w:val="center"/>
+          </w:tcPr>
+          <w:p>
+            <w:r>
+              <w:rPr>
+                <w:rFonts w:ascii="Liberation Sans" w:hAnsi="Liberation Sans"/>
+                <w:b/>
+                <w:color w:val="172E46"/>
+                <w:sz w:val="14"/>
+              </w:rPr>
+              <w:t>12-Nov-2026</w:t>
+            </w:r>
+            <w:r>
+              <w:rPr>
+                <w:rFonts w:ascii="Liberation Sans" w:hAnsi="Liberation Sans"/>
+                <w:b w:val="0"/>
+                <w:color w:val="172E46"/>
+                <w:sz w:val="2"/>
+              </w:rPr>
             </w:r>
           </w:p>
           <w:p>
@@ -276,126 +576,31 @@
                 <w:rFonts w:ascii="Liberation Sans" w:hAnsi="Liberation Sans"/>
                 <w:b w:val="0"/>
                 <w:color w:val="526579"/>
-                <w:sz w:val="18"/>
+                <w:sz w:val="12"/>
               </w:rPr>
-              <w:t>Thursday</w:t>
+              <w:t>Thu</w:t>
             </w:r>
           </w:p>
         </w:tc>
         <w:tc>
           <w:tcPr>
-            <w:tcW w:type="dxa" w:w="4536"/>
+            <w:tcW w:type="dxa" w:w="864"/>
             <w:tcMar>
-              <w:top w:w="115" w:type="dxa"/>
-              <w:bottom w:w="115" w:type="dxa"/>
-              <w:left w:w="95" w:type="dxa"/>
-              <w:right w:w="75" w:type="dxa"/>
+              <w:top w:w="60" w:type="dxa"/>
+              <w:bottom w:w="60" w:type="dxa"/>
+              <w:left w:w="40" w:type="dxa"/>
+              <w:right w:w="40" w:type="dxa"/>
             </w:tcMar>
             <w:shd w:fill="F0F5F8"/>
             <w:vAlign w:val="center"/>
           </w:tcPr>
           <w:p>
-            <w:pPr>
-              <w:spacing w:line="259" w:lineRule="auto"/>
-            </w:pPr>
-            <w:r>
-              <w:rPr>
-                <w:rFonts w:ascii="Liberation Sans" w:hAnsi="Liberation Sans"/>
-                <w:b/>
-                <w:color w:val="172E46"/>
-                <w:sz w:val="22"/>
-              </w:rPr>
-              <w:t>Programming for Data Science</w:t>
-            </w:r>
-          </w:p>
-          <w:p>
-            <w:r>
-              <w:rPr>
-                <w:rFonts w:ascii="Liberation Sans" w:hAnsi="Liberation Sans"/>
-                <w:b w:val="0"/>
-                <w:color w:val="526579"/>
-                <w:sz w:val="18"/>
-              </w:rPr>
-              <w:t>MACSE502  •  ETH</w:t>
-            </w:r>
-          </w:p>
-        </w:tc>
-        <w:tc>
-          <w:tcPr>
-            <w:tcW w:type="dxa" w:w="2030"/>
-            <w:tcMar>
-              <w:top w:w="115" w:type="dxa"/>
-              <w:bottom w:w="115" w:type="dxa"/>
-              <w:left w:w="95" w:type="dxa"/>
-              <w:right w:w="75" w:type="dxa"/>
-            </w:tcMar>
-            <w:shd w:fill="F0F5F8"/>
-            <w:vAlign w:val="center"/>
-          </w:tcPr>
-          <w:p>
-            <w:pPr>
-              <w:spacing w:line="259" w:lineRule="auto"/>
-            </w:pPr>
-            <w:r>
-              <w:rPr>
-                <w:rFonts w:ascii="Liberation Sans" w:hAnsi="Liberation Sans"/>
-                <w:b w:val="0"/>
-                <w:color w:val="526579"/>
-                <w:sz w:val="17"/>
-              </w:rPr>
-              <w:t>VL2026270106067</w:t>
-            </w:r>
-          </w:p>
-        </w:tc>
-        <w:tc>
-          <w:tcPr>
-            <w:tcW w:type="dxa" w:w="1253"/>
-            <w:tcMar>
-              <w:top w:w="115" w:type="dxa"/>
-              <w:bottom w:w="115" w:type="dxa"/>
-              <w:left w:w="95" w:type="dxa"/>
-              <w:right w:w="75" w:type="dxa"/>
-            </w:tcMar>
-            <w:shd w:fill="F0F5F8"/>
-            <w:vAlign w:val="center"/>
-          </w:tcPr>
-          <w:p>
-            <w:pPr>
-              <w:spacing w:line="259" w:lineRule="auto"/>
-            </w:pPr>
             <w:r>
               <w:rPr>
                 <w:rFonts w:ascii="Liberation Sans" w:hAnsi="Liberation Sans"/>
                 <w:b w:val="0"/>
                 <w:color w:val="172E46"/>
-                <w:sz w:val="19"/>
-              </w:rPr>
-              <w:t>A1+TA1</w:t>
-            </w:r>
-          </w:p>
-        </w:tc>
-        <w:tc>
-          <w:tcPr>
-            <w:tcW w:type="dxa" w:w="1181"/>
-            <w:tcMar>
-              <w:top w:w="115" w:type="dxa"/>
-              <w:bottom w:w="115" w:type="dxa"/>
-              <w:left w:w="95" w:type="dxa"/>
-              <w:right w:w="75" w:type="dxa"/>
-            </w:tcMar>
-            <w:shd w:fill="F0F5F8"/>
-            <w:vAlign w:val="center"/>
-          </w:tcPr>
-          <w:p>
-            <w:pPr>
-              <w:spacing w:line="259" w:lineRule="auto"/>
-            </w:pPr>
-            <w:r>
-              <w:rPr>
-                <w:rFonts w:ascii="Liberation Sans" w:hAnsi="Liberation Sans"/>
-                <w:b w:val="0"/>
-                <w:color w:val="172E46"/>
-                <w:sz w:val="19"/>
+                <w:sz w:val="14"/>
               </w:rPr>
               <w:t>FN1</w:t>
             </w:r>
@@ -403,26 +608,23 @@
         </w:tc>
         <w:tc>
           <w:tcPr>
-            <w:tcW w:type="dxa" w:w="1656"/>
+            <w:tcW w:type="dxa" w:w="1008"/>
             <w:tcMar>
-              <w:top w:w="115" w:type="dxa"/>
-              <w:bottom w:w="115" w:type="dxa"/>
-              <w:left w:w="95" w:type="dxa"/>
-              <w:right w:w="75" w:type="dxa"/>
+              <w:top w:w="60" w:type="dxa"/>
+              <w:bottom w:w="60" w:type="dxa"/>
+              <w:left w:w="40" w:type="dxa"/>
+              <w:right w:w="40" w:type="dxa"/>
             </w:tcMar>
             <w:shd w:fill="F0F5F8"/>
             <w:vAlign w:val="center"/>
           </w:tcPr>
           <w:p>
-            <w:pPr>
-              <w:spacing w:line="259" w:lineRule="auto"/>
-            </w:pPr>
             <w:r>
               <w:rPr>
                 <w:rFonts w:ascii="Liberation Sans" w:hAnsi="Liberation Sans"/>
                 <w:b w:val="0"/>
                 <w:color w:val="172E46"/>
-                <w:sz w:val="20"/>
+                <w:sz w:val="14"/>
               </w:rPr>
               <w:t>08:45 AM</w:t>
             </w:r>
@@ -430,28 +632,97 @@
         </w:tc>
         <w:tc>
           <w:tcPr>
-            <w:tcW w:type="dxa" w:w="2837"/>
+            <w:tcW w:type="dxa" w:w="1368"/>
             <w:tcMar>
-              <w:top w:w="115" w:type="dxa"/>
-              <w:bottom w:w="115" w:type="dxa"/>
-              <w:left w:w="95" w:type="dxa"/>
-              <w:right w:w="75" w:type="dxa"/>
+              <w:top w:w="60" w:type="dxa"/>
+              <w:bottom w:w="60" w:type="dxa"/>
+              <w:left w:w="40" w:type="dxa"/>
+              <w:right w:w="40" w:type="dxa"/>
             </w:tcMar>
             <w:shd w:fill="F0F5F8"/>
             <w:vAlign w:val="center"/>
           </w:tcPr>
           <w:p>
-            <w:pPr>
-              <w:spacing w:line="259" w:lineRule="auto"/>
-            </w:pPr>
             <w:r>
               <w:rPr>
                 <w:rFonts w:ascii="Liberation Sans" w:hAnsi="Liberation Sans"/>
                 <w:b/>
                 <w:color w:val="172E46"/>
-                <w:sz w:val="20"/>
+                <w:sz w:val="14"/>
               </w:rPr>
               <w:t>09:30 AM - 12:30 PM</w:t>
+            </w:r>
+          </w:p>
+        </w:tc>
+        <w:tc>
+          <w:tcPr>
+            <w:tcW w:type="dxa" w:w="648"/>
+            <w:tcMar>
+              <w:top w:w="60" w:type="dxa"/>
+              <w:bottom w:w="60" w:type="dxa"/>
+              <w:left w:w="40" w:type="dxa"/>
+              <w:right w:w="40" w:type="dxa"/>
+            </w:tcMar>
+            <w:shd w:fill="F0F5F8"/>
+            <w:vAlign w:val="center"/>
+          </w:tcPr>
+          <w:p>
+            <w:r>
+              <w:rPr>
+                <w:rFonts w:ascii="Liberation Sans" w:hAnsi="Liberation Sans"/>
+                <w:b w:val="0"/>
+                <w:color w:val="526579"/>
+                <w:sz w:val="14"/>
+              </w:rPr>
+              <w:t>-</w:t>
+            </w:r>
+          </w:p>
+        </w:tc>
+        <w:tc>
+          <w:tcPr>
+            <w:tcW w:type="dxa" w:w="792"/>
+            <w:tcMar>
+              <w:top w:w="60" w:type="dxa"/>
+              <w:bottom w:w="60" w:type="dxa"/>
+              <w:left w:w="40" w:type="dxa"/>
+              <w:right w:w="40" w:type="dxa"/>
+            </w:tcMar>
+            <w:shd w:fill="F0F5F8"/>
+            <w:vAlign w:val="center"/>
+          </w:tcPr>
+          <w:p>
+            <w:r>
+              <w:rPr>
+                <w:rFonts w:ascii="Liberation Sans" w:hAnsi="Liberation Sans"/>
+                <w:b w:val="0"/>
+                <w:color w:val="526579"/>
+                <w:sz w:val="14"/>
+              </w:rPr>
+              <w:t>-</w:t>
+            </w:r>
+          </w:p>
+        </w:tc>
+        <w:tc>
+          <w:tcPr>
+            <w:tcW w:type="dxa" w:w="648"/>
+            <w:tcMar>
+              <w:top w:w="60" w:type="dxa"/>
+              <w:bottom w:w="60" w:type="dxa"/>
+              <w:left w:w="40" w:type="dxa"/>
+              <w:right w:w="40" w:type="dxa"/>
+            </w:tcMar>
+            <w:shd w:fill="F0F5F8"/>
+            <w:vAlign w:val="center"/>
+          </w:tcPr>
+          <w:p>
+            <w:r>
+              <w:rPr>
+                <w:rFonts w:ascii="Liberation Sans" w:hAnsi="Liberation Sans"/>
+                <w:b w:val="0"/>
+                <w:color w:val="526579"/>
+                <w:sz w:val="14"/>
+              </w:rPr>
+              <w:t>-</w:t>
             </w:r>
           </w:p>
         </w:tc>
@@ -462,28 +733,177 @@
         </w:trPr>
         <w:tc>
           <w:tcPr>
-            <w:tcW w:type="dxa" w:w="1613"/>
+            <w:tcW w:type="dxa" w:w="504"/>
             <w:tcMar>
-              <w:top w:w="115" w:type="dxa"/>
-              <w:bottom w:w="115" w:type="dxa"/>
-              <w:left w:w="95" w:type="dxa"/>
-              <w:right w:w="75" w:type="dxa"/>
+              <w:top w:w="60" w:type="dxa"/>
+              <w:bottom w:w="60" w:type="dxa"/>
+              <w:left w:w="40" w:type="dxa"/>
+              <w:right w:w="40" w:type="dxa"/>
             </w:tcMar>
             <w:shd w:fill="FFFFFF"/>
             <w:vAlign w:val="center"/>
           </w:tcPr>
           <w:p>
-            <w:pPr>
-              <w:spacing w:line="259" w:lineRule="auto"/>
-            </w:pPr>
             <w:r>
               <w:rPr>
                 <w:rFonts w:ascii="Liberation Sans" w:hAnsi="Liberation Sans"/>
                 <w:b/>
-                <w:color w:val="007F83"/>
-                <w:sz w:val="22"/>
+                <w:color w:val="172E46"/>
+                <w:sz w:val="14"/>
               </w:rPr>
-              <w:t>14 Nov</w:t>
+              <w:t>2</w:t>
+            </w:r>
+          </w:p>
+        </w:tc>
+        <w:tc>
+          <w:tcPr>
+            <w:tcW w:type="dxa" w:w="1080"/>
+            <w:tcMar>
+              <w:top w:w="60" w:type="dxa"/>
+              <w:bottom w:w="60" w:type="dxa"/>
+              <w:left w:w="40" w:type="dxa"/>
+              <w:right w:w="40" w:type="dxa"/>
+            </w:tcMar>
+            <w:shd w:fill="FFFFFF"/>
+            <w:vAlign w:val="center"/>
+          </w:tcPr>
+          <w:p>
+            <w:r>
+              <w:rPr>
+                <w:rFonts w:ascii="Liberation Sans" w:hAnsi="Liberation Sans"/>
+                <w:b/>
+                <w:color w:val="172E46"/>
+                <w:sz w:val="14"/>
+              </w:rPr>
+              <w:t>MACSE501</w:t>
+            </w:r>
+          </w:p>
+        </w:tc>
+        <w:tc>
+          <w:tcPr>
+            <w:tcW w:type="dxa" w:w="2664"/>
+            <w:tcMar>
+              <w:top w:w="60" w:type="dxa"/>
+              <w:bottom w:w="60" w:type="dxa"/>
+              <w:left w:w="40" w:type="dxa"/>
+              <w:right w:w="40" w:type="dxa"/>
+            </w:tcMar>
+            <w:shd w:fill="FFFFFF"/>
+            <w:vAlign w:val="center"/>
+          </w:tcPr>
+          <w:p>
+            <w:r>
+              <w:rPr>
+                <w:rFonts w:ascii="Liberation Sans" w:hAnsi="Liberation Sans"/>
+                <w:b w:val="0"/>
+                <w:color w:val="172E46"/>
+                <w:sz w:val="14"/>
+              </w:rPr>
+              <w:t>Data Structures and Algorithm Analysis</w:t>
+            </w:r>
+          </w:p>
+        </w:tc>
+        <w:tc>
+          <w:tcPr>
+            <w:tcW w:type="dxa" w:w="792"/>
+            <w:tcMar>
+              <w:top w:w="60" w:type="dxa"/>
+              <w:bottom w:w="60" w:type="dxa"/>
+              <w:left w:w="40" w:type="dxa"/>
+              <w:right w:w="40" w:type="dxa"/>
+            </w:tcMar>
+            <w:shd w:fill="FFFFFF"/>
+            <w:vAlign w:val="center"/>
+          </w:tcPr>
+          <w:p>
+            <w:r>
+              <w:rPr>
+                <w:rFonts w:ascii="Liberation Sans" w:hAnsi="Liberation Sans"/>
+                <w:b w:val="0"/>
+                <w:color w:val="172E46"/>
+                <w:sz w:val="14"/>
+              </w:rPr>
+              <w:t>ETH</w:t>
+            </w:r>
+          </w:p>
+        </w:tc>
+        <w:tc>
+          <w:tcPr>
+            <w:tcW w:type="dxa" w:w="1368"/>
+            <w:tcMar>
+              <w:top w:w="60" w:type="dxa"/>
+              <w:bottom w:w="60" w:type="dxa"/>
+              <w:left w:w="40" w:type="dxa"/>
+              <w:right w:w="40" w:type="dxa"/>
+            </w:tcMar>
+            <w:shd w:fill="FFFFFF"/>
+            <w:vAlign w:val="center"/>
+          </w:tcPr>
+          <w:p>
+            <w:r>
+              <w:rPr>
+                <w:rFonts w:ascii="Liberation Sans" w:hAnsi="Liberation Sans"/>
+                <w:b w:val="0"/>
+                <w:color w:val="172E46"/>
+                <w:sz w:val="12"/>
+              </w:rPr>
+              <w:t>VL2026270106999</w:t>
+            </w:r>
+          </w:p>
+        </w:tc>
+        <w:tc>
+          <w:tcPr>
+            <w:tcW w:type="dxa" w:w="792"/>
+            <w:tcMar>
+              <w:top w:w="60" w:type="dxa"/>
+              <w:bottom w:w="60" w:type="dxa"/>
+              <w:left w:w="40" w:type="dxa"/>
+              <w:right w:w="40" w:type="dxa"/>
+            </w:tcMar>
+            <w:shd w:fill="FFFFFF"/>
+            <w:vAlign w:val="center"/>
+          </w:tcPr>
+          <w:p>
+            <w:r>
+              <w:rPr>
+                <w:rFonts w:ascii="Liberation Sans" w:hAnsi="Liberation Sans"/>
+                <w:b w:val="0"/>
+                <w:color w:val="172E46"/>
+                <w:sz w:val="14"/>
+              </w:rPr>
+              <w:t>B1+TB1</w:t>
+            </w:r>
+          </w:p>
+        </w:tc>
+        <w:tc>
+          <w:tcPr>
+            <w:tcW w:type="dxa" w:w="1080"/>
+            <w:tcMar>
+              <w:top w:w="60" w:type="dxa"/>
+              <w:bottom w:w="60" w:type="dxa"/>
+              <w:left w:w="40" w:type="dxa"/>
+              <w:right w:w="40" w:type="dxa"/>
+            </w:tcMar>
+            <w:shd w:fill="FFFFFF"/>
+            <w:vAlign w:val="center"/>
+          </w:tcPr>
+          <w:p>
+            <w:r>
+              <w:rPr>
+                <w:rFonts w:ascii="Liberation Sans" w:hAnsi="Liberation Sans"/>
+                <w:b/>
+                <w:color w:val="172E46"/>
+                <w:sz w:val="14"/>
+              </w:rPr>
+              <w:t>14-Nov-2026</w:t>
+            </w:r>
+            <w:r>
+              <w:rPr>
+                <w:rFonts w:ascii="Liberation Sans" w:hAnsi="Liberation Sans"/>
+                <w:b w:val="0"/>
+                <w:color w:val="172E46"/>
+                <w:sz w:val="2"/>
+              </w:rPr>
             </w:r>
           </w:p>
           <w:p>
@@ -492,126 +912,31 @@
                 <w:rFonts w:ascii="Liberation Sans" w:hAnsi="Liberation Sans"/>
                 <w:b w:val="0"/>
                 <w:color w:val="526579"/>
-                <w:sz w:val="18"/>
+                <w:sz w:val="12"/>
               </w:rPr>
-              <w:t>Saturday</w:t>
+              <w:t>Sat</w:t>
             </w:r>
           </w:p>
         </w:tc>
         <w:tc>
           <w:tcPr>
-            <w:tcW w:type="dxa" w:w="4536"/>
+            <w:tcW w:type="dxa" w:w="864"/>
             <w:tcMar>
-              <w:top w:w="115" w:type="dxa"/>
-              <w:bottom w:w="115" w:type="dxa"/>
-              <w:left w:w="95" w:type="dxa"/>
-              <w:right w:w="75" w:type="dxa"/>
+              <w:top w:w="60" w:type="dxa"/>
+              <w:bottom w:w="60" w:type="dxa"/>
+              <w:left w:w="40" w:type="dxa"/>
+              <w:right w:w="40" w:type="dxa"/>
             </w:tcMar>
             <w:shd w:fill="FFFFFF"/>
             <w:vAlign w:val="center"/>
           </w:tcPr>
           <w:p>
-            <w:pPr>
-              <w:spacing w:line="259" w:lineRule="auto"/>
-            </w:pPr>
-            <w:r>
-              <w:rPr>
-                <w:rFonts w:ascii="Liberation Sans" w:hAnsi="Liberation Sans"/>
-                <w:b/>
-                <w:color w:val="172E46"/>
-                <w:sz w:val="22"/>
-              </w:rPr>
-              <w:t>Data Structures and Algorithm Analysis</w:t>
-            </w:r>
-          </w:p>
-          <w:p>
-            <w:r>
-              <w:rPr>
-                <w:rFonts w:ascii="Liberation Sans" w:hAnsi="Liberation Sans"/>
-                <w:b w:val="0"/>
-                <w:color w:val="526579"/>
-                <w:sz w:val="18"/>
-              </w:rPr>
-              <w:t>MACSE501  •  ETH</w:t>
-            </w:r>
-          </w:p>
-        </w:tc>
-        <w:tc>
-          <w:tcPr>
-            <w:tcW w:type="dxa" w:w="2030"/>
-            <w:tcMar>
-              <w:top w:w="115" w:type="dxa"/>
-              <w:bottom w:w="115" w:type="dxa"/>
-              <w:left w:w="95" w:type="dxa"/>
-              <w:right w:w="75" w:type="dxa"/>
-            </w:tcMar>
-            <w:shd w:fill="FFFFFF"/>
-            <w:vAlign w:val="center"/>
-          </w:tcPr>
-          <w:p>
-            <w:pPr>
-              <w:spacing w:line="259" w:lineRule="auto"/>
-            </w:pPr>
-            <w:r>
-              <w:rPr>
-                <w:rFonts w:ascii="Liberation Sans" w:hAnsi="Liberation Sans"/>
-                <w:b w:val="0"/>
-                <w:color w:val="526579"/>
-                <w:sz w:val="17"/>
-              </w:rPr>
-              <w:t>VL2026270106999</w:t>
-            </w:r>
-          </w:p>
-        </w:tc>
-        <w:tc>
-          <w:tcPr>
-            <w:tcW w:type="dxa" w:w="1253"/>
-            <w:tcMar>
-              <w:top w:w="115" w:type="dxa"/>
-              <w:bottom w:w="115" w:type="dxa"/>
-              <w:left w:w="95" w:type="dxa"/>
-              <w:right w:w="75" w:type="dxa"/>
-            </w:tcMar>
-            <w:shd w:fill="FFFFFF"/>
-            <w:vAlign w:val="center"/>
-          </w:tcPr>
-          <w:p>
-            <w:pPr>
-              <w:spacing w:line="259" w:lineRule="auto"/>
-            </w:pPr>
             <w:r>
               <w:rPr>
                 <w:rFonts w:ascii="Liberation Sans" w:hAnsi="Liberation Sans"/>
                 <w:b w:val="0"/>
                 <w:color w:val="172E46"/>
-                <w:sz w:val="19"/>
-              </w:rPr>
-              <w:t>B1+TB1</w:t>
-            </w:r>
-          </w:p>
-        </w:tc>
-        <w:tc>
-          <w:tcPr>
-            <w:tcW w:type="dxa" w:w="1181"/>
-            <w:tcMar>
-              <w:top w:w="115" w:type="dxa"/>
-              <w:bottom w:w="115" w:type="dxa"/>
-              <w:left w:w="95" w:type="dxa"/>
-              <w:right w:w="75" w:type="dxa"/>
-            </w:tcMar>
-            <w:shd w:fill="FFFFFF"/>
-            <w:vAlign w:val="center"/>
-          </w:tcPr>
-          <w:p>
-            <w:pPr>
-              <w:spacing w:line="259" w:lineRule="auto"/>
-            </w:pPr>
-            <w:r>
-              <w:rPr>
-                <w:rFonts w:ascii="Liberation Sans" w:hAnsi="Liberation Sans"/>
-                <w:b w:val="0"/>
-                <w:color w:val="172E46"/>
-                <w:sz w:val="19"/>
+                <w:sz w:val="14"/>
               </w:rPr>
               <w:t>FN1</w:t>
             </w:r>
@@ -619,26 +944,23 @@
         </w:tc>
         <w:tc>
           <w:tcPr>
-            <w:tcW w:type="dxa" w:w="1656"/>
+            <w:tcW w:type="dxa" w:w="1008"/>
             <w:tcMar>
-              <w:top w:w="115" w:type="dxa"/>
-              <w:bottom w:w="115" w:type="dxa"/>
-              <w:left w:w="95" w:type="dxa"/>
-              <w:right w:w="75" w:type="dxa"/>
+              <w:top w:w="60" w:type="dxa"/>
+              <w:bottom w:w="60" w:type="dxa"/>
+              <w:left w:w="40" w:type="dxa"/>
+              <w:right w:w="40" w:type="dxa"/>
             </w:tcMar>
             <w:shd w:fill="FFFFFF"/>
             <w:vAlign w:val="center"/>
           </w:tcPr>
           <w:p>
-            <w:pPr>
-              <w:spacing w:line="259" w:lineRule="auto"/>
-            </w:pPr>
             <w:r>
               <w:rPr>
                 <w:rFonts w:ascii="Liberation Sans" w:hAnsi="Liberation Sans"/>
                 <w:b w:val="0"/>
                 <w:color w:val="172E46"/>
-                <w:sz w:val="20"/>
+                <w:sz w:val="14"/>
               </w:rPr>
               <w:t>08:45 AM</w:t>
             </w:r>
@@ -646,28 +968,97 @@
         </w:tc>
         <w:tc>
           <w:tcPr>
-            <w:tcW w:type="dxa" w:w="2837"/>
+            <w:tcW w:type="dxa" w:w="1368"/>
             <w:tcMar>
-              <w:top w:w="115" w:type="dxa"/>
-              <w:bottom w:w="115" w:type="dxa"/>
-              <w:left w:w="95" w:type="dxa"/>
-              <w:right w:w="75" w:type="dxa"/>
+              <w:top w:w="60" w:type="dxa"/>
+              <w:bottom w:w="60" w:type="dxa"/>
+              <w:left w:w="40" w:type="dxa"/>
+              <w:right w:w="40" w:type="dxa"/>
             </w:tcMar>
             <w:shd w:fill="FFFFFF"/>
             <w:vAlign w:val="center"/>
           </w:tcPr>
           <w:p>
-            <w:pPr>
-              <w:spacing w:line="259" w:lineRule="auto"/>
-            </w:pPr>
             <w:r>
               <w:rPr>
                 <w:rFonts w:ascii="Liberation Sans" w:hAnsi="Liberation Sans"/>
                 <w:b/>
                 <w:color w:val="172E46"/>
-                <w:sz w:val="20"/>
+                <w:sz w:val="14"/>
               </w:rPr>
               <w:t>09:30 AM - 12:30 PM</w:t>
+            </w:r>
+          </w:p>
+        </w:tc>
+        <w:tc>
+          <w:tcPr>
+            <w:tcW w:type="dxa" w:w="648"/>
+            <w:tcMar>
+              <w:top w:w="60" w:type="dxa"/>
+              <w:bottom w:w="60" w:type="dxa"/>
+              <w:left w:w="40" w:type="dxa"/>
+              <w:right w:w="40" w:type="dxa"/>
+            </w:tcMar>
+            <w:shd w:fill="FFFFFF"/>
+            <w:vAlign w:val="center"/>
+          </w:tcPr>
+          <w:p>
+            <w:r>
+              <w:rPr>
+                <w:rFonts w:ascii="Liberation Sans" w:hAnsi="Liberation Sans"/>
+                <w:b w:val="0"/>
+                <w:color w:val="526579"/>
+                <w:sz w:val="14"/>
+              </w:rPr>
+              <w:t>-</w:t>
+            </w:r>
+          </w:p>
+        </w:tc>
+        <w:tc>
+          <w:tcPr>
+            <w:tcW w:type="dxa" w:w="792"/>
+            <w:tcMar>
+              <w:top w:w="60" w:type="dxa"/>
+              <w:bottom w:w="60" w:type="dxa"/>
+              <w:left w:w="40" w:type="dxa"/>
+              <w:right w:w="40" w:type="dxa"/>
+            </w:tcMar>
+            <w:shd w:fill="FFFFFF"/>
+            <w:vAlign w:val="center"/>
+          </w:tcPr>
+          <w:p>
+            <w:r>
+              <w:rPr>
+                <w:rFonts w:ascii="Liberation Sans" w:hAnsi="Liberation Sans"/>
+                <w:b w:val="0"/>
+                <w:color w:val="526579"/>
+                <w:sz w:val="14"/>
+              </w:rPr>
+              <w:t>-</w:t>
+            </w:r>
+          </w:p>
+        </w:tc>
+        <w:tc>
+          <w:tcPr>
+            <w:tcW w:type="dxa" w:w="648"/>
+            <w:tcMar>
+              <w:top w:w="60" w:type="dxa"/>
+              <w:bottom w:w="60" w:type="dxa"/>
+              <w:left w:w="40" w:type="dxa"/>
+              <w:right w:w="40" w:type="dxa"/>
+            </w:tcMar>
+            <w:shd w:fill="FFFFFF"/>
+            <w:vAlign w:val="center"/>
+          </w:tcPr>
+          <w:p>
+            <w:r>
+              <w:rPr>
+                <w:rFonts w:ascii="Liberation Sans" w:hAnsi="Liberation Sans"/>
+                <w:b w:val="0"/>
+                <w:color w:val="526579"/>
+                <w:sz w:val="14"/>
+              </w:rPr>
+              <w:t>-</w:t>
             </w:r>
           </w:p>
         </w:tc>
@@ -678,28 +1069,177 @@
         </w:trPr>
         <w:tc>
           <w:tcPr>
-            <w:tcW w:type="dxa" w:w="1613"/>
+            <w:tcW w:type="dxa" w:w="504"/>
             <w:tcMar>
-              <w:top w:w="115" w:type="dxa"/>
-              <w:bottom w:w="115" w:type="dxa"/>
-              <w:left w:w="95" w:type="dxa"/>
-              <w:right w:w="75" w:type="dxa"/>
+              <w:top w:w="60" w:type="dxa"/>
+              <w:bottom w:w="60" w:type="dxa"/>
+              <w:left w:w="40" w:type="dxa"/>
+              <w:right w:w="40" w:type="dxa"/>
             </w:tcMar>
             <w:shd w:fill="F0F5F8"/>
             <w:vAlign w:val="center"/>
           </w:tcPr>
           <w:p>
-            <w:pPr>
-              <w:spacing w:line="259" w:lineRule="auto"/>
-            </w:pPr>
             <w:r>
               <w:rPr>
                 <w:rFonts w:ascii="Liberation Sans" w:hAnsi="Liberation Sans"/>
                 <w:b/>
-                <w:color w:val="007F83"/>
-                <w:sz w:val="22"/>
+                <w:color w:val="172E46"/>
+                <w:sz w:val="14"/>
               </w:rPr>
-              <w:t>19 Nov</w:t>
+              <w:t>3</w:t>
+            </w:r>
+          </w:p>
+        </w:tc>
+        <w:tc>
+          <w:tcPr>
+            <w:tcW w:type="dxa" w:w="1080"/>
+            <w:tcMar>
+              <w:top w:w="60" w:type="dxa"/>
+              <w:bottom w:w="60" w:type="dxa"/>
+              <w:left w:w="40" w:type="dxa"/>
+              <w:right w:w="40" w:type="dxa"/>
+            </w:tcMar>
+            <w:shd w:fill="F0F5F8"/>
+            <w:vAlign w:val="center"/>
+          </w:tcPr>
+          <w:p>
+            <w:r>
+              <w:rPr>
+                <w:rFonts w:ascii="Liberation Sans" w:hAnsi="Liberation Sans"/>
+                <w:b/>
+                <w:color w:val="172E46"/>
+                <w:sz w:val="14"/>
+              </w:rPr>
+              <w:t>MAMAT500</w:t>
+            </w:r>
+          </w:p>
+        </w:tc>
+        <w:tc>
+          <w:tcPr>
+            <w:tcW w:type="dxa" w:w="2664"/>
+            <w:tcMar>
+              <w:top w:w="60" w:type="dxa"/>
+              <w:bottom w:w="60" w:type="dxa"/>
+              <w:left w:w="40" w:type="dxa"/>
+              <w:right w:w="40" w:type="dxa"/>
+            </w:tcMar>
+            <w:shd w:fill="F0F5F8"/>
+            <w:vAlign w:val="center"/>
+          </w:tcPr>
+          <w:p>
+            <w:r>
+              <w:rPr>
+                <w:rFonts w:ascii="Liberation Sans" w:hAnsi="Liberation Sans"/>
+                <w:b w:val="0"/>
+                <w:color w:val="172E46"/>
+                <w:sz w:val="14"/>
+              </w:rPr>
+              <w:t>Applied Statistics</w:t>
+            </w:r>
+          </w:p>
+        </w:tc>
+        <w:tc>
+          <w:tcPr>
+            <w:tcW w:type="dxa" w:w="792"/>
+            <w:tcMar>
+              <w:top w:w="60" w:type="dxa"/>
+              <w:bottom w:w="60" w:type="dxa"/>
+              <w:left w:w="40" w:type="dxa"/>
+              <w:right w:w="40" w:type="dxa"/>
+            </w:tcMar>
+            <w:shd w:fill="F0F5F8"/>
+            <w:vAlign w:val="center"/>
+          </w:tcPr>
+          <w:p>
+            <w:r>
+              <w:rPr>
+                <w:rFonts w:ascii="Liberation Sans" w:hAnsi="Liberation Sans"/>
+                <w:b w:val="0"/>
+                <w:color w:val="172E46"/>
+                <w:sz w:val="14"/>
+              </w:rPr>
+              <w:t>TH</w:t>
+            </w:r>
+          </w:p>
+        </w:tc>
+        <w:tc>
+          <w:tcPr>
+            <w:tcW w:type="dxa" w:w="1368"/>
+            <w:tcMar>
+              <w:top w:w="60" w:type="dxa"/>
+              <w:bottom w:w="60" w:type="dxa"/>
+              <w:left w:w="40" w:type="dxa"/>
+              <w:right w:w="40" w:type="dxa"/>
+            </w:tcMar>
+            <w:shd w:fill="F0F5F8"/>
+            <w:vAlign w:val="center"/>
+          </w:tcPr>
+          <w:p>
+            <w:r>
+              <w:rPr>
+                <w:rFonts w:ascii="Liberation Sans" w:hAnsi="Liberation Sans"/>
+                <w:b w:val="0"/>
+                <w:color w:val="172E46"/>
+                <w:sz w:val="12"/>
+              </w:rPr>
+              <w:t>VL2026270105581</w:t>
+            </w:r>
+          </w:p>
+        </w:tc>
+        <w:tc>
+          <w:tcPr>
+            <w:tcW w:type="dxa" w:w="792"/>
+            <w:tcMar>
+              <w:top w:w="60" w:type="dxa"/>
+              <w:bottom w:w="60" w:type="dxa"/>
+              <w:left w:w="40" w:type="dxa"/>
+              <w:right w:w="40" w:type="dxa"/>
+            </w:tcMar>
+            <w:shd w:fill="F0F5F8"/>
+            <w:vAlign w:val="center"/>
+          </w:tcPr>
+          <w:p>
+            <w:r>
+              <w:rPr>
+                <w:rFonts w:ascii="Liberation Sans" w:hAnsi="Liberation Sans"/>
+                <w:b w:val="0"/>
+                <w:color w:val="172E46"/>
+                <w:sz w:val="14"/>
+              </w:rPr>
+              <w:t>D1+TD1</w:t>
+            </w:r>
+          </w:p>
+        </w:tc>
+        <w:tc>
+          <w:tcPr>
+            <w:tcW w:type="dxa" w:w="1080"/>
+            <w:tcMar>
+              <w:top w:w="60" w:type="dxa"/>
+              <w:bottom w:w="60" w:type="dxa"/>
+              <w:left w:w="40" w:type="dxa"/>
+              <w:right w:w="40" w:type="dxa"/>
+            </w:tcMar>
+            <w:shd w:fill="F0F5F8"/>
+            <w:vAlign w:val="center"/>
+          </w:tcPr>
+          <w:p>
+            <w:r>
+              <w:rPr>
+                <w:rFonts w:ascii="Liberation Sans" w:hAnsi="Liberation Sans"/>
+                <w:b/>
+                <w:color w:val="172E46"/>
+                <w:sz w:val="14"/>
+              </w:rPr>
+              <w:t>19-Nov-2026</w:t>
+            </w:r>
+            <w:r>
+              <w:rPr>
+                <w:rFonts w:ascii="Liberation Sans" w:hAnsi="Liberation Sans"/>
+                <w:b w:val="0"/>
+                <w:color w:val="172E46"/>
+                <w:sz w:val="2"/>
+              </w:rPr>
             </w:r>
           </w:p>
           <w:p>
@@ -708,126 +1248,31 @@
                 <w:rFonts w:ascii="Liberation Sans" w:hAnsi="Liberation Sans"/>
                 <w:b w:val="0"/>
                 <w:color w:val="526579"/>
-                <w:sz w:val="18"/>
+                <w:sz w:val="12"/>
               </w:rPr>
-              <w:t>Thursday</w:t>
+              <w:t>Thu</w:t>
             </w:r>
           </w:p>
         </w:tc>
         <w:tc>
           <w:tcPr>
-            <w:tcW w:type="dxa" w:w="4536"/>
+            <w:tcW w:type="dxa" w:w="864"/>
             <w:tcMar>
-              <w:top w:w="115" w:type="dxa"/>
-              <w:bottom w:w="115" w:type="dxa"/>
-              <w:left w:w="95" w:type="dxa"/>
-              <w:right w:w="75" w:type="dxa"/>
+              <w:top w:w="60" w:type="dxa"/>
+              <w:bottom w:w="60" w:type="dxa"/>
+              <w:left w:w="40" w:type="dxa"/>
+              <w:right w:w="40" w:type="dxa"/>
             </w:tcMar>
             <w:shd w:fill="F0F5F8"/>
             <w:vAlign w:val="center"/>
           </w:tcPr>
           <w:p>
-            <w:pPr>
-              <w:spacing w:line="259" w:lineRule="auto"/>
-            </w:pPr>
-            <w:r>
-              <w:rPr>
-                <w:rFonts w:ascii="Liberation Sans" w:hAnsi="Liberation Sans"/>
-                <w:b/>
-                <w:color w:val="172E46"/>
-                <w:sz w:val="22"/>
-              </w:rPr>
-              <w:t>Applied Statistics</w:t>
-            </w:r>
-          </w:p>
-          <w:p>
-            <w:r>
-              <w:rPr>
-                <w:rFonts w:ascii="Liberation Sans" w:hAnsi="Liberation Sans"/>
-                <w:b w:val="0"/>
-                <w:color w:val="526579"/>
-                <w:sz w:val="18"/>
-              </w:rPr>
-              <w:t>MAMAT500  •  TH</w:t>
-            </w:r>
-          </w:p>
-        </w:tc>
-        <w:tc>
-          <w:tcPr>
-            <w:tcW w:type="dxa" w:w="2030"/>
-            <w:tcMar>
-              <w:top w:w="115" w:type="dxa"/>
-              <w:bottom w:w="115" w:type="dxa"/>
-              <w:left w:w="95" w:type="dxa"/>
-              <w:right w:w="75" w:type="dxa"/>
-            </w:tcMar>
-            <w:shd w:fill="F0F5F8"/>
-            <w:vAlign w:val="center"/>
-          </w:tcPr>
-          <w:p>
-            <w:pPr>
-              <w:spacing w:line="259" w:lineRule="auto"/>
-            </w:pPr>
-            <w:r>
-              <w:rPr>
-                <w:rFonts w:ascii="Liberation Sans" w:hAnsi="Liberation Sans"/>
-                <w:b w:val="0"/>
-                <w:color w:val="526579"/>
-                <w:sz w:val="17"/>
-              </w:rPr>
-              <w:t>VL2026270105581</w:t>
-            </w:r>
-          </w:p>
-        </w:tc>
-        <w:tc>
-          <w:tcPr>
-            <w:tcW w:type="dxa" w:w="1253"/>
-            <w:tcMar>
-              <w:top w:w="115" w:type="dxa"/>
-              <w:bottom w:w="115" w:type="dxa"/>
-              <w:left w:w="95" w:type="dxa"/>
-              <w:right w:w="75" w:type="dxa"/>
-            </w:tcMar>
-            <w:shd w:fill="F0F5F8"/>
-            <w:vAlign w:val="center"/>
-          </w:tcPr>
-          <w:p>
-            <w:pPr>
-              <w:spacing w:line="259" w:lineRule="auto"/>
-            </w:pPr>
             <w:r>
               <w:rPr>
                 <w:rFonts w:ascii="Liberation Sans" w:hAnsi="Liberation Sans"/>
                 <w:b w:val="0"/>
                 <w:color w:val="172E46"/>
-                <w:sz w:val="19"/>
-              </w:rPr>
-              <w:t>D1+TD1</w:t>
-            </w:r>
-          </w:p>
-        </w:tc>
-        <w:tc>
-          <w:tcPr>
-            <w:tcW w:type="dxa" w:w="1181"/>
-            <w:tcMar>
-              <w:top w:w="115" w:type="dxa"/>
-              <w:bottom w:w="115" w:type="dxa"/>
-              <w:left w:w="95" w:type="dxa"/>
-              <w:right w:w="75" w:type="dxa"/>
-            </w:tcMar>
-            <w:shd w:fill="F0F5F8"/>
-            <w:vAlign w:val="center"/>
-          </w:tcPr>
-          <w:p>
-            <w:pPr>
-              <w:spacing w:line="259" w:lineRule="auto"/>
-            </w:pPr>
-            <w:r>
-              <w:rPr>
-                <w:rFonts w:ascii="Liberation Sans" w:hAnsi="Liberation Sans"/>
-                <w:b w:val="0"/>
-                <w:color w:val="172E46"/>
-                <w:sz w:val="19"/>
+                <w:sz w:val="14"/>
               </w:rPr>
               <w:t>FN1</w:t>
             </w:r>
@@ -835,26 +1280,23 @@
         </w:tc>
         <w:tc>
           <w:tcPr>
-            <w:tcW w:type="dxa" w:w="1656"/>
+            <w:tcW w:type="dxa" w:w="1008"/>
             <w:tcMar>
-              <w:top w:w="115" w:type="dxa"/>
-              <w:bottom w:w="115" w:type="dxa"/>
-              <w:left w:w="95" w:type="dxa"/>
-              <w:right w:w="75" w:type="dxa"/>
+              <w:top w:w="60" w:type="dxa"/>
+              <w:bottom w:w="60" w:type="dxa"/>
+              <w:left w:w="40" w:type="dxa"/>
+              <w:right w:w="40" w:type="dxa"/>
             </w:tcMar>
             <w:shd w:fill="F0F5F8"/>
             <w:vAlign w:val="center"/>
           </w:tcPr>
           <w:p>
-            <w:pPr>
-              <w:spacing w:line="259" w:lineRule="auto"/>
-            </w:pPr>
             <w:r>
               <w:rPr>
                 <w:rFonts w:ascii="Liberation Sans" w:hAnsi="Liberation Sans"/>
                 <w:b w:val="0"/>
                 <w:color w:val="172E46"/>
-                <w:sz w:val="20"/>
+                <w:sz w:val="14"/>
               </w:rPr>
               <w:t>08:45 AM</w:t>
             </w:r>
@@ -862,28 +1304,97 @@
         </w:tc>
         <w:tc>
           <w:tcPr>
-            <w:tcW w:type="dxa" w:w="2837"/>
+            <w:tcW w:type="dxa" w:w="1368"/>
             <w:tcMar>
-              <w:top w:w="115" w:type="dxa"/>
-              <w:bottom w:w="115" w:type="dxa"/>
-              <w:left w:w="95" w:type="dxa"/>
-              <w:right w:w="75" w:type="dxa"/>
+              <w:top w:w="60" w:type="dxa"/>
+              <w:bottom w:w="60" w:type="dxa"/>
+              <w:left w:w="40" w:type="dxa"/>
+              <w:right w:w="40" w:type="dxa"/>
             </w:tcMar>
             <w:shd w:fill="F0F5F8"/>
             <w:vAlign w:val="center"/>
           </w:tcPr>
           <w:p>
-            <w:pPr>
-              <w:spacing w:line="259" w:lineRule="auto"/>
-            </w:pPr>
             <w:r>
               <w:rPr>
                 <w:rFonts w:ascii="Liberation Sans" w:hAnsi="Liberation Sans"/>
                 <w:b/>
                 <w:color w:val="172E46"/>
-                <w:sz w:val="20"/>
+                <w:sz w:val="14"/>
               </w:rPr>
               <w:t>09:30 AM - 12:30 PM</w:t>
+            </w:r>
+          </w:p>
+        </w:tc>
+        <w:tc>
+          <w:tcPr>
+            <w:tcW w:type="dxa" w:w="648"/>
+            <w:tcMar>
+              <w:top w:w="60" w:type="dxa"/>
+              <w:bottom w:w="60" w:type="dxa"/>
+              <w:left w:w="40" w:type="dxa"/>
+              <w:right w:w="40" w:type="dxa"/>
+            </w:tcMar>
+            <w:shd w:fill="F0F5F8"/>
+            <w:vAlign w:val="center"/>
+          </w:tcPr>
+          <w:p>
+            <w:r>
+              <w:rPr>
+                <w:rFonts w:ascii="Liberation Sans" w:hAnsi="Liberation Sans"/>
+                <w:b w:val="0"/>
+                <w:color w:val="526579"/>
+                <w:sz w:val="14"/>
+              </w:rPr>
+              <w:t>-</w:t>
+            </w:r>
+          </w:p>
+        </w:tc>
+        <w:tc>
+          <w:tcPr>
+            <w:tcW w:type="dxa" w:w="792"/>
+            <w:tcMar>
+              <w:top w:w="60" w:type="dxa"/>
+              <w:bottom w:w="60" w:type="dxa"/>
+              <w:left w:w="40" w:type="dxa"/>
+              <w:right w:w="40" w:type="dxa"/>
+            </w:tcMar>
+            <w:shd w:fill="F0F5F8"/>
+            <w:vAlign w:val="center"/>
+          </w:tcPr>
+          <w:p>
+            <w:r>
+              <w:rPr>
+                <w:rFonts w:ascii="Liberation Sans" w:hAnsi="Liberation Sans"/>
+                <w:b w:val="0"/>
+                <w:color w:val="526579"/>
+                <w:sz w:val="14"/>
+              </w:rPr>
+              <w:t>-</w:t>
+            </w:r>
+          </w:p>
+        </w:tc>
+        <w:tc>
+          <w:tcPr>
+            <w:tcW w:type="dxa" w:w="648"/>
+            <w:tcMar>
+              <w:top w:w="60" w:type="dxa"/>
+              <w:bottom w:w="60" w:type="dxa"/>
+              <w:left w:w="40" w:type="dxa"/>
+              <w:right w:w="40" w:type="dxa"/>
+            </w:tcMar>
+            <w:shd w:fill="F0F5F8"/>
+            <w:vAlign w:val="center"/>
+          </w:tcPr>
+          <w:p>
+            <w:r>
+              <w:rPr>
+                <w:rFonts w:ascii="Liberation Sans" w:hAnsi="Liberation Sans"/>
+                <w:b w:val="0"/>
+                <w:color w:val="526579"/>
+                <w:sz w:val="14"/>
+              </w:rPr>
+              <w:t>-</w:t>
             </w:r>
           </w:p>
         </w:tc>
@@ -894,28 +1405,177 @@
         </w:trPr>
         <w:tc>
           <w:tcPr>
-            <w:tcW w:type="dxa" w:w="1613"/>
+            <w:tcW w:type="dxa" w:w="504"/>
             <w:tcMar>
-              <w:top w:w="115" w:type="dxa"/>
-              <w:bottom w:w="115" w:type="dxa"/>
-              <w:left w:w="95" w:type="dxa"/>
-              <w:right w:w="75" w:type="dxa"/>
+              <w:top w:w="60" w:type="dxa"/>
+              <w:bottom w:w="60" w:type="dxa"/>
+              <w:left w:w="40" w:type="dxa"/>
+              <w:right w:w="40" w:type="dxa"/>
             </w:tcMar>
             <w:shd w:fill="FFFFFF"/>
             <w:vAlign w:val="center"/>
           </w:tcPr>
           <w:p>
-            <w:pPr>
-              <w:spacing w:line="259" w:lineRule="auto"/>
-            </w:pPr>
             <w:r>
               <w:rPr>
                 <w:rFonts w:ascii="Liberation Sans" w:hAnsi="Liberation Sans"/>
                 <w:b/>
-                <w:color w:val="007F83"/>
-                <w:sz w:val="22"/>
+                <w:color w:val="172E46"/>
+                <w:sz w:val="14"/>
               </w:rPr>
-              <w:t>23 Nov</w:t>
+              <w:t>4</w:t>
+            </w:r>
+          </w:p>
+        </w:tc>
+        <w:tc>
+          <w:tcPr>
+            <w:tcW w:type="dxa" w:w="1080"/>
+            <w:tcMar>
+              <w:top w:w="60" w:type="dxa"/>
+              <w:bottom w:w="60" w:type="dxa"/>
+              <w:left w:w="40" w:type="dxa"/>
+              <w:right w:w="40" w:type="dxa"/>
+            </w:tcMar>
+            <w:shd w:fill="FFFFFF"/>
+            <w:vAlign w:val="center"/>
+          </w:tcPr>
+          <w:p>
+            <w:r>
+              <w:rPr>
+                <w:rFonts w:ascii="Liberation Sans" w:hAnsi="Liberation Sans"/>
+                <w:b/>
+                <w:color w:val="172E46"/>
+                <w:sz w:val="14"/>
+              </w:rPr>
+              <w:t>MACSE504</w:t>
+            </w:r>
+          </w:p>
+        </w:tc>
+        <w:tc>
+          <w:tcPr>
+            <w:tcW w:type="dxa" w:w="2664"/>
+            <w:tcMar>
+              <w:top w:w="60" w:type="dxa"/>
+              <w:bottom w:w="60" w:type="dxa"/>
+              <w:left w:w="40" w:type="dxa"/>
+              <w:right w:w="40" w:type="dxa"/>
+            </w:tcMar>
+            <w:shd w:fill="FFFFFF"/>
+            <w:vAlign w:val="center"/>
+          </w:tcPr>
+          <w:p>
+            <w:r>
+              <w:rPr>
+                <w:rFonts w:ascii="Liberation Sans" w:hAnsi="Liberation Sans"/>
+                <w:b w:val="0"/>
+                <w:color w:val="172E46"/>
+                <w:sz w:val="14"/>
+              </w:rPr>
+              <w:t>Machine Learning</w:t>
+            </w:r>
+          </w:p>
+        </w:tc>
+        <w:tc>
+          <w:tcPr>
+            <w:tcW w:type="dxa" w:w="792"/>
+            <w:tcMar>
+              <w:top w:w="60" w:type="dxa"/>
+              <w:bottom w:w="60" w:type="dxa"/>
+              <w:left w:w="40" w:type="dxa"/>
+              <w:right w:w="40" w:type="dxa"/>
+            </w:tcMar>
+            <w:shd w:fill="FFFFFF"/>
+            <w:vAlign w:val="center"/>
+          </w:tcPr>
+          <w:p>
+            <w:r>
+              <w:rPr>
+                <w:rFonts w:ascii="Liberation Sans" w:hAnsi="Liberation Sans"/>
+                <w:b w:val="0"/>
+                <w:color w:val="172E46"/>
+                <w:sz w:val="14"/>
+              </w:rPr>
+              <w:t>ETH</w:t>
+            </w:r>
+          </w:p>
+        </w:tc>
+        <w:tc>
+          <w:tcPr>
+            <w:tcW w:type="dxa" w:w="1368"/>
+            <w:tcMar>
+              <w:top w:w="60" w:type="dxa"/>
+              <w:bottom w:w="60" w:type="dxa"/>
+              <w:left w:w="40" w:type="dxa"/>
+              <w:right w:w="40" w:type="dxa"/>
+            </w:tcMar>
+            <w:shd w:fill="FFFFFF"/>
+            <w:vAlign w:val="center"/>
+          </w:tcPr>
+          <w:p>
+            <w:r>
+              <w:rPr>
+                <w:rFonts w:ascii="Liberation Sans" w:hAnsi="Liberation Sans"/>
+                <w:b w:val="0"/>
+                <w:color w:val="172E46"/>
+                <w:sz w:val="12"/>
+              </w:rPr>
+              <w:t>VL2026270106068</w:t>
+            </w:r>
+          </w:p>
+        </w:tc>
+        <w:tc>
+          <w:tcPr>
+            <w:tcW w:type="dxa" w:w="792"/>
+            <w:tcMar>
+              <w:top w:w="60" w:type="dxa"/>
+              <w:bottom w:w="60" w:type="dxa"/>
+              <w:left w:w="40" w:type="dxa"/>
+              <w:right w:w="40" w:type="dxa"/>
+            </w:tcMar>
+            <w:shd w:fill="FFFFFF"/>
+            <w:vAlign w:val="center"/>
+          </w:tcPr>
+          <w:p>
+            <w:r>
+              <w:rPr>
+                <w:rFonts w:ascii="Liberation Sans" w:hAnsi="Liberation Sans"/>
+                <w:b w:val="0"/>
+                <w:color w:val="172E46"/>
+                <w:sz w:val="14"/>
+              </w:rPr>
+              <w:t>E1+TE1</w:t>
+            </w:r>
+          </w:p>
+        </w:tc>
+        <w:tc>
+          <w:tcPr>
+            <w:tcW w:type="dxa" w:w="1080"/>
+            <w:tcMar>
+              <w:top w:w="60" w:type="dxa"/>
+              <w:bottom w:w="60" w:type="dxa"/>
+              <w:left w:w="40" w:type="dxa"/>
+              <w:right w:w="40" w:type="dxa"/>
+            </w:tcMar>
+            <w:shd w:fill="FFFFFF"/>
+            <w:vAlign w:val="center"/>
+          </w:tcPr>
+          <w:p>
+            <w:r>
+              <w:rPr>
+                <w:rFonts w:ascii="Liberation Sans" w:hAnsi="Liberation Sans"/>
+                <w:b/>
+                <w:color w:val="172E46"/>
+                <w:sz w:val="14"/>
+              </w:rPr>
+              <w:t>23-Nov-2026</w:t>
+            </w:r>
+            <w:r>
+              <w:rPr>
+                <w:rFonts w:ascii="Liberation Sans" w:hAnsi="Liberation Sans"/>
+                <w:b w:val="0"/>
+                <w:color w:val="172E46"/>
+                <w:sz w:val="2"/>
+              </w:rPr>
             </w:r>
           </w:p>
           <w:p>
@@ -924,126 +1584,31 @@
                 <w:rFonts w:ascii="Liberation Sans" w:hAnsi="Liberation Sans"/>
                 <w:b w:val="0"/>
                 <w:color w:val="526579"/>
-                <w:sz w:val="18"/>
+                <w:sz w:val="12"/>
               </w:rPr>
-              <w:t>Monday</w:t>
+              <w:t>Mon</w:t>
             </w:r>
           </w:p>
         </w:tc>
         <w:tc>
           <w:tcPr>
-            <w:tcW w:type="dxa" w:w="4536"/>
+            <w:tcW w:type="dxa" w:w="864"/>
             <w:tcMar>
-              <w:top w:w="115" w:type="dxa"/>
-              <w:bottom w:w="115" w:type="dxa"/>
-              <w:left w:w="95" w:type="dxa"/>
-              <w:right w:w="75" w:type="dxa"/>
+              <w:top w:w="60" w:type="dxa"/>
+              <w:bottom w:w="60" w:type="dxa"/>
+              <w:left w:w="40" w:type="dxa"/>
+              <w:right w:w="40" w:type="dxa"/>
             </w:tcMar>
             <w:shd w:fill="FFFFFF"/>
             <w:vAlign w:val="center"/>
           </w:tcPr>
           <w:p>
-            <w:pPr>
-              <w:spacing w:line="259" w:lineRule="auto"/>
-            </w:pPr>
-            <w:r>
-              <w:rPr>
-                <w:rFonts w:ascii="Liberation Sans" w:hAnsi="Liberation Sans"/>
-                <w:b/>
-                <w:color w:val="172E46"/>
-                <w:sz w:val="22"/>
-              </w:rPr>
-              <w:t>Machine Learning</w:t>
-            </w:r>
-          </w:p>
-          <w:p>
-            <w:r>
-              <w:rPr>
-                <w:rFonts w:ascii="Liberation Sans" w:hAnsi="Liberation Sans"/>
-                <w:b w:val="0"/>
-                <w:color w:val="526579"/>
-                <w:sz w:val="18"/>
-              </w:rPr>
-              <w:t>MACSE504  •  ETH</w:t>
-            </w:r>
-          </w:p>
-        </w:tc>
-        <w:tc>
-          <w:tcPr>
-            <w:tcW w:type="dxa" w:w="2030"/>
-            <w:tcMar>
-              <w:top w:w="115" w:type="dxa"/>
-              <w:bottom w:w="115" w:type="dxa"/>
-              <w:left w:w="95" w:type="dxa"/>
-              <w:right w:w="75" w:type="dxa"/>
-            </w:tcMar>
-            <w:shd w:fill="FFFFFF"/>
-            <w:vAlign w:val="center"/>
-          </w:tcPr>
-          <w:p>
-            <w:pPr>
-              <w:spacing w:line="259" w:lineRule="auto"/>
-            </w:pPr>
-            <w:r>
-              <w:rPr>
-                <w:rFonts w:ascii="Liberation Sans" w:hAnsi="Liberation Sans"/>
-                <w:b w:val="0"/>
-                <w:color w:val="526579"/>
-                <w:sz w:val="17"/>
-              </w:rPr>
-              <w:t>VL2026270106068</w:t>
-            </w:r>
-          </w:p>
-        </w:tc>
-        <w:tc>
-          <w:tcPr>
-            <w:tcW w:type="dxa" w:w="1253"/>
-            <w:tcMar>
-              <w:top w:w="115" w:type="dxa"/>
-              <w:bottom w:w="115" w:type="dxa"/>
-              <w:left w:w="95" w:type="dxa"/>
-              <w:right w:w="75" w:type="dxa"/>
-            </w:tcMar>
-            <w:shd w:fill="FFFFFF"/>
-            <w:vAlign w:val="center"/>
-          </w:tcPr>
-          <w:p>
-            <w:pPr>
-              <w:spacing w:line="259" w:lineRule="auto"/>
-            </w:pPr>
             <w:r>
               <w:rPr>
                 <w:rFonts w:ascii="Liberation Sans" w:hAnsi="Liberation Sans"/>
                 <w:b w:val="0"/>
                 <w:color w:val="172E46"/>
-                <w:sz w:val="19"/>
-              </w:rPr>
-              <w:t>E1+TE1</w:t>
-            </w:r>
-          </w:p>
-        </w:tc>
-        <w:tc>
-          <w:tcPr>
-            <w:tcW w:type="dxa" w:w="1181"/>
-            <w:tcMar>
-              <w:top w:w="115" w:type="dxa"/>
-              <w:bottom w:w="115" w:type="dxa"/>
-              <w:left w:w="95" w:type="dxa"/>
-              <w:right w:w="75" w:type="dxa"/>
-            </w:tcMar>
-            <w:shd w:fill="FFFFFF"/>
-            <w:vAlign w:val="center"/>
-          </w:tcPr>
-          <w:p>
-            <w:pPr>
-              <w:spacing w:line="259" w:lineRule="auto"/>
-            </w:pPr>
-            <w:r>
-              <w:rPr>
-                <w:rFonts w:ascii="Liberation Sans" w:hAnsi="Liberation Sans"/>
-                <w:b w:val="0"/>
-                <w:color w:val="172E46"/>
-                <w:sz w:val="19"/>
+                <w:sz w:val="14"/>
               </w:rPr>
               <w:t>FN1</w:t>
             </w:r>
@@ -1051,26 +1616,23 @@
         </w:tc>
         <w:tc>
           <w:tcPr>
-            <w:tcW w:type="dxa" w:w="1656"/>
+            <w:tcW w:type="dxa" w:w="1008"/>
             <w:tcMar>
-              <w:top w:w="115" w:type="dxa"/>
-              <w:bottom w:w="115" w:type="dxa"/>
-              <w:left w:w="95" w:type="dxa"/>
-              <w:right w:w="75" w:type="dxa"/>
+              <w:top w:w="60" w:type="dxa"/>
+              <w:bottom w:w="60" w:type="dxa"/>
+              <w:left w:w="40" w:type="dxa"/>
+              <w:right w:w="40" w:type="dxa"/>
             </w:tcMar>
             <w:shd w:fill="FFFFFF"/>
             <w:vAlign w:val="center"/>
           </w:tcPr>
           <w:p>
-            <w:pPr>
-              <w:spacing w:line="259" w:lineRule="auto"/>
-            </w:pPr>
             <w:r>
               <w:rPr>
                 <w:rFonts w:ascii="Liberation Sans" w:hAnsi="Liberation Sans"/>
                 <w:b w:val="0"/>
                 <w:color w:val="172E46"/>
-                <w:sz w:val="20"/>
+                <w:sz w:val="14"/>
               </w:rPr>
               <w:t>08:45 AM</w:t>
             </w:r>
@@ -1078,28 +1640,97 @@
         </w:tc>
         <w:tc>
           <w:tcPr>
-            <w:tcW w:type="dxa" w:w="2837"/>
+            <w:tcW w:type="dxa" w:w="1368"/>
             <w:tcMar>
-              <w:top w:w="115" w:type="dxa"/>
-              <w:bottom w:w="115" w:type="dxa"/>
-              <w:left w:w="95" w:type="dxa"/>
-              <w:right w:w="75" w:type="dxa"/>
+              <w:top w:w="60" w:type="dxa"/>
+              <w:bottom w:w="60" w:type="dxa"/>
+              <w:left w:w="40" w:type="dxa"/>
+              <w:right w:w="40" w:type="dxa"/>
             </w:tcMar>
             <w:shd w:fill="FFFFFF"/>
             <w:vAlign w:val="center"/>
           </w:tcPr>
           <w:p>
-            <w:pPr>
-              <w:spacing w:line="259" w:lineRule="auto"/>
-            </w:pPr>
             <w:r>
               <w:rPr>
                 <w:rFonts w:ascii="Liberation Sans" w:hAnsi="Liberation Sans"/>
                 <w:b/>
                 <w:color w:val="172E46"/>
-                <w:sz w:val="20"/>
+                <w:sz w:val="14"/>
               </w:rPr>
               <w:t>09:30 AM - 12:30 PM</w:t>
+            </w:r>
+          </w:p>
+        </w:tc>
+        <w:tc>
+          <w:tcPr>
+            <w:tcW w:type="dxa" w:w="648"/>
+            <w:tcMar>
+              <w:top w:w="60" w:type="dxa"/>
+              <w:bottom w:w="60" w:type="dxa"/>
+              <w:left w:w="40" w:type="dxa"/>
+              <w:right w:w="40" w:type="dxa"/>
+            </w:tcMar>
+            <w:shd w:fill="FFFFFF"/>
+            <w:vAlign w:val="center"/>
+          </w:tcPr>
+          <w:p>
+            <w:r>
+              <w:rPr>
+                <w:rFonts w:ascii="Liberation Sans" w:hAnsi="Liberation Sans"/>
+                <w:b w:val="0"/>
+                <w:color w:val="526579"/>
+                <w:sz w:val="14"/>
+              </w:rPr>
+              <w:t>-</w:t>
+            </w:r>
+          </w:p>
+        </w:tc>
+        <w:tc>
+          <w:tcPr>
+            <w:tcW w:type="dxa" w:w="792"/>
+            <w:tcMar>
+              <w:top w:w="60" w:type="dxa"/>
+              <w:bottom w:w="60" w:type="dxa"/>
+              <w:left w:w="40" w:type="dxa"/>
+              <w:right w:w="40" w:type="dxa"/>
+            </w:tcMar>
+            <w:shd w:fill="FFFFFF"/>
+            <w:vAlign w:val="center"/>
+          </w:tcPr>
+          <w:p>
+            <w:r>
+              <w:rPr>
+                <w:rFonts w:ascii="Liberation Sans" w:hAnsi="Liberation Sans"/>
+                <w:b w:val="0"/>
+                <w:color w:val="526579"/>
+                <w:sz w:val="14"/>
+              </w:rPr>
+              <w:t>-</w:t>
+            </w:r>
+          </w:p>
+        </w:tc>
+        <w:tc>
+          <w:tcPr>
+            <w:tcW w:type="dxa" w:w="648"/>
+            <w:tcMar>
+              <w:top w:w="60" w:type="dxa"/>
+              <w:bottom w:w="60" w:type="dxa"/>
+              <w:left w:w="40" w:type="dxa"/>
+              <w:right w:w="40" w:type="dxa"/>
+            </w:tcMar>
+            <w:shd w:fill="FFFFFF"/>
+            <w:vAlign w:val="center"/>
+          </w:tcPr>
+          <w:p>
+            <w:r>
+              <w:rPr>
+                <w:rFonts w:ascii="Liberation Sans" w:hAnsi="Liberation Sans"/>
+                <w:b w:val="0"/>
+                <w:color w:val="526579"/>
+                <w:sz w:val="14"/>
+              </w:rPr>
+              <w:t>-</w:t>
             </w:r>
           </w:p>
         </w:tc>
@@ -1110,28 +1741,177 @@
         </w:trPr>
         <w:tc>
           <w:tcPr>
-            <w:tcW w:type="dxa" w:w="1613"/>
+            <w:tcW w:type="dxa" w:w="504"/>
             <w:tcMar>
-              <w:top w:w="115" w:type="dxa"/>
-              <w:bottom w:w="115" w:type="dxa"/>
-              <w:left w:w="95" w:type="dxa"/>
-              <w:right w:w="75" w:type="dxa"/>
+              <w:top w:w="60" w:type="dxa"/>
+              <w:bottom w:w="60" w:type="dxa"/>
+              <w:left w:w="40" w:type="dxa"/>
+              <w:right w:w="40" w:type="dxa"/>
             </w:tcMar>
             <w:shd w:fill="F0F5F8"/>
             <w:vAlign w:val="center"/>
           </w:tcPr>
           <w:p>
-            <w:pPr>
-              <w:spacing w:line="259" w:lineRule="auto"/>
-            </w:pPr>
             <w:r>
               <w:rPr>
                 <w:rFonts w:ascii="Liberation Sans" w:hAnsi="Liberation Sans"/>
                 <w:b/>
-                <w:color w:val="007F83"/>
-                <w:sz w:val="22"/>
+                <w:color w:val="172E46"/>
+                <w:sz w:val="14"/>
               </w:rPr>
-              <w:t>25 Nov</w:t>
+              <w:t>5</w:t>
+            </w:r>
+          </w:p>
+        </w:tc>
+        <w:tc>
+          <w:tcPr>
+            <w:tcW w:type="dxa" w:w="1080"/>
+            <w:tcMar>
+              <w:top w:w="60" w:type="dxa"/>
+              <w:bottom w:w="60" w:type="dxa"/>
+              <w:left w:w="40" w:type="dxa"/>
+              <w:right w:w="40" w:type="dxa"/>
+            </w:tcMar>
+            <w:shd w:fill="F0F5F8"/>
+            <w:vAlign w:val="center"/>
+          </w:tcPr>
+          <w:p>
+            <w:r>
+              <w:rPr>
+                <w:rFonts w:ascii="Liberation Sans" w:hAnsi="Liberation Sans"/>
+                <w:b/>
+                <w:color w:val="172E46"/>
+                <w:sz w:val="14"/>
+              </w:rPr>
+              <w:t>MACSE503</w:t>
+            </w:r>
+          </w:p>
+        </w:tc>
+        <w:tc>
+          <w:tcPr>
+            <w:tcW w:type="dxa" w:w="2664"/>
+            <w:tcMar>
+              <w:top w:w="60" w:type="dxa"/>
+              <w:bottom w:w="60" w:type="dxa"/>
+              <w:left w:w="40" w:type="dxa"/>
+              <w:right w:w="40" w:type="dxa"/>
+            </w:tcMar>
+            <w:shd w:fill="F0F5F8"/>
+            <w:vAlign w:val="center"/>
+          </w:tcPr>
+          <w:p>
+            <w:r>
+              <w:rPr>
+                <w:rFonts w:ascii="Liberation Sans" w:hAnsi="Liberation Sans"/>
+                <w:b w:val="0"/>
+                <w:color w:val="172E46"/>
+                <w:sz w:val="14"/>
+              </w:rPr>
+              <w:t>Data Engineering</w:t>
+            </w:r>
+          </w:p>
+        </w:tc>
+        <w:tc>
+          <w:tcPr>
+            <w:tcW w:type="dxa" w:w="792"/>
+            <w:tcMar>
+              <w:top w:w="60" w:type="dxa"/>
+              <w:bottom w:w="60" w:type="dxa"/>
+              <w:left w:w="40" w:type="dxa"/>
+              <w:right w:w="40" w:type="dxa"/>
+            </w:tcMar>
+            <w:shd w:fill="F0F5F8"/>
+            <w:vAlign w:val="center"/>
+          </w:tcPr>
+          <w:p>
+            <w:r>
+              <w:rPr>
+                <w:rFonts w:ascii="Liberation Sans" w:hAnsi="Liberation Sans"/>
+                <w:b w:val="0"/>
+                <w:color w:val="172E46"/>
+                <w:sz w:val="14"/>
+              </w:rPr>
+              <w:t>ETH</w:t>
+            </w:r>
+          </w:p>
+        </w:tc>
+        <w:tc>
+          <w:tcPr>
+            <w:tcW w:type="dxa" w:w="1368"/>
+            <w:tcMar>
+              <w:top w:w="60" w:type="dxa"/>
+              <w:bottom w:w="60" w:type="dxa"/>
+              <w:left w:w="40" w:type="dxa"/>
+              <w:right w:w="40" w:type="dxa"/>
+            </w:tcMar>
+            <w:shd w:fill="F0F5F8"/>
+            <w:vAlign w:val="center"/>
+          </w:tcPr>
+          <w:p>
+            <w:r>
+              <w:rPr>
+                <w:rFonts w:ascii="Liberation Sans" w:hAnsi="Liberation Sans"/>
+                <w:b w:val="0"/>
+                <w:color w:val="172E46"/>
+                <w:sz w:val="12"/>
+              </w:rPr>
+              <w:t>VL2026270106818</w:t>
+            </w:r>
+          </w:p>
+        </w:tc>
+        <w:tc>
+          <w:tcPr>
+            <w:tcW w:type="dxa" w:w="792"/>
+            <w:tcMar>
+              <w:top w:w="60" w:type="dxa"/>
+              <w:bottom w:w="60" w:type="dxa"/>
+              <w:left w:w="40" w:type="dxa"/>
+              <w:right w:w="40" w:type="dxa"/>
+            </w:tcMar>
+            <w:shd w:fill="F0F5F8"/>
+            <w:vAlign w:val="center"/>
+          </w:tcPr>
+          <w:p>
+            <w:r>
+              <w:rPr>
+                <w:rFonts w:ascii="Liberation Sans" w:hAnsi="Liberation Sans"/>
+                <w:b w:val="0"/>
+                <w:color w:val="172E46"/>
+                <w:sz w:val="14"/>
+              </w:rPr>
+              <w:t>F1+TF1</w:t>
+            </w:r>
+          </w:p>
+        </w:tc>
+        <w:tc>
+          <w:tcPr>
+            <w:tcW w:type="dxa" w:w="1080"/>
+            <w:tcMar>
+              <w:top w:w="60" w:type="dxa"/>
+              <w:bottom w:w="60" w:type="dxa"/>
+              <w:left w:w="40" w:type="dxa"/>
+              <w:right w:w="40" w:type="dxa"/>
+            </w:tcMar>
+            <w:shd w:fill="F0F5F8"/>
+            <w:vAlign w:val="center"/>
+          </w:tcPr>
+          <w:p>
+            <w:r>
+              <w:rPr>
+                <w:rFonts w:ascii="Liberation Sans" w:hAnsi="Liberation Sans"/>
+                <w:b/>
+                <w:color w:val="172E46"/>
+                <w:sz w:val="14"/>
+              </w:rPr>
+              <w:t>25-Nov-2026</w:t>
+            </w:r>
+            <w:r>
+              <w:rPr>
+                <w:rFonts w:ascii="Liberation Sans" w:hAnsi="Liberation Sans"/>
+                <w:b w:val="0"/>
+                <w:color w:val="172E46"/>
+                <w:sz w:val="2"/>
+              </w:rPr>
             </w:r>
           </w:p>
           <w:p>
@@ -1140,126 +1920,31 @@
                 <w:rFonts w:ascii="Liberation Sans" w:hAnsi="Liberation Sans"/>
                 <w:b w:val="0"/>
                 <w:color w:val="526579"/>
-                <w:sz w:val="18"/>
+                <w:sz w:val="12"/>
               </w:rPr>
-              <w:t>Wednesday</w:t>
+              <w:t>Wed</w:t>
             </w:r>
           </w:p>
         </w:tc>
         <w:tc>
           <w:tcPr>
-            <w:tcW w:type="dxa" w:w="4536"/>
+            <w:tcW w:type="dxa" w:w="864"/>
             <w:tcMar>
-              <w:top w:w="115" w:type="dxa"/>
-              <w:bottom w:w="115" w:type="dxa"/>
-              <w:left w:w="95" w:type="dxa"/>
-              <w:right w:w="75" w:type="dxa"/>
+              <w:top w:w="60" w:type="dxa"/>
+              <w:bottom w:w="60" w:type="dxa"/>
+              <w:left w:w="40" w:type="dxa"/>
+              <w:right w:w="40" w:type="dxa"/>
             </w:tcMar>
             <w:shd w:fill="F0F5F8"/>
             <w:vAlign w:val="center"/>
           </w:tcPr>
           <w:p>
-            <w:pPr>
-              <w:spacing w:line="259" w:lineRule="auto"/>
-            </w:pPr>
-            <w:r>
-              <w:rPr>
-                <w:rFonts w:ascii="Liberation Sans" w:hAnsi="Liberation Sans"/>
-                <w:b/>
-                <w:color w:val="172E46"/>
-                <w:sz w:val="22"/>
-              </w:rPr>
-              <w:t>Data Engineering</w:t>
-            </w:r>
-          </w:p>
-          <w:p>
-            <w:r>
-              <w:rPr>
-                <w:rFonts w:ascii="Liberation Sans" w:hAnsi="Liberation Sans"/>
-                <w:b w:val="0"/>
-                <w:color w:val="526579"/>
-                <w:sz w:val="18"/>
-              </w:rPr>
-              <w:t>MACSE503  •  ETH</w:t>
-            </w:r>
-          </w:p>
-        </w:tc>
-        <w:tc>
-          <w:tcPr>
-            <w:tcW w:type="dxa" w:w="2030"/>
-            <w:tcMar>
-              <w:top w:w="115" w:type="dxa"/>
-              <w:bottom w:w="115" w:type="dxa"/>
-              <w:left w:w="95" w:type="dxa"/>
-              <w:right w:w="75" w:type="dxa"/>
-            </w:tcMar>
-            <w:shd w:fill="F0F5F8"/>
-            <w:vAlign w:val="center"/>
-          </w:tcPr>
-          <w:p>
-            <w:pPr>
-              <w:spacing w:line="259" w:lineRule="auto"/>
-            </w:pPr>
-            <w:r>
-              <w:rPr>
-                <w:rFonts w:ascii="Liberation Sans" w:hAnsi="Liberation Sans"/>
-                <w:b w:val="0"/>
-                <w:color w:val="526579"/>
-                <w:sz w:val="17"/>
-              </w:rPr>
-              <w:t>VL2026270106818</w:t>
-            </w:r>
-          </w:p>
-        </w:tc>
-        <w:tc>
-          <w:tcPr>
-            <w:tcW w:type="dxa" w:w="1253"/>
-            <w:tcMar>
-              <w:top w:w="115" w:type="dxa"/>
-              <w:bottom w:w="115" w:type="dxa"/>
-              <w:left w:w="95" w:type="dxa"/>
-              <w:right w:w="75" w:type="dxa"/>
-            </w:tcMar>
-            <w:shd w:fill="F0F5F8"/>
-            <w:vAlign w:val="center"/>
-          </w:tcPr>
-          <w:p>
-            <w:pPr>
-              <w:spacing w:line="259" w:lineRule="auto"/>
-            </w:pPr>
             <w:r>
               <w:rPr>
                 <w:rFonts w:ascii="Liberation Sans" w:hAnsi="Liberation Sans"/>
                 <w:b w:val="0"/>
                 <w:color w:val="172E46"/>
-                <w:sz w:val="19"/>
-              </w:rPr>
-              <w:t>F1+TF1</w:t>
-            </w:r>
-          </w:p>
-        </w:tc>
-        <w:tc>
-          <w:tcPr>
-            <w:tcW w:type="dxa" w:w="1181"/>
-            <w:tcMar>
-              <w:top w:w="115" w:type="dxa"/>
-              <w:bottom w:w="115" w:type="dxa"/>
-              <w:left w:w="95" w:type="dxa"/>
-              <w:right w:w="75" w:type="dxa"/>
-            </w:tcMar>
-            <w:shd w:fill="F0F5F8"/>
-            <w:vAlign w:val="center"/>
-          </w:tcPr>
-          <w:p>
-            <w:pPr>
-              <w:spacing w:line="259" w:lineRule="auto"/>
-            </w:pPr>
-            <w:r>
-              <w:rPr>
-                <w:rFonts w:ascii="Liberation Sans" w:hAnsi="Liberation Sans"/>
-                <w:b w:val="0"/>
-                <w:color w:val="172E46"/>
-                <w:sz w:val="19"/>
+                <w:sz w:val="14"/>
               </w:rPr>
               <w:t>FN1</w:t>
             </w:r>
@@ -1267,26 +1952,23 @@
         </w:tc>
         <w:tc>
           <w:tcPr>
-            <w:tcW w:type="dxa" w:w="1656"/>
+            <w:tcW w:type="dxa" w:w="1008"/>
             <w:tcMar>
-              <w:top w:w="115" w:type="dxa"/>
-              <w:bottom w:w="115" w:type="dxa"/>
-              <w:left w:w="95" w:type="dxa"/>
-              <w:right w:w="75" w:type="dxa"/>
+              <w:top w:w="60" w:type="dxa"/>
+              <w:bottom w:w="60" w:type="dxa"/>
+              <w:left w:w="40" w:type="dxa"/>
+              <w:right w:w="40" w:type="dxa"/>
             </w:tcMar>
             <w:shd w:fill="F0F5F8"/>
             <w:vAlign w:val="center"/>
           </w:tcPr>
           <w:p>
-            <w:pPr>
-              <w:spacing w:line="259" w:lineRule="auto"/>
-            </w:pPr>
             <w:r>
               <w:rPr>
                 <w:rFonts w:ascii="Liberation Sans" w:hAnsi="Liberation Sans"/>
                 <w:b w:val="0"/>
                 <w:color w:val="172E46"/>
-                <w:sz w:val="20"/>
+                <w:sz w:val="14"/>
               </w:rPr>
               <w:t>08:45 AM</w:t>
             </w:r>
@@ -1294,28 +1976,97 @@
         </w:tc>
         <w:tc>
           <w:tcPr>
-            <w:tcW w:type="dxa" w:w="2837"/>
+            <w:tcW w:type="dxa" w:w="1368"/>
             <w:tcMar>
-              <w:top w:w="115" w:type="dxa"/>
-              <w:bottom w:w="115" w:type="dxa"/>
-              <w:left w:w="95" w:type="dxa"/>
-              <w:right w:w="75" w:type="dxa"/>
+              <w:top w:w="60" w:type="dxa"/>
+              <w:bottom w:w="60" w:type="dxa"/>
+              <w:left w:w="40" w:type="dxa"/>
+              <w:right w:w="40" w:type="dxa"/>
             </w:tcMar>
             <w:shd w:fill="F0F5F8"/>
             <w:vAlign w:val="center"/>
           </w:tcPr>
           <w:p>
-            <w:pPr>
-              <w:spacing w:line="259" w:lineRule="auto"/>
-            </w:pPr>
             <w:r>
               <w:rPr>
                 <w:rFonts w:ascii="Liberation Sans" w:hAnsi="Liberation Sans"/>
                 <w:b/>
                 <w:color w:val="172E46"/>
-                <w:sz w:val="20"/>
+                <w:sz w:val="14"/>
               </w:rPr>
               <w:t>09:30 AM - 12:30 PM</w:t>
+            </w:r>
+          </w:p>
+        </w:tc>
+        <w:tc>
+          <w:tcPr>
+            <w:tcW w:type="dxa" w:w="648"/>
+            <w:tcMar>
+              <w:top w:w="60" w:type="dxa"/>
+              <w:bottom w:w="60" w:type="dxa"/>
+              <w:left w:w="40" w:type="dxa"/>
+              <w:right w:w="40" w:type="dxa"/>
+            </w:tcMar>
+            <w:shd w:fill="F0F5F8"/>
+            <w:vAlign w:val="center"/>
+          </w:tcPr>
+          <w:p>
+            <w:r>
+              <w:rPr>
+                <w:rFonts w:ascii="Liberation Sans" w:hAnsi="Liberation Sans"/>
+                <w:b w:val="0"/>
+                <w:color w:val="526579"/>
+                <w:sz w:val="14"/>
+              </w:rPr>
+              <w:t>-</w:t>
+            </w:r>
+          </w:p>
+        </w:tc>
+        <w:tc>
+          <w:tcPr>
+            <w:tcW w:type="dxa" w:w="792"/>
+            <w:tcMar>
+              <w:top w:w="60" w:type="dxa"/>
+              <w:bottom w:w="60" w:type="dxa"/>
+              <w:left w:w="40" w:type="dxa"/>
+              <w:right w:w="40" w:type="dxa"/>
+            </w:tcMar>
+            <w:shd w:fill="F0F5F8"/>
+            <w:vAlign w:val="center"/>
+          </w:tcPr>
+          <w:p>
+            <w:r>
+              <w:rPr>
+                <w:rFonts w:ascii="Liberation Sans" w:hAnsi="Liberation Sans"/>
+                <w:b w:val="0"/>
+                <w:color w:val="526579"/>
+                <w:sz w:val="14"/>
+              </w:rPr>
+              <w:t>-</w:t>
+            </w:r>
+          </w:p>
+        </w:tc>
+        <w:tc>
+          <w:tcPr>
+            <w:tcW w:type="dxa" w:w="648"/>
+            <w:tcMar>
+              <w:top w:w="60" w:type="dxa"/>
+              <w:bottom w:w="60" w:type="dxa"/>
+              <w:left w:w="40" w:type="dxa"/>
+              <w:right w:w="40" w:type="dxa"/>
+            </w:tcMar>
+            <w:shd w:fill="F0F5F8"/>
+            <w:vAlign w:val="center"/>
+          </w:tcPr>
+          <w:p>
+            <w:r>
+              <w:rPr>
+                <w:rFonts w:ascii="Liberation Sans" w:hAnsi="Liberation Sans"/>
+                <w:b w:val="0"/>
+                <w:color w:val="526579"/>
+                <w:sz w:val="14"/>
+              </w:rPr>
+              <w:t>-</w:t>
             </w:r>
           </w:p>
         </w:tc>
@@ -1326,28 +2077,177 @@
         </w:trPr>
         <w:tc>
           <w:tcPr>
-            <w:tcW w:type="dxa" w:w="1613"/>
+            <w:tcW w:type="dxa" w:w="504"/>
             <w:tcMar>
-              <w:top w:w="115" w:type="dxa"/>
-              <w:bottom w:w="115" w:type="dxa"/>
-              <w:left w:w="95" w:type="dxa"/>
-              <w:right w:w="75" w:type="dxa"/>
+              <w:top w:w="60" w:type="dxa"/>
+              <w:bottom w:w="60" w:type="dxa"/>
+              <w:left w:w="40" w:type="dxa"/>
+              <w:right w:w="40" w:type="dxa"/>
             </w:tcMar>
             <w:shd w:fill="FFFFFF"/>
             <w:vAlign w:val="center"/>
           </w:tcPr>
           <w:p>
-            <w:pPr>
-              <w:spacing w:line="259" w:lineRule="auto"/>
-            </w:pPr>
             <w:r>
               <w:rPr>
                 <w:rFonts w:ascii="Liberation Sans" w:hAnsi="Liberation Sans"/>
                 <w:b/>
-                <w:color w:val="007F83"/>
-                <w:sz w:val="22"/>
+                <w:color w:val="172E46"/>
+                <w:sz w:val="14"/>
               </w:rPr>
-              <w:t>27 Nov</w:t>
+              <w:t>6</w:t>
+            </w:r>
+          </w:p>
+        </w:tc>
+        <w:tc>
+          <w:tcPr>
+            <w:tcW w:type="dxa" w:w="1080"/>
+            <w:tcMar>
+              <w:top w:w="60" w:type="dxa"/>
+              <w:bottom w:w="60" w:type="dxa"/>
+              <w:left w:w="40" w:type="dxa"/>
+              <w:right w:w="40" w:type="dxa"/>
+            </w:tcMar>
+            <w:shd w:fill="FFFFFF"/>
+            <w:vAlign w:val="center"/>
+          </w:tcPr>
+          <w:p>
+            <w:r>
+              <w:rPr>
+                <w:rFonts w:ascii="Liberation Sans" w:hAnsi="Liberation Sans"/>
+                <w:b/>
+                <w:color w:val="172E46"/>
+                <w:sz w:val="14"/>
+              </w:rPr>
+              <w:t>MASTS601</w:t>
+            </w:r>
+          </w:p>
+        </w:tc>
+        <w:tc>
+          <w:tcPr>
+            <w:tcW w:type="dxa" w:w="2664"/>
+            <w:tcMar>
+              <w:top w:w="60" w:type="dxa"/>
+              <w:bottom w:w="60" w:type="dxa"/>
+              <w:left w:w="40" w:type="dxa"/>
+              <w:right w:w="40" w:type="dxa"/>
+            </w:tcMar>
+            <w:shd w:fill="FFFFFF"/>
+            <w:vAlign w:val="center"/>
+          </w:tcPr>
+          <w:p>
+            <w:r>
+              <w:rPr>
+                <w:rFonts w:ascii="Liberation Sans" w:hAnsi="Liberation Sans"/>
+                <w:b w:val="0"/>
+                <w:color w:val="172E46"/>
+                <w:sz w:val="14"/>
+              </w:rPr>
+              <w:t>Competitive Coding I</w:t>
+            </w:r>
+          </w:p>
+        </w:tc>
+        <w:tc>
+          <w:tcPr>
+            <w:tcW w:type="dxa" w:w="792"/>
+            <w:tcMar>
+              <w:top w:w="60" w:type="dxa"/>
+              <w:bottom w:w="60" w:type="dxa"/>
+              <w:left w:w="40" w:type="dxa"/>
+              <w:right w:w="40" w:type="dxa"/>
+            </w:tcMar>
+            <w:shd w:fill="FFFFFF"/>
+            <w:vAlign w:val="center"/>
+          </w:tcPr>
+          <w:p>
+            <w:r>
+              <w:rPr>
+                <w:rFonts w:ascii="Liberation Sans" w:hAnsi="Liberation Sans"/>
+                <w:b w:val="0"/>
+                <w:color w:val="172E46"/>
+                <w:sz w:val="14"/>
+              </w:rPr>
+              <w:t>SS</w:t>
+            </w:r>
+          </w:p>
+        </w:tc>
+        <w:tc>
+          <w:tcPr>
+            <w:tcW w:type="dxa" w:w="1368"/>
+            <w:tcMar>
+              <w:top w:w="60" w:type="dxa"/>
+              <w:bottom w:w="60" w:type="dxa"/>
+              <w:left w:w="40" w:type="dxa"/>
+              <w:right w:w="40" w:type="dxa"/>
+            </w:tcMar>
+            <w:shd w:fill="FFFFFF"/>
+            <w:vAlign w:val="center"/>
+          </w:tcPr>
+          <w:p>
+            <w:r>
+              <w:rPr>
+                <w:rFonts w:ascii="Liberation Sans" w:hAnsi="Liberation Sans"/>
+                <w:b w:val="0"/>
+                <w:color w:val="172E46"/>
+                <w:sz w:val="12"/>
+              </w:rPr>
+              <w:t>VL2026270104814</w:t>
+            </w:r>
+          </w:p>
+        </w:tc>
+        <w:tc>
+          <w:tcPr>
+            <w:tcW w:type="dxa" w:w="792"/>
+            <w:tcMar>
+              <w:top w:w="60" w:type="dxa"/>
+              <w:bottom w:w="60" w:type="dxa"/>
+              <w:left w:w="40" w:type="dxa"/>
+              <w:right w:w="40" w:type="dxa"/>
+            </w:tcMar>
+            <w:shd w:fill="FFFFFF"/>
+            <w:vAlign w:val="center"/>
+          </w:tcPr>
+          <w:p>
+            <w:r>
+              <w:rPr>
+                <w:rFonts w:ascii="Liberation Sans" w:hAnsi="Liberation Sans"/>
+                <w:b w:val="0"/>
+                <w:color w:val="172E46"/>
+                <w:sz w:val="14"/>
+              </w:rPr>
+              <w:t>G1+TG1</w:t>
+            </w:r>
+          </w:p>
+        </w:tc>
+        <w:tc>
+          <w:tcPr>
+            <w:tcW w:type="dxa" w:w="1080"/>
+            <w:tcMar>
+              <w:top w:w="60" w:type="dxa"/>
+              <w:bottom w:w="60" w:type="dxa"/>
+              <w:left w:w="40" w:type="dxa"/>
+              <w:right w:w="40" w:type="dxa"/>
+            </w:tcMar>
+            <w:shd w:fill="FFFFFF"/>
+            <w:vAlign w:val="center"/>
+          </w:tcPr>
+          <w:p>
+            <w:r>
+              <w:rPr>
+                <w:rFonts w:ascii="Liberation Sans" w:hAnsi="Liberation Sans"/>
+                <w:b/>
+                <w:color w:val="172E46"/>
+                <w:sz w:val="14"/>
+              </w:rPr>
+              <w:t>27-Nov-2026</w:t>
+            </w:r>
+            <w:r>
+              <w:rPr>
+                <w:rFonts w:ascii="Liberation Sans" w:hAnsi="Liberation Sans"/>
+                <w:b w:val="0"/>
+                <w:color w:val="172E46"/>
+                <w:sz w:val="2"/>
+              </w:rPr>
             </w:r>
           </w:p>
           <w:p>
@@ -1356,126 +2256,31 @@
                 <w:rFonts w:ascii="Liberation Sans" w:hAnsi="Liberation Sans"/>
                 <w:b w:val="0"/>
                 <w:color w:val="526579"/>
-                <w:sz w:val="18"/>
+                <w:sz w:val="12"/>
               </w:rPr>
-              <w:t>Friday</w:t>
+              <w:t>Fri</w:t>
             </w:r>
           </w:p>
         </w:tc>
         <w:tc>
           <w:tcPr>
-            <w:tcW w:type="dxa" w:w="4536"/>
+            <w:tcW w:type="dxa" w:w="864"/>
             <w:tcMar>
-              <w:top w:w="115" w:type="dxa"/>
-              <w:bottom w:w="115" w:type="dxa"/>
-              <w:left w:w="95" w:type="dxa"/>
-              <w:right w:w="75" w:type="dxa"/>
+              <w:top w:w="60" w:type="dxa"/>
+              <w:bottom w:w="60" w:type="dxa"/>
+              <w:left w:w="40" w:type="dxa"/>
+              <w:right w:w="40" w:type="dxa"/>
             </w:tcMar>
             <w:shd w:fill="FFFFFF"/>
             <w:vAlign w:val="center"/>
           </w:tcPr>
           <w:p>
-            <w:pPr>
-              <w:spacing w:line="259" w:lineRule="auto"/>
-            </w:pPr>
-            <w:r>
-              <w:rPr>
-                <w:rFonts w:ascii="Liberation Sans" w:hAnsi="Liberation Sans"/>
-                <w:b/>
-                <w:color w:val="172E46"/>
-                <w:sz w:val="22"/>
-              </w:rPr>
-              <w:t>Competitive Coding I</w:t>
-            </w:r>
-          </w:p>
-          <w:p>
-            <w:r>
-              <w:rPr>
-                <w:rFonts w:ascii="Liberation Sans" w:hAnsi="Liberation Sans"/>
-                <w:b w:val="0"/>
-                <w:color w:val="526579"/>
-                <w:sz w:val="18"/>
-              </w:rPr>
-              <w:t>MASTS601  •  SS</w:t>
-            </w:r>
-          </w:p>
-        </w:tc>
-        <w:tc>
-          <w:tcPr>
-            <w:tcW w:type="dxa" w:w="2030"/>
-            <w:tcMar>
-              <w:top w:w="115" w:type="dxa"/>
-              <w:bottom w:w="115" w:type="dxa"/>
-              <w:left w:w="95" w:type="dxa"/>
-              <w:right w:w="75" w:type="dxa"/>
-            </w:tcMar>
-            <w:shd w:fill="FFFFFF"/>
-            <w:vAlign w:val="center"/>
-          </w:tcPr>
-          <w:p>
-            <w:pPr>
-              <w:spacing w:line="259" w:lineRule="auto"/>
-            </w:pPr>
-            <w:r>
-              <w:rPr>
-                <w:rFonts w:ascii="Liberation Sans" w:hAnsi="Liberation Sans"/>
-                <w:b w:val="0"/>
-                <w:color w:val="526579"/>
-                <w:sz w:val="17"/>
-              </w:rPr>
-              <w:t>VL2026270104814</w:t>
-            </w:r>
-          </w:p>
-        </w:tc>
-        <w:tc>
-          <w:tcPr>
-            <w:tcW w:type="dxa" w:w="1253"/>
-            <w:tcMar>
-              <w:top w:w="115" w:type="dxa"/>
-              <w:bottom w:w="115" w:type="dxa"/>
-              <w:left w:w="95" w:type="dxa"/>
-              <w:right w:w="75" w:type="dxa"/>
-            </w:tcMar>
-            <w:shd w:fill="FFFFFF"/>
-            <w:vAlign w:val="center"/>
-          </w:tcPr>
-          <w:p>
-            <w:pPr>
-              <w:spacing w:line="259" w:lineRule="auto"/>
-            </w:pPr>
             <w:r>
               <w:rPr>
                 <w:rFonts w:ascii="Liberation Sans" w:hAnsi="Liberation Sans"/>
                 <w:b w:val="0"/>
                 <w:color w:val="172E46"/>
-                <w:sz w:val="19"/>
-              </w:rPr>
-              <w:t>G1+TG1</w:t>
-            </w:r>
-          </w:p>
-        </w:tc>
-        <w:tc>
-          <w:tcPr>
-            <w:tcW w:type="dxa" w:w="1181"/>
-            <w:tcMar>
-              <w:top w:w="115" w:type="dxa"/>
-              <w:bottom w:w="115" w:type="dxa"/>
-              <w:left w:w="95" w:type="dxa"/>
-              <w:right w:w="75" w:type="dxa"/>
-            </w:tcMar>
-            <w:shd w:fill="FFFFFF"/>
-            <w:vAlign w:val="center"/>
-          </w:tcPr>
-          <w:p>
-            <w:pPr>
-              <w:spacing w:line="259" w:lineRule="auto"/>
-            </w:pPr>
-            <w:r>
-              <w:rPr>
-                <w:rFonts w:ascii="Liberation Sans" w:hAnsi="Liberation Sans"/>
-                <w:b w:val="0"/>
-                <w:color w:val="172E46"/>
-                <w:sz w:val="19"/>
+                <w:sz w:val="14"/>
               </w:rPr>
               <w:t>FN3</w:t>
             </w:r>
@@ -1483,26 +2288,23 @@
         </w:tc>
         <w:tc>
           <w:tcPr>
-            <w:tcW w:type="dxa" w:w="1656"/>
+            <w:tcW w:type="dxa" w:w="1008"/>
             <w:tcMar>
-              <w:top w:w="115" w:type="dxa"/>
-              <w:bottom w:w="115" w:type="dxa"/>
-              <w:left w:w="95" w:type="dxa"/>
-              <w:right w:w="75" w:type="dxa"/>
+              <w:top w:w="60" w:type="dxa"/>
+              <w:bottom w:w="60" w:type="dxa"/>
+              <w:left w:w="40" w:type="dxa"/>
+              <w:right w:w="40" w:type="dxa"/>
             </w:tcMar>
             <w:shd w:fill="FFFFFF"/>
             <w:vAlign w:val="center"/>
           </w:tcPr>
           <w:p>
-            <w:pPr>
-              <w:spacing w:line="259" w:lineRule="auto"/>
-            </w:pPr>
             <w:r>
               <w:rPr>
                 <w:rFonts w:ascii="Liberation Sans" w:hAnsi="Liberation Sans"/>
                 <w:b w:val="0"/>
                 <w:color w:val="172E46"/>
-                <w:sz w:val="20"/>
+                <w:sz w:val="14"/>
               </w:rPr>
               <w:t>10:30 AM</w:t>
             </w:r>
@@ -1510,28 +2312,97 @@
         </w:tc>
         <w:tc>
           <w:tcPr>
-            <w:tcW w:type="dxa" w:w="2837"/>
+            <w:tcW w:type="dxa" w:w="1368"/>
             <w:tcMar>
-              <w:top w:w="115" w:type="dxa"/>
-              <w:bottom w:w="115" w:type="dxa"/>
-              <w:left w:w="95" w:type="dxa"/>
-              <w:right w:w="75" w:type="dxa"/>
+              <w:top w:w="60" w:type="dxa"/>
+              <w:bottom w:w="60" w:type="dxa"/>
+              <w:left w:w="40" w:type="dxa"/>
+              <w:right w:w="40" w:type="dxa"/>
             </w:tcMar>
             <w:shd w:fill="FFFFFF"/>
             <w:vAlign w:val="center"/>
           </w:tcPr>
           <w:p>
-            <w:pPr>
-              <w:spacing w:line="259" w:lineRule="auto"/>
-            </w:pPr>
             <w:r>
               <w:rPr>
                 <w:rFonts w:ascii="Liberation Sans" w:hAnsi="Liberation Sans"/>
                 <w:b/>
                 <w:color w:val="172E46"/>
-                <w:sz w:val="20"/>
+                <w:sz w:val="14"/>
               </w:rPr>
               <w:t>11:00 AM - 12:30 PM</w:t>
+            </w:r>
+          </w:p>
+        </w:tc>
+        <w:tc>
+          <w:tcPr>
+            <w:tcW w:type="dxa" w:w="648"/>
+            <w:tcMar>
+              <w:top w:w="60" w:type="dxa"/>
+              <w:bottom w:w="60" w:type="dxa"/>
+              <w:left w:w="40" w:type="dxa"/>
+              <w:right w:w="40" w:type="dxa"/>
+            </w:tcMar>
+            <w:shd w:fill="FFFFFF"/>
+            <w:vAlign w:val="center"/>
+          </w:tcPr>
+          <w:p>
+            <w:r>
+              <w:rPr>
+                <w:rFonts w:ascii="Liberation Sans" w:hAnsi="Liberation Sans"/>
+                <w:b w:val="0"/>
+                <w:color w:val="526579"/>
+                <w:sz w:val="14"/>
+              </w:rPr>
+              <w:t>-</w:t>
+            </w:r>
+          </w:p>
+        </w:tc>
+        <w:tc>
+          <w:tcPr>
+            <w:tcW w:type="dxa" w:w="792"/>
+            <w:tcMar>
+              <w:top w:w="60" w:type="dxa"/>
+              <w:bottom w:w="60" w:type="dxa"/>
+              <w:left w:w="40" w:type="dxa"/>
+              <w:right w:w="40" w:type="dxa"/>
+            </w:tcMar>
+            <w:shd w:fill="FFFFFF"/>
+            <w:vAlign w:val="center"/>
+          </w:tcPr>
+          <w:p>
+            <w:r>
+              <w:rPr>
+                <w:rFonts w:ascii="Liberation Sans" w:hAnsi="Liberation Sans"/>
+                <w:b w:val="0"/>
+                <w:color w:val="526579"/>
+                <w:sz w:val="14"/>
+              </w:rPr>
+              <w:t>-</w:t>
+            </w:r>
+          </w:p>
+        </w:tc>
+        <w:tc>
+          <w:tcPr>
+            <w:tcW w:type="dxa" w:w="648"/>
+            <w:tcMar>
+              <w:top w:w="60" w:type="dxa"/>
+              <w:bottom w:w="60" w:type="dxa"/>
+              <w:left w:w="40" w:type="dxa"/>
+              <w:right w:w="40" w:type="dxa"/>
+            </w:tcMar>
+            <w:shd w:fill="FFFFFF"/>
+            <w:vAlign w:val="center"/>
+          </w:tcPr>
+          <w:p>
+            <w:r>
+              <w:rPr>
+                <w:rFonts w:ascii="Liberation Sans" w:hAnsi="Liberation Sans"/>
+                <w:b w:val="0"/>
+                <w:color w:val="526579"/>
+                <w:sz w:val="14"/>
+              </w:rPr>
+              <w:t>-</w:t>
             </w:r>
           </w:p>
         </w:tc>
@@ -1542,28 +2413,177 @@
         </w:trPr>
         <w:tc>
           <w:tcPr>
-            <w:tcW w:type="dxa" w:w="1613"/>
+            <w:tcW w:type="dxa" w:w="504"/>
             <w:tcMar>
-              <w:top w:w="115" w:type="dxa"/>
-              <w:bottom w:w="115" w:type="dxa"/>
-              <w:left w:w="95" w:type="dxa"/>
-              <w:right w:w="75" w:type="dxa"/>
+              <w:top w:w="60" w:type="dxa"/>
+              <w:bottom w:w="60" w:type="dxa"/>
+              <w:left w:w="40" w:type="dxa"/>
+              <w:right w:w="40" w:type="dxa"/>
             </w:tcMar>
             <w:shd w:fill="F0F5F8"/>
             <w:vAlign w:val="center"/>
           </w:tcPr>
           <w:p>
-            <w:pPr>
-              <w:spacing w:line="259" w:lineRule="auto"/>
-            </w:pPr>
             <w:r>
               <w:rPr>
                 <w:rFonts w:ascii="Liberation Sans" w:hAnsi="Liberation Sans"/>
                 <w:b/>
-                <w:color w:val="007F83"/>
-                <w:sz w:val="22"/>
+                <w:color w:val="172E46"/>
+                <w:sz w:val="14"/>
               </w:rPr>
-              <w:t>01 Dec</w:t>
+              <w:t>7</w:t>
+            </w:r>
+          </w:p>
+        </w:tc>
+        <w:tc>
+          <w:tcPr>
+            <w:tcW w:type="dxa" w:w="1080"/>
+            <w:tcMar>
+              <w:top w:w="60" w:type="dxa"/>
+              <w:bottom w:w="60" w:type="dxa"/>
+              <w:left w:w="40" w:type="dxa"/>
+              <w:right w:w="40" w:type="dxa"/>
+            </w:tcMar>
+            <w:shd w:fill="F0F5F8"/>
+            <w:vAlign w:val="center"/>
+          </w:tcPr>
+          <w:p>
+            <w:r>
+              <w:rPr>
+                <w:rFonts w:ascii="Liberation Sans" w:hAnsi="Liberation Sans"/>
+                <w:b/>
+                <w:color w:val="172E46"/>
+                <w:sz w:val="14"/>
+              </w:rPr>
+              <w:t>MAENG501</w:t>
+            </w:r>
+          </w:p>
+        </w:tc>
+        <w:tc>
+          <w:tcPr>
+            <w:tcW w:type="dxa" w:w="2664"/>
+            <w:tcMar>
+              <w:top w:w="60" w:type="dxa"/>
+              <w:bottom w:w="60" w:type="dxa"/>
+              <w:left w:w="40" w:type="dxa"/>
+              <w:right w:w="40" w:type="dxa"/>
+            </w:tcMar>
+            <w:shd w:fill="F0F5F8"/>
+            <w:vAlign w:val="center"/>
+          </w:tcPr>
+          <w:p>
+            <w:r>
+              <w:rPr>
+                <w:rFonts w:ascii="Liberation Sans" w:hAnsi="Liberation Sans"/>
+                <w:b w:val="0"/>
+                <w:color w:val="172E46"/>
+                <w:sz w:val="14"/>
+              </w:rPr>
+              <w:t>Technical Report Writing</w:t>
+            </w:r>
+          </w:p>
+        </w:tc>
+        <w:tc>
+          <w:tcPr>
+            <w:tcW w:type="dxa" w:w="792"/>
+            <w:tcMar>
+              <w:top w:w="60" w:type="dxa"/>
+              <w:bottom w:w="60" w:type="dxa"/>
+              <w:left w:w="40" w:type="dxa"/>
+              <w:right w:w="40" w:type="dxa"/>
+            </w:tcMar>
+            <w:shd w:fill="F0F5F8"/>
+            <w:vAlign w:val="center"/>
+          </w:tcPr>
+          <w:p>
+            <w:r>
+              <w:rPr>
+                <w:rFonts w:ascii="Liberation Sans" w:hAnsi="Liberation Sans"/>
+                <w:b w:val="0"/>
+                <w:color w:val="172E46"/>
+                <w:sz w:val="14"/>
+              </w:rPr>
+              <w:t>ETH</w:t>
+            </w:r>
+          </w:p>
+        </w:tc>
+        <w:tc>
+          <w:tcPr>
+            <w:tcW w:type="dxa" w:w="1368"/>
+            <w:tcMar>
+              <w:top w:w="60" w:type="dxa"/>
+              <w:bottom w:w="60" w:type="dxa"/>
+              <w:left w:w="40" w:type="dxa"/>
+              <w:right w:w="40" w:type="dxa"/>
+            </w:tcMar>
+            <w:shd w:fill="F0F5F8"/>
+            <w:vAlign w:val="center"/>
+          </w:tcPr>
+          <w:p>
+            <w:r>
+              <w:rPr>
+                <w:rFonts w:ascii="Liberation Sans" w:hAnsi="Liberation Sans"/>
+                <w:b w:val="0"/>
+                <w:color w:val="172E46"/>
+                <w:sz w:val="12"/>
+              </w:rPr>
+              <w:t>VL2026270106586</w:t>
+            </w:r>
+          </w:p>
+        </w:tc>
+        <w:tc>
+          <w:tcPr>
+            <w:tcW w:type="dxa" w:w="792"/>
+            <w:tcMar>
+              <w:top w:w="60" w:type="dxa"/>
+              <w:bottom w:w="60" w:type="dxa"/>
+              <w:left w:w="40" w:type="dxa"/>
+              <w:right w:w="40" w:type="dxa"/>
+            </w:tcMar>
+            <w:shd w:fill="F0F5F8"/>
+            <w:vAlign w:val="center"/>
+          </w:tcPr>
+          <w:p>
+            <w:r>
+              <w:rPr>
+                <w:rFonts w:ascii="Liberation Sans" w:hAnsi="Liberation Sans"/>
+                <w:b w:val="0"/>
+                <w:color w:val="172E46"/>
+                <w:sz w:val="14"/>
+              </w:rPr>
+              <w:t>TAA1</w:t>
+            </w:r>
+          </w:p>
+        </w:tc>
+        <w:tc>
+          <w:tcPr>
+            <w:tcW w:type="dxa" w:w="1080"/>
+            <w:tcMar>
+              <w:top w:w="60" w:type="dxa"/>
+              <w:bottom w:w="60" w:type="dxa"/>
+              <w:left w:w="40" w:type="dxa"/>
+              <w:right w:w="40" w:type="dxa"/>
+            </w:tcMar>
+            <w:shd w:fill="F0F5F8"/>
+            <w:vAlign w:val="center"/>
+          </w:tcPr>
+          <w:p>
+            <w:r>
+              <w:rPr>
+                <w:rFonts w:ascii="Liberation Sans" w:hAnsi="Liberation Sans"/>
+                <w:b/>
+                <w:color w:val="172E46"/>
+                <w:sz w:val="14"/>
+              </w:rPr>
+              <w:t>01-Dec-2026</w:t>
+            </w:r>
+            <w:r>
+              <w:rPr>
+                <w:rFonts w:ascii="Liberation Sans" w:hAnsi="Liberation Sans"/>
+                <w:b w:val="0"/>
+                <w:color w:val="172E46"/>
+                <w:sz w:val="2"/>
+              </w:rPr>
             </w:r>
           </w:p>
           <w:p>
@@ -1572,126 +2592,31 @@
                 <w:rFonts w:ascii="Liberation Sans" w:hAnsi="Liberation Sans"/>
                 <w:b w:val="0"/>
                 <w:color w:val="526579"/>
-                <w:sz w:val="18"/>
+                <w:sz w:val="12"/>
               </w:rPr>
-              <w:t>Tuesday</w:t>
+              <w:t>Tue</w:t>
             </w:r>
           </w:p>
         </w:tc>
         <w:tc>
           <w:tcPr>
-            <w:tcW w:type="dxa" w:w="4536"/>
+            <w:tcW w:type="dxa" w:w="864"/>
             <w:tcMar>
-              <w:top w:w="115" w:type="dxa"/>
-              <w:bottom w:w="115" w:type="dxa"/>
-              <w:left w:w="95" w:type="dxa"/>
-              <w:right w:w="75" w:type="dxa"/>
+              <w:top w:w="60" w:type="dxa"/>
+              <w:bottom w:w="60" w:type="dxa"/>
+              <w:left w:w="40" w:type="dxa"/>
+              <w:right w:w="40" w:type="dxa"/>
             </w:tcMar>
             <w:shd w:fill="F0F5F8"/>
             <w:vAlign w:val="center"/>
           </w:tcPr>
           <w:p>
-            <w:pPr>
-              <w:spacing w:line="259" w:lineRule="auto"/>
-            </w:pPr>
-            <w:r>
-              <w:rPr>
-                <w:rFonts w:ascii="Liberation Sans" w:hAnsi="Liberation Sans"/>
-                <w:b/>
-                <w:color w:val="172E46"/>
-                <w:sz w:val="22"/>
-              </w:rPr>
-              <w:t>Technical Report Writing</w:t>
-            </w:r>
-          </w:p>
-          <w:p>
-            <w:r>
-              <w:rPr>
-                <w:rFonts w:ascii="Liberation Sans" w:hAnsi="Liberation Sans"/>
-                <w:b w:val="0"/>
-                <w:color w:val="526579"/>
-                <w:sz w:val="18"/>
-              </w:rPr>
-              <w:t>MAENG501  •  ETH</w:t>
-            </w:r>
-          </w:p>
-        </w:tc>
-        <w:tc>
-          <w:tcPr>
-            <w:tcW w:type="dxa" w:w="2030"/>
-            <w:tcMar>
-              <w:top w:w="115" w:type="dxa"/>
-              <w:bottom w:w="115" w:type="dxa"/>
-              <w:left w:w="95" w:type="dxa"/>
-              <w:right w:w="75" w:type="dxa"/>
-            </w:tcMar>
-            <w:shd w:fill="F0F5F8"/>
-            <w:vAlign w:val="center"/>
-          </w:tcPr>
-          <w:p>
-            <w:pPr>
-              <w:spacing w:line="259" w:lineRule="auto"/>
-            </w:pPr>
-            <w:r>
-              <w:rPr>
-                <w:rFonts w:ascii="Liberation Sans" w:hAnsi="Liberation Sans"/>
-                <w:b w:val="0"/>
-                <w:color w:val="526579"/>
-                <w:sz w:val="17"/>
-              </w:rPr>
-              <w:t>VL2026270106586</w:t>
-            </w:r>
-          </w:p>
-        </w:tc>
-        <w:tc>
-          <w:tcPr>
-            <w:tcW w:type="dxa" w:w="1253"/>
-            <w:tcMar>
-              <w:top w:w="115" w:type="dxa"/>
-              <w:bottom w:w="115" w:type="dxa"/>
-              <w:left w:w="95" w:type="dxa"/>
-              <w:right w:w="75" w:type="dxa"/>
-            </w:tcMar>
-            <w:shd w:fill="F0F5F8"/>
-            <w:vAlign w:val="center"/>
-          </w:tcPr>
-          <w:p>
-            <w:pPr>
-              <w:spacing w:line="259" w:lineRule="auto"/>
-            </w:pPr>
             <w:r>
               <w:rPr>
                 <w:rFonts w:ascii="Liberation Sans" w:hAnsi="Liberation Sans"/>
                 <w:b w:val="0"/>
                 <w:color w:val="172E46"/>
-                <w:sz w:val="19"/>
-              </w:rPr>
-              <w:t>TAA1</w:t>
-            </w:r>
-          </w:p>
-        </w:tc>
-        <w:tc>
-          <w:tcPr>
-            <w:tcW w:type="dxa" w:w="1181"/>
-            <w:tcMar>
-              <w:top w:w="115" w:type="dxa"/>
-              <w:bottom w:w="115" w:type="dxa"/>
-              <w:left w:w="95" w:type="dxa"/>
-              <w:right w:w="75" w:type="dxa"/>
-            </w:tcMar>
-            <w:shd w:fill="F0F5F8"/>
-            <w:vAlign w:val="center"/>
-          </w:tcPr>
-          <w:p>
-            <w:pPr>
-              <w:spacing w:line="259" w:lineRule="auto"/>
-            </w:pPr>
-            <w:r>
-              <w:rPr>
-                <w:rFonts w:ascii="Liberation Sans" w:hAnsi="Liberation Sans"/>
-                <w:b w:val="0"/>
-                <w:color w:val="172E46"/>
-                <w:sz w:val="19"/>
+                <w:sz w:val="14"/>
               </w:rPr>
               <w:t>FN1</w:t>
             </w:r>
@@ -1699,26 +2624,23 @@
         </w:tc>
         <w:tc>
           <w:tcPr>
-            <w:tcW w:type="dxa" w:w="1656"/>
+            <w:tcW w:type="dxa" w:w="1008"/>
             <w:tcMar>
-              <w:top w:w="115" w:type="dxa"/>
-              <w:bottom w:w="115" w:type="dxa"/>
-              <w:left w:w="95" w:type="dxa"/>
-              <w:right w:w="75" w:type="dxa"/>
+              <w:top w:w="60" w:type="dxa"/>
+              <w:bottom w:w="60" w:type="dxa"/>
+              <w:left w:w="40" w:type="dxa"/>
+              <w:right w:w="40" w:type="dxa"/>
             </w:tcMar>
             <w:shd w:fill="F0F5F8"/>
             <w:vAlign w:val="center"/>
           </w:tcPr>
           <w:p>
-            <w:pPr>
-              <w:spacing w:line="259" w:lineRule="auto"/>
-            </w:pPr>
             <w:r>
               <w:rPr>
                 <w:rFonts w:ascii="Liberation Sans" w:hAnsi="Liberation Sans"/>
                 <w:b w:val="0"/>
                 <w:color w:val="172E46"/>
-                <w:sz w:val="20"/>
+                <w:sz w:val="14"/>
               </w:rPr>
               <w:t>08:45 AM</w:t>
             </w:r>
@@ -1726,28 +2648,97 @@
         </w:tc>
         <w:tc>
           <w:tcPr>
-            <w:tcW w:type="dxa" w:w="2837"/>
+            <w:tcW w:type="dxa" w:w="1368"/>
             <w:tcMar>
-              <w:top w:w="115" w:type="dxa"/>
-              <w:bottom w:w="115" w:type="dxa"/>
-              <w:left w:w="95" w:type="dxa"/>
-              <w:right w:w="75" w:type="dxa"/>
+              <w:top w:w="60" w:type="dxa"/>
+              <w:bottom w:w="60" w:type="dxa"/>
+              <w:left w:w="40" w:type="dxa"/>
+              <w:right w:w="40" w:type="dxa"/>
             </w:tcMar>
             <w:shd w:fill="F0F5F8"/>
             <w:vAlign w:val="center"/>
           </w:tcPr>
           <w:p>
-            <w:pPr>
-              <w:spacing w:line="259" w:lineRule="auto"/>
-            </w:pPr>
             <w:r>
               <w:rPr>
                 <w:rFonts w:ascii="Liberation Sans" w:hAnsi="Liberation Sans"/>
                 <w:b/>
                 <w:color w:val="172E46"/>
-                <w:sz w:val="20"/>
+                <w:sz w:val="14"/>
               </w:rPr>
               <w:t>09:30 AM - 12:30 PM</w:t>
+            </w:r>
+          </w:p>
+        </w:tc>
+        <w:tc>
+          <w:tcPr>
+            <w:tcW w:type="dxa" w:w="648"/>
+            <w:tcMar>
+              <w:top w:w="60" w:type="dxa"/>
+              <w:bottom w:w="60" w:type="dxa"/>
+              <w:left w:w="40" w:type="dxa"/>
+              <w:right w:w="40" w:type="dxa"/>
+            </w:tcMar>
+            <w:shd w:fill="F0F5F8"/>
+            <w:vAlign w:val="center"/>
+          </w:tcPr>
+          <w:p>
+            <w:r>
+              <w:rPr>
+                <w:rFonts w:ascii="Liberation Sans" w:hAnsi="Liberation Sans"/>
+                <w:b w:val="0"/>
+                <w:color w:val="526579"/>
+                <w:sz w:val="14"/>
+              </w:rPr>
+              <w:t>-</w:t>
+            </w:r>
+          </w:p>
+        </w:tc>
+        <w:tc>
+          <w:tcPr>
+            <w:tcW w:type="dxa" w:w="792"/>
+            <w:tcMar>
+              <w:top w:w="60" w:type="dxa"/>
+              <w:bottom w:w="60" w:type="dxa"/>
+              <w:left w:w="40" w:type="dxa"/>
+              <w:right w:w="40" w:type="dxa"/>
+            </w:tcMar>
+            <w:shd w:fill="F0F5F8"/>
+            <w:vAlign w:val="center"/>
+          </w:tcPr>
+          <w:p>
+            <w:r>
+              <w:rPr>
+                <w:rFonts w:ascii="Liberation Sans" w:hAnsi="Liberation Sans"/>
+                <w:b w:val="0"/>
+                <w:color w:val="526579"/>
+                <w:sz w:val="14"/>
+              </w:rPr>
+              <w:t>-</w:t>
+            </w:r>
+          </w:p>
+        </w:tc>
+        <w:tc>
+          <w:tcPr>
+            <w:tcW w:type="dxa" w:w="648"/>
+            <w:tcMar>
+              <w:top w:w="60" w:type="dxa"/>
+              <w:bottom w:w="60" w:type="dxa"/>
+              <w:left w:w="40" w:type="dxa"/>
+              <w:right w:w="40" w:type="dxa"/>
+            </w:tcMar>
+            <w:shd w:fill="F0F5F8"/>
+            <w:vAlign w:val="center"/>
+          </w:tcPr>
+          <w:p>
+            <w:r>
+              <w:rPr>
+                <w:rFonts w:ascii="Liberation Sans" w:hAnsi="Liberation Sans"/>
+                <w:b w:val="0"/>
+                <w:color w:val="526579"/>
+                <w:sz w:val="14"/>
+              </w:rPr>
+              <w:t>-</w:t>
             </w:r>
           </w:p>
         </w:tc>
@@ -1755,24 +2746,16 @@
     </w:tbl>
     <w:p>
       <w:pPr>
-        <w:spacing w:before="240"/>
+        <w:spacing w:before="160"/>
       </w:pPr>
       <w:r>
         <w:rPr>
           <w:rFonts w:ascii="Liberation Sans" w:hAnsi="Liberation Sans"/>
           <w:b/>
           <w:color w:val="007F83"/>
-          <w:sz w:val="18"/>
+          <w:sz w:val="16"/>
         </w:rPr>
-        <w:t>PLAN AHEAD</w:t>
-      </w:r>
-    </w:p>
-    <w:p>
-      <w:pPr>
-        <w:spacing w:after="140"/>
-      </w:pPr>
-      <w:r>
-        <w:t>FAT is final assessment - 3-hour papers (except Competitive Coding I - 1.5 hr). All FN1 papers report at 08:45 AM.</w:t>
+        <w:t>NOTES</w:t>
       </w:r>
     </w:p>
     <w:p>
@@ -1781,9 +2764,9 @@
           <w:rFonts w:ascii="Liberation Sans" w:hAnsi="Liberation Sans"/>
           <w:b w:val="0"/>
           <w:color w:val="526579"/>
-          <w:sz w:val="16"/>
+          <w:sz w:val="14"/>
         </w:rPr>
-        <w:t>* The earlier time in the screenshot is shown as reporting time. Its column heading was not visible; confirm with the official timetable.</w:t>
+        <w:t>FAT - Final Assessment: 3-hour papers (09:30 AM-12:30 PM) except Competitive Coding I (1.5 hr: 11:00 AM-12:30 PM). All FN1 report at 08:45 AM, FN3 at 10:30 AM. Venue/Seat not allotted yet.</w:t>
       </w:r>
     </w:p>
     <w:p>
@@ -1792,15 +2775,15 @@
           <w:rFonts w:ascii="Liberation Sans" w:hAnsi="Liberation Sans"/>
           <w:b w:val="0"/>
           <w:color w:val="526579"/>
-          <w:sz w:val="16"/>
+          <w:sz w:val="12"/>
         </w:rPr>
-        <w:t>Source: supplied FAT timetable screenshot. Dates and times reproduced as shown; weekdays calculated. Venue details not provided.</w:t>
+        <w:t>Source: Official VTOP timetable screenshots supplied. Dates and times reproduced as shown; weekdays calculated for 2026.</w:t>
       </w:r>
     </w:p>
     <w:sectPr>
       <w:footerReference w:type="default" r:id="rId9"/>
       <w:pgSz w:w="16834" w:h="11909"/>
-      <w:pgMar w:top="691" w:right="864" w:bottom="648" w:left="864" w:header="288" w:footer="288" w:gutter="0"/>
+      <w:pgMar w:top="576" w:right="504" w:bottom="576" w:left="504" w:header="216" w:footer="216" w:gutter="0"/>
       <w:cols w:space="720"/>
       <w:docGrid w:linePitch="360"/>
     </w:sectPr>
@@ -1820,7 +2803,7 @@
         <w:rFonts w:ascii="Liberation Sans" w:hAnsi="Liberation Sans"/>
         <w:b/>
         <w:color w:val="526579"/>
-        <w:sz w:val="16"/>
+        <w:sz w:val="14"/>
       </w:rPr>
       <w:t>HASNAIN MAKADA  |  ACADEMIC SCHEDULE</w:t>
     </w:r>
@@ -2197,7 +3180,7 @@
     <w:rPr>
       <w:rFonts w:ascii="Liberation Sans" w:hAnsi="Liberation Sans"/>
       <w:color w:val="172E46"/>
-      <w:sz w:val="20"/>
+      <w:sz w:val="16"/>
     </w:rPr>
   </w:style>
   <w:style w:type="paragraph" w:styleId="Header">

</xml_diff>

<commit_message>
Enlarge CAT2 and FAT tables to fill A4 landscape - bigger rows and fonts
</commit_message>
<xml_diff>
--- a/FAT/FAT_Exam_Schedule_2026.docx
+++ b/FAT/FAT_Exam_Schedule_2026.docx
@@ -4,28 +4,28 @@
   <w:body>
     <w:p>
       <w:pPr>
-        <w:spacing w:after="40"/>
+        <w:spacing w:after="20"/>
       </w:pPr>
       <w:r>
         <w:rPr>
           <w:rFonts w:ascii="Liberation Sans" w:hAnsi="Liberation Sans"/>
           <w:b/>
           <w:color w:val="007F83"/>
-          <w:sz w:val="16"/>
+          <w:sz w:val="18"/>
         </w:rPr>
         <w:t>ACADEMIC PLANNER  /  FALL 2026</w:t>
       </w:r>
     </w:p>
     <w:p>
       <w:pPr>
-        <w:spacing w:after="40"/>
+        <w:spacing w:after="20"/>
       </w:pPr>
       <w:r>
         <w:rPr>
           <w:rFonts w:ascii="Liberation Sans" w:hAnsi="Liberation Sans"/>
           <w:b/>
           <w:color w:val="172E46"/>
-          <w:sz w:val="44"/>
+          <w:sz w:val="52"/>
         </w:rPr>
         <w:t>FAT</w:t>
       </w:r>
@@ -33,20 +33,20 @@
         <w:rPr>
           <w:rFonts w:ascii="Liberation Sans" w:hAnsi="Liberation Sans"/>
           <w:color w:val="172E46"/>
-          <w:sz w:val="36"/>
+          <w:sz w:val="40"/>
         </w:rPr>
         <w:t xml:space="preserve">  Examination Schedule</w:t>
       </w:r>
     </w:p>
     <w:p>
       <w:pPr>
-        <w:spacing w:after="160"/>
+        <w:spacing w:after="120"/>
       </w:pPr>
       <w:r>
         <w:rPr>
           <w:rFonts w:ascii="Liberation Sans" w:hAnsi="Liberation Sans"/>
           <w:color w:val="526579"/>
-          <w:sz w:val="18"/>
+          <w:sz w:val="20"/>
         </w:rPr>
         <w:t>12 November – 01 December 2026   •   7 examinations   •   Date-wise ascending order</w:t>
       </w:r>
@@ -57,46 +57,50 @@
         <w:jc w:val="center"/>
         <w:tblLayout w:type="fixed"/>
         <w:tblLook w:firstColumn="1" w:firstRow="1" w:lastColumn="0" w:lastRow="0" w:noHBand="0" w:noVBand="1" w:val="04A0"/>
+        <w:tblW w:w="10000" w:type="pct"/>
       </w:tblPr>
       <w:tblGrid>
-        <w:gridCol w:w="504"/>
-        <w:gridCol w:w="1080"/>
-        <w:gridCol w:w="2664"/>
-        <w:gridCol w:w="792"/>
-        <w:gridCol w:w="1368"/>
-        <w:gridCol w:w="792"/>
-        <w:gridCol w:w="1080"/>
-        <w:gridCol w:w="864"/>
-        <w:gridCol w:w="1008"/>
-        <w:gridCol w:w="1368"/>
-        <w:gridCol w:w="648"/>
-        <w:gridCol w:w="792"/>
-        <w:gridCol w:w="648"/>
+        <w:gridCol w:w="639"/>
+        <w:gridCol w:w="1206"/>
+        <w:gridCol w:w="3052"/>
+        <w:gridCol w:w="852"/>
+        <w:gridCol w:w="1490"/>
+        <w:gridCol w:w="923"/>
+        <w:gridCol w:w="1348"/>
+        <w:gridCol w:w="994"/>
+        <w:gridCol w:w="1206"/>
+        <w:gridCol w:w="1632"/>
+        <w:gridCol w:w="781"/>
+        <w:gridCol w:w="923"/>
+        <w:gridCol w:w="781"/>
       </w:tblGrid>
       <w:tr>
         <w:trPr>
+          <w:trHeight w:val="680" w:hRule="atLeast"/>
           <w:tblHeader/>
-          <w:cantSplit/>
         </w:trPr>
         <w:tc>
           <w:tcPr>
-            <w:tcW w:type="dxa" w:w="504"/>
+            <w:tcW w:type="dxa" w:w="639"/>
             <w:tcMar>
-              <w:top w:w="60" w:type="dxa"/>
-              <w:bottom w:w="60" w:type="dxa"/>
-              <w:left w:w="40" w:type="dxa"/>
-              <w:right w:w="40" w:type="dxa"/>
+              <w:top w:w="200" w:type="dxa"/>
+              <w:bottom w:w="200" w:type="dxa"/>
+              <w:left w:w="70" w:type="dxa"/>
+              <w:right w:w="50" w:type="dxa"/>
             </w:tcMar>
             <w:shd w:fill="172E46"/>
             <w:vAlign w:val="center"/>
           </w:tcPr>
           <w:p>
+            <w:pPr>
+              <w:jc w:val="center"/>
+            </w:pPr>
             <w:r>
               <w:rPr>
                 <w:rFonts w:ascii="Liberation Sans" w:hAnsi="Liberation Sans"/>
                 <w:b/>
                 <w:color w:val="FFFFFF"/>
-                <w:sz w:val="13"/>
+                <w:sz w:val="18"/>
               </w:rPr>
               <w:t>S.No</w:t>
             </w:r>
@@ -104,23 +108,26 @@
         </w:tc>
         <w:tc>
           <w:tcPr>
-            <w:tcW w:type="dxa" w:w="1080"/>
+            <w:tcW w:type="dxa" w:w="1206"/>
             <w:tcMar>
-              <w:top w:w="60" w:type="dxa"/>
-              <w:bottom w:w="60" w:type="dxa"/>
-              <w:left w:w="40" w:type="dxa"/>
-              <w:right w:w="40" w:type="dxa"/>
+              <w:top w:w="200" w:type="dxa"/>
+              <w:bottom w:w="200" w:type="dxa"/>
+              <w:left w:w="70" w:type="dxa"/>
+              <w:right w:w="50" w:type="dxa"/>
             </w:tcMar>
             <w:shd w:fill="172E46"/>
             <w:vAlign w:val="center"/>
           </w:tcPr>
           <w:p>
+            <w:pPr>
+              <w:jc w:val="center"/>
+            </w:pPr>
             <w:r>
               <w:rPr>
                 <w:rFonts w:ascii="Liberation Sans" w:hAnsi="Liberation Sans"/>
                 <w:b/>
                 <w:color w:val="FFFFFF"/>
-                <w:sz w:val="13"/>
+                <w:sz w:val="18"/>
               </w:rPr>
               <w:t>Course Code</w:t>
             </w:r>
@@ -128,23 +135,26 @@
         </w:tc>
         <w:tc>
           <w:tcPr>
-            <w:tcW w:type="dxa" w:w="2664"/>
+            <w:tcW w:type="dxa" w:w="3052"/>
             <w:tcMar>
-              <w:top w:w="60" w:type="dxa"/>
-              <w:bottom w:w="60" w:type="dxa"/>
-              <w:left w:w="40" w:type="dxa"/>
-              <w:right w:w="40" w:type="dxa"/>
+              <w:top w:w="200" w:type="dxa"/>
+              <w:bottom w:w="200" w:type="dxa"/>
+              <w:left w:w="70" w:type="dxa"/>
+              <w:right w:w="50" w:type="dxa"/>
             </w:tcMar>
             <w:shd w:fill="172E46"/>
             <w:vAlign w:val="center"/>
           </w:tcPr>
           <w:p>
+            <w:pPr>
+              <w:jc w:val="center"/>
+            </w:pPr>
             <w:r>
               <w:rPr>
                 <w:rFonts w:ascii="Liberation Sans" w:hAnsi="Liberation Sans"/>
                 <w:b/>
                 <w:color w:val="FFFFFF"/>
-                <w:sz w:val="13"/>
+                <w:sz w:val="18"/>
               </w:rPr>
               <w:t>Course Title</w:t>
             </w:r>
@@ -152,23 +162,26 @@
         </w:tc>
         <w:tc>
           <w:tcPr>
-            <w:tcW w:type="dxa" w:w="792"/>
+            <w:tcW w:type="dxa" w:w="852"/>
             <w:tcMar>
-              <w:top w:w="60" w:type="dxa"/>
-              <w:bottom w:w="60" w:type="dxa"/>
-              <w:left w:w="40" w:type="dxa"/>
-              <w:right w:w="40" w:type="dxa"/>
+              <w:top w:w="200" w:type="dxa"/>
+              <w:bottom w:w="200" w:type="dxa"/>
+              <w:left w:w="70" w:type="dxa"/>
+              <w:right w:w="50" w:type="dxa"/>
             </w:tcMar>
             <w:shd w:fill="172E46"/>
             <w:vAlign w:val="center"/>
           </w:tcPr>
           <w:p>
+            <w:pPr>
+              <w:jc w:val="center"/>
+            </w:pPr>
             <w:r>
               <w:rPr>
                 <w:rFonts w:ascii="Liberation Sans" w:hAnsi="Liberation Sans"/>
                 <w:b/>
                 <w:color w:val="FFFFFF"/>
-                <w:sz w:val="13"/>
+                <w:sz w:val="18"/>
               </w:rPr>
               <w:t>Course Type</w:t>
             </w:r>
@@ -176,23 +189,26 @@
         </w:tc>
         <w:tc>
           <w:tcPr>
-            <w:tcW w:type="dxa" w:w="1368"/>
+            <w:tcW w:type="dxa" w:w="1490"/>
             <w:tcMar>
-              <w:top w:w="60" w:type="dxa"/>
-              <w:bottom w:w="60" w:type="dxa"/>
-              <w:left w:w="40" w:type="dxa"/>
-              <w:right w:w="40" w:type="dxa"/>
+              <w:top w:w="200" w:type="dxa"/>
+              <w:bottom w:w="200" w:type="dxa"/>
+              <w:left w:w="70" w:type="dxa"/>
+              <w:right w:w="50" w:type="dxa"/>
             </w:tcMar>
             <w:shd w:fill="172E46"/>
             <w:vAlign w:val="center"/>
           </w:tcPr>
           <w:p>
+            <w:pPr>
+              <w:jc w:val="center"/>
+            </w:pPr>
             <w:r>
               <w:rPr>
                 <w:rFonts w:ascii="Liberation Sans" w:hAnsi="Liberation Sans"/>
                 <w:b/>
                 <w:color w:val="FFFFFF"/>
-                <w:sz w:val="13"/>
+                <w:sz w:val="18"/>
               </w:rPr>
               <w:t>Class ID</w:t>
             </w:r>
@@ -200,23 +216,26 @@
         </w:tc>
         <w:tc>
           <w:tcPr>
-            <w:tcW w:type="dxa" w:w="792"/>
+            <w:tcW w:type="dxa" w:w="923"/>
             <w:tcMar>
-              <w:top w:w="60" w:type="dxa"/>
-              <w:bottom w:w="60" w:type="dxa"/>
-              <w:left w:w="40" w:type="dxa"/>
-              <w:right w:w="40" w:type="dxa"/>
+              <w:top w:w="200" w:type="dxa"/>
+              <w:bottom w:w="200" w:type="dxa"/>
+              <w:left w:w="70" w:type="dxa"/>
+              <w:right w:w="50" w:type="dxa"/>
             </w:tcMar>
             <w:shd w:fill="172E46"/>
             <w:vAlign w:val="center"/>
           </w:tcPr>
           <w:p>
+            <w:pPr>
+              <w:jc w:val="center"/>
+            </w:pPr>
             <w:r>
               <w:rPr>
                 <w:rFonts w:ascii="Liberation Sans" w:hAnsi="Liberation Sans"/>
                 <w:b/>
                 <w:color w:val="FFFFFF"/>
-                <w:sz w:val="13"/>
+                <w:sz w:val="18"/>
               </w:rPr>
               <w:t>Slot</w:t>
             </w:r>
@@ -224,23 +243,26 @@
         </w:tc>
         <w:tc>
           <w:tcPr>
-            <w:tcW w:type="dxa" w:w="1080"/>
+            <w:tcW w:type="dxa" w:w="1348"/>
             <w:tcMar>
-              <w:top w:w="60" w:type="dxa"/>
-              <w:bottom w:w="60" w:type="dxa"/>
-              <w:left w:w="40" w:type="dxa"/>
-              <w:right w:w="40" w:type="dxa"/>
+              <w:top w:w="200" w:type="dxa"/>
+              <w:bottom w:w="200" w:type="dxa"/>
+              <w:left w:w="70" w:type="dxa"/>
+              <w:right w:w="50" w:type="dxa"/>
             </w:tcMar>
             <w:shd w:fill="172E46"/>
             <w:vAlign w:val="center"/>
           </w:tcPr>
           <w:p>
+            <w:pPr>
+              <w:jc w:val="center"/>
+            </w:pPr>
             <w:r>
               <w:rPr>
                 <w:rFonts w:ascii="Liberation Sans" w:hAnsi="Liberation Sans"/>
                 <w:b/>
                 <w:color w:val="FFFFFF"/>
-                <w:sz w:val="13"/>
+                <w:sz w:val="18"/>
               </w:rPr>
               <w:t>Exam Date</w:t>
             </w:r>
@@ -248,23 +270,26 @@
         </w:tc>
         <w:tc>
           <w:tcPr>
-            <w:tcW w:type="dxa" w:w="864"/>
+            <w:tcW w:type="dxa" w:w="994"/>
             <w:tcMar>
-              <w:top w:w="60" w:type="dxa"/>
-              <w:bottom w:w="60" w:type="dxa"/>
-              <w:left w:w="40" w:type="dxa"/>
-              <w:right w:w="40" w:type="dxa"/>
+              <w:top w:w="200" w:type="dxa"/>
+              <w:bottom w:w="200" w:type="dxa"/>
+              <w:left w:w="70" w:type="dxa"/>
+              <w:right w:w="50" w:type="dxa"/>
             </w:tcMar>
             <w:shd w:fill="172E46"/>
             <w:vAlign w:val="center"/>
           </w:tcPr>
           <w:p>
+            <w:pPr>
+              <w:jc w:val="center"/>
+            </w:pPr>
             <w:r>
               <w:rPr>
                 <w:rFonts w:ascii="Liberation Sans" w:hAnsi="Liberation Sans"/>
                 <w:b/>
                 <w:color w:val="FFFFFF"/>
-                <w:sz w:val="13"/>
+                <w:sz w:val="18"/>
               </w:rPr>
               <w:t>Exam Session</w:t>
             </w:r>
@@ -272,23 +297,26 @@
         </w:tc>
         <w:tc>
           <w:tcPr>
-            <w:tcW w:type="dxa" w:w="1008"/>
+            <w:tcW w:type="dxa" w:w="1206"/>
             <w:tcMar>
-              <w:top w:w="60" w:type="dxa"/>
-              <w:bottom w:w="60" w:type="dxa"/>
-              <w:left w:w="40" w:type="dxa"/>
-              <w:right w:w="40" w:type="dxa"/>
+              <w:top w:w="200" w:type="dxa"/>
+              <w:bottom w:w="200" w:type="dxa"/>
+              <w:left w:w="70" w:type="dxa"/>
+              <w:right w:w="50" w:type="dxa"/>
             </w:tcMar>
             <w:shd w:fill="172E46"/>
             <w:vAlign w:val="center"/>
           </w:tcPr>
           <w:p>
+            <w:pPr>
+              <w:jc w:val="center"/>
+            </w:pPr>
             <w:r>
               <w:rPr>
                 <w:rFonts w:ascii="Liberation Sans" w:hAnsi="Liberation Sans"/>
                 <w:b/>
                 <w:color w:val="FFFFFF"/>
-                <w:sz w:val="13"/>
+                <w:sz w:val="18"/>
               </w:rPr>
               <w:t>Reporting Time</w:t>
             </w:r>
@@ -296,23 +324,26 @@
         </w:tc>
         <w:tc>
           <w:tcPr>
-            <w:tcW w:type="dxa" w:w="1368"/>
+            <w:tcW w:type="dxa" w:w="1632"/>
             <w:tcMar>
-              <w:top w:w="60" w:type="dxa"/>
-              <w:bottom w:w="60" w:type="dxa"/>
-              <w:left w:w="40" w:type="dxa"/>
-              <w:right w:w="40" w:type="dxa"/>
+              <w:top w:w="200" w:type="dxa"/>
+              <w:bottom w:w="200" w:type="dxa"/>
+              <w:left w:w="70" w:type="dxa"/>
+              <w:right w:w="50" w:type="dxa"/>
             </w:tcMar>
             <w:shd w:fill="172E46"/>
             <w:vAlign w:val="center"/>
           </w:tcPr>
           <w:p>
+            <w:pPr>
+              <w:jc w:val="center"/>
+            </w:pPr>
             <w:r>
               <w:rPr>
                 <w:rFonts w:ascii="Liberation Sans" w:hAnsi="Liberation Sans"/>
                 <w:b/>
                 <w:color w:val="FFFFFF"/>
-                <w:sz w:val="13"/>
+                <w:sz w:val="18"/>
               </w:rPr>
               <w:t>Exam Time</w:t>
             </w:r>
@@ -320,23 +351,26 @@
         </w:tc>
         <w:tc>
           <w:tcPr>
-            <w:tcW w:type="dxa" w:w="648"/>
+            <w:tcW w:type="dxa" w:w="781"/>
             <w:tcMar>
-              <w:top w:w="60" w:type="dxa"/>
-              <w:bottom w:w="60" w:type="dxa"/>
-              <w:left w:w="40" w:type="dxa"/>
-              <w:right w:w="40" w:type="dxa"/>
+              <w:top w:w="200" w:type="dxa"/>
+              <w:bottom w:w="200" w:type="dxa"/>
+              <w:left w:w="70" w:type="dxa"/>
+              <w:right w:w="50" w:type="dxa"/>
             </w:tcMar>
             <w:shd w:fill="172E46"/>
             <w:vAlign w:val="center"/>
           </w:tcPr>
           <w:p>
+            <w:pPr>
+              <w:jc w:val="center"/>
+            </w:pPr>
             <w:r>
               <w:rPr>
                 <w:rFonts w:ascii="Liberation Sans" w:hAnsi="Liberation Sans"/>
                 <w:b/>
                 <w:color w:val="FFFFFF"/>
-                <w:sz w:val="13"/>
+                <w:sz w:val="18"/>
               </w:rPr>
               <w:t>Venue</w:t>
             </w:r>
@@ -344,23 +378,26 @@
         </w:tc>
         <w:tc>
           <w:tcPr>
-            <w:tcW w:type="dxa" w:w="792"/>
+            <w:tcW w:type="dxa" w:w="923"/>
             <w:tcMar>
-              <w:top w:w="60" w:type="dxa"/>
-              <w:bottom w:w="60" w:type="dxa"/>
-              <w:left w:w="40" w:type="dxa"/>
-              <w:right w:w="40" w:type="dxa"/>
+              <w:top w:w="200" w:type="dxa"/>
+              <w:bottom w:w="200" w:type="dxa"/>
+              <w:left w:w="70" w:type="dxa"/>
+              <w:right w:w="50" w:type="dxa"/>
             </w:tcMar>
             <w:shd w:fill="172E46"/>
             <w:vAlign w:val="center"/>
           </w:tcPr>
           <w:p>
+            <w:pPr>
+              <w:jc w:val="center"/>
+            </w:pPr>
             <w:r>
               <w:rPr>
                 <w:rFonts w:ascii="Liberation Sans" w:hAnsi="Liberation Sans"/>
                 <w:b/>
                 <w:color w:val="FFFFFF"/>
-                <w:sz w:val="13"/>
+                <w:sz w:val="18"/>
               </w:rPr>
               <w:t>Seat Location</w:t>
             </w:r>
@@ -368,23 +405,26 @@
         </w:tc>
         <w:tc>
           <w:tcPr>
-            <w:tcW w:type="dxa" w:w="648"/>
+            <w:tcW w:type="dxa" w:w="781"/>
             <w:tcMar>
-              <w:top w:w="60" w:type="dxa"/>
-              <w:bottom w:w="60" w:type="dxa"/>
-              <w:left w:w="40" w:type="dxa"/>
-              <w:right w:w="40" w:type="dxa"/>
+              <w:top w:w="200" w:type="dxa"/>
+              <w:bottom w:w="200" w:type="dxa"/>
+              <w:left w:w="70" w:type="dxa"/>
+              <w:right w:w="50" w:type="dxa"/>
             </w:tcMar>
             <w:shd w:fill="172E46"/>
             <w:vAlign w:val="center"/>
           </w:tcPr>
           <w:p>
+            <w:pPr>
+              <w:jc w:val="center"/>
+            </w:pPr>
             <w:r>
               <w:rPr>
                 <w:rFonts w:ascii="Liberation Sans" w:hAnsi="Liberation Sans"/>
                 <w:b/>
                 <w:color w:val="FFFFFF"/>
-                <w:sz w:val="13"/>
+                <w:sz w:val="18"/>
               </w:rPr>
               <w:t>Seat No.</w:t>
             </w:r>
@@ -393,18 +433,45 @@
       </w:tr>
       <w:tr>
         <w:trPr>
-          <w:cantSplit/>
+          <w:trHeight w:val="1050" w:hRule="atLeast"/>
         </w:trPr>
         <w:tc>
           <w:tcPr>
-            <w:tcW w:type="dxa" w:w="504"/>
+            <w:tcW w:type="dxa" w:w="639"/>
             <w:tcMar>
-              <w:top w:w="60" w:type="dxa"/>
-              <w:bottom w:w="60" w:type="dxa"/>
-              <w:left w:w="40" w:type="dxa"/>
-              <w:right w:w="40" w:type="dxa"/>
+              <w:top w:w="180" w:type="dxa"/>
+              <w:bottom w:w="180" w:type="dxa"/>
+              <w:left w:w="70" w:type="dxa"/>
+              <w:right w:w="50" w:type="dxa"/>
             </w:tcMar>
-            <w:shd w:fill="F0F5F8"/>
+            <w:shd w:fill="E8EFF5"/>
+            <w:vAlign w:val="center"/>
+          </w:tcPr>
+          <w:p>
+            <w:pPr>
+              <w:jc w:val="center"/>
+            </w:pPr>
+            <w:r>
+              <w:rPr>
+                <w:rFonts w:ascii="Liberation Sans" w:hAnsi="Liberation Sans"/>
+                <w:b/>
+                <w:color w:val="172E46"/>
+                <w:sz w:val="22"/>
+              </w:rPr>
+              <w:t>1</w:t>
+            </w:r>
+          </w:p>
+        </w:tc>
+        <w:tc>
+          <w:tcPr>
+            <w:tcW w:type="dxa" w:w="1206"/>
+            <w:tcMar>
+              <w:top w:w="180" w:type="dxa"/>
+              <w:bottom w:w="180" w:type="dxa"/>
+              <w:left w:w="70" w:type="dxa"/>
+              <w:right w:w="50" w:type="dxa"/>
+            </w:tcMar>
+            <w:shd w:fill="E8EFF5"/>
             <w:vAlign w:val="center"/>
           </w:tcPr>
           <w:p>
@@ -413,22 +480,124 @@
                 <w:rFonts w:ascii="Liberation Sans" w:hAnsi="Liberation Sans"/>
                 <w:b/>
                 <w:color w:val="172E46"/>
-                <w:sz w:val="14"/>
+                <w:sz w:val="20"/>
               </w:rPr>
-              <w:t>1</w:t>
+              <w:t>MACSE502</w:t>
             </w:r>
           </w:p>
         </w:tc>
         <w:tc>
           <w:tcPr>
-            <w:tcW w:type="dxa" w:w="1080"/>
+            <w:tcW w:type="dxa" w:w="3052"/>
             <w:tcMar>
-              <w:top w:w="60" w:type="dxa"/>
-              <w:bottom w:w="60" w:type="dxa"/>
-              <w:left w:w="40" w:type="dxa"/>
-              <w:right w:w="40" w:type="dxa"/>
+              <w:top w:w="180" w:type="dxa"/>
+              <w:bottom w:w="180" w:type="dxa"/>
+              <w:left w:w="70" w:type="dxa"/>
+              <w:right w:w="50" w:type="dxa"/>
             </w:tcMar>
-            <w:shd w:fill="F0F5F8"/>
+            <w:shd w:fill="E8EFF5"/>
+            <w:vAlign w:val="center"/>
+          </w:tcPr>
+          <w:p>
+            <w:r>
+              <w:rPr>
+                <w:rFonts w:ascii="Liberation Sans" w:hAnsi="Liberation Sans"/>
+                <w:b w:val="0"/>
+                <w:color w:val="172E46"/>
+                <w:sz w:val="20"/>
+              </w:rPr>
+              <w:t>Programming for Data Science</w:t>
+            </w:r>
+          </w:p>
+        </w:tc>
+        <w:tc>
+          <w:tcPr>
+            <w:tcW w:type="dxa" w:w="852"/>
+            <w:tcMar>
+              <w:top w:w="180" w:type="dxa"/>
+              <w:bottom w:w="180" w:type="dxa"/>
+              <w:left w:w="70" w:type="dxa"/>
+              <w:right w:w="50" w:type="dxa"/>
+            </w:tcMar>
+            <w:shd w:fill="E8EFF5"/>
+            <w:vAlign w:val="center"/>
+          </w:tcPr>
+          <w:p>
+            <w:pPr>
+              <w:jc w:val="center"/>
+            </w:pPr>
+            <w:r>
+              <w:rPr>
+                <w:rFonts w:ascii="Liberation Sans" w:hAnsi="Liberation Sans"/>
+                <w:b w:val="0"/>
+                <w:color w:val="172E46"/>
+                <w:sz w:val="20"/>
+              </w:rPr>
+              <w:t>ETH</w:t>
+            </w:r>
+          </w:p>
+        </w:tc>
+        <w:tc>
+          <w:tcPr>
+            <w:tcW w:type="dxa" w:w="1490"/>
+            <w:tcMar>
+              <w:top w:w="180" w:type="dxa"/>
+              <w:bottom w:w="180" w:type="dxa"/>
+              <w:left w:w="70" w:type="dxa"/>
+              <w:right w:w="50" w:type="dxa"/>
+            </w:tcMar>
+            <w:shd w:fill="E8EFF5"/>
+            <w:vAlign w:val="center"/>
+          </w:tcPr>
+          <w:p>
+            <w:r>
+              <w:rPr>
+                <w:rFonts w:ascii="Liberation Sans" w:hAnsi="Liberation Sans"/>
+                <w:b w:val="0"/>
+                <w:color w:val="172E46"/>
+                <w:sz w:val="16"/>
+              </w:rPr>
+              <w:t>VL2026270106067</w:t>
+            </w:r>
+          </w:p>
+        </w:tc>
+        <w:tc>
+          <w:tcPr>
+            <w:tcW w:type="dxa" w:w="923"/>
+            <w:tcMar>
+              <w:top w:w="180" w:type="dxa"/>
+              <w:bottom w:w="180" w:type="dxa"/>
+              <w:left w:w="70" w:type="dxa"/>
+              <w:right w:w="50" w:type="dxa"/>
+            </w:tcMar>
+            <w:shd w:fill="E8EFF5"/>
+            <w:vAlign w:val="center"/>
+          </w:tcPr>
+          <w:p>
+            <w:pPr>
+              <w:jc w:val="center"/>
+            </w:pPr>
+            <w:r>
+              <w:rPr>
+                <w:rFonts w:ascii="Liberation Sans" w:hAnsi="Liberation Sans"/>
+                <w:b w:val="0"/>
+                <w:color w:val="172E46"/>
+                <w:sz w:val="20"/>
+              </w:rPr>
+              <w:t>A1+TA1</w:t>
+            </w:r>
+          </w:p>
+        </w:tc>
+        <w:tc>
+          <w:tcPr>
+            <w:tcW w:type="dxa" w:w="1348"/>
+            <w:tcMar>
+              <w:top w:w="180" w:type="dxa"/>
+              <w:bottom w:w="180" w:type="dxa"/>
+              <w:left w:w="70" w:type="dxa"/>
+              <w:right w:w="50" w:type="dxa"/>
+            </w:tcMar>
+            <w:shd w:fill="E8EFF5"/>
             <w:vAlign w:val="center"/>
           </w:tcPr>
           <w:p>
@@ -437,22 +606,63 @@
                 <w:rFonts w:ascii="Liberation Sans" w:hAnsi="Liberation Sans"/>
                 <w:b/>
                 <w:color w:val="172E46"/>
-                <w:sz w:val="14"/>
+                <w:sz w:val="20"/>
               </w:rPr>
-              <w:t>MACSE502</w:t>
+              <w:t>12-Nov-2026</w:t>
+            </w:r>
+          </w:p>
+          <w:p>
+            <w:pPr>
+              <w:spacing w:before="40"/>
+            </w:pPr>
+            <w:r>
+              <w:rPr>
+                <w:rFonts w:ascii="Liberation Sans" w:hAnsi="Liberation Sans"/>
+                <w:b w:val="0"/>
+                <w:color w:val="526579"/>
+                <w:sz w:val="16"/>
+              </w:rPr>
+              <w:t>Thu</w:t>
             </w:r>
           </w:p>
         </w:tc>
         <w:tc>
           <w:tcPr>
-            <w:tcW w:type="dxa" w:w="2664"/>
+            <w:tcW w:type="dxa" w:w="994"/>
             <w:tcMar>
-              <w:top w:w="60" w:type="dxa"/>
-              <w:bottom w:w="60" w:type="dxa"/>
-              <w:left w:w="40" w:type="dxa"/>
-              <w:right w:w="40" w:type="dxa"/>
+              <w:top w:w="180" w:type="dxa"/>
+              <w:bottom w:w="180" w:type="dxa"/>
+              <w:left w:w="70" w:type="dxa"/>
+              <w:right w:w="50" w:type="dxa"/>
             </w:tcMar>
-            <w:shd w:fill="F0F5F8"/>
+            <w:shd w:fill="E8EFF5"/>
+            <w:vAlign w:val="center"/>
+          </w:tcPr>
+          <w:p>
+            <w:pPr>
+              <w:jc w:val="center"/>
+            </w:pPr>
+            <w:r>
+              <w:rPr>
+                <w:rFonts w:ascii="Liberation Sans" w:hAnsi="Liberation Sans"/>
+                <w:b w:val="0"/>
+                <w:color w:val="172E46"/>
+                <w:sz w:val="20"/>
+              </w:rPr>
+              <w:t>FN1</w:t>
+            </w:r>
+          </w:p>
+        </w:tc>
+        <w:tc>
+          <w:tcPr>
+            <w:tcW w:type="dxa" w:w="1206"/>
+            <w:tcMar>
+              <w:top w:w="180" w:type="dxa"/>
+              <w:bottom w:w="180" w:type="dxa"/>
+              <w:left w:w="70" w:type="dxa"/>
+              <w:right w:w="50" w:type="dxa"/>
+            </w:tcMar>
+            <w:shd w:fill="E8EFF5"/>
             <w:vAlign w:val="center"/>
           </w:tcPr>
           <w:p>
@@ -461,94 +671,22 @@
                 <w:rFonts w:ascii="Liberation Sans" w:hAnsi="Liberation Sans"/>
                 <w:b w:val="0"/>
                 <w:color w:val="172E46"/>
-                <w:sz w:val="14"/>
+                <w:sz w:val="20"/>
               </w:rPr>
-              <w:t>Programming for Data Science</w:t>
+              <w:t>08:45 AM</w:t>
             </w:r>
           </w:p>
         </w:tc>
         <w:tc>
           <w:tcPr>
-            <w:tcW w:type="dxa" w:w="792"/>
+            <w:tcW w:type="dxa" w:w="1632"/>
             <w:tcMar>
-              <w:top w:w="60" w:type="dxa"/>
-              <w:bottom w:w="60" w:type="dxa"/>
-              <w:left w:w="40" w:type="dxa"/>
-              <w:right w:w="40" w:type="dxa"/>
+              <w:top w:w="180" w:type="dxa"/>
+              <w:bottom w:w="180" w:type="dxa"/>
+              <w:left w:w="70" w:type="dxa"/>
+              <w:right w:w="50" w:type="dxa"/>
             </w:tcMar>
-            <w:shd w:fill="F0F5F8"/>
-            <w:vAlign w:val="center"/>
-          </w:tcPr>
-          <w:p>
-            <w:r>
-              <w:rPr>
-                <w:rFonts w:ascii="Liberation Sans" w:hAnsi="Liberation Sans"/>
-                <w:b w:val="0"/>
-                <w:color w:val="172E46"/>
-                <w:sz w:val="14"/>
-              </w:rPr>
-              <w:t>ETH</w:t>
-            </w:r>
-          </w:p>
-        </w:tc>
-        <w:tc>
-          <w:tcPr>
-            <w:tcW w:type="dxa" w:w="1368"/>
-            <w:tcMar>
-              <w:top w:w="60" w:type="dxa"/>
-              <w:bottom w:w="60" w:type="dxa"/>
-              <w:left w:w="40" w:type="dxa"/>
-              <w:right w:w="40" w:type="dxa"/>
-            </w:tcMar>
-            <w:shd w:fill="F0F5F8"/>
-            <w:vAlign w:val="center"/>
-          </w:tcPr>
-          <w:p>
-            <w:r>
-              <w:rPr>
-                <w:rFonts w:ascii="Liberation Sans" w:hAnsi="Liberation Sans"/>
-                <w:b w:val="0"/>
-                <w:color w:val="172E46"/>
-                <w:sz w:val="12"/>
-              </w:rPr>
-              <w:t>VL2026270106067</w:t>
-            </w:r>
-          </w:p>
-        </w:tc>
-        <w:tc>
-          <w:tcPr>
-            <w:tcW w:type="dxa" w:w="792"/>
-            <w:tcMar>
-              <w:top w:w="60" w:type="dxa"/>
-              <w:bottom w:w="60" w:type="dxa"/>
-              <w:left w:w="40" w:type="dxa"/>
-              <w:right w:w="40" w:type="dxa"/>
-            </w:tcMar>
-            <w:shd w:fill="F0F5F8"/>
-            <w:vAlign w:val="center"/>
-          </w:tcPr>
-          <w:p>
-            <w:r>
-              <w:rPr>
-                <w:rFonts w:ascii="Liberation Sans" w:hAnsi="Liberation Sans"/>
-                <w:b w:val="0"/>
-                <w:color w:val="172E46"/>
-                <w:sz w:val="14"/>
-              </w:rPr>
-              <w:t>A1+TA1</w:t>
-            </w:r>
-          </w:p>
-        </w:tc>
-        <w:tc>
-          <w:tcPr>
-            <w:tcW w:type="dxa" w:w="1080"/>
-            <w:tcMar>
-              <w:top w:w="60" w:type="dxa"/>
-              <w:bottom w:w="60" w:type="dxa"/>
-              <w:left w:w="40" w:type="dxa"/>
-              <w:right w:w="40" w:type="dxa"/>
-            </w:tcMar>
-            <w:shd w:fill="F0F5F8"/>
+            <w:shd w:fill="E8EFF5"/>
             <w:vAlign w:val="center"/>
           </w:tcPr>
           <w:p>
@@ -557,98 +695,7 @@
                 <w:rFonts w:ascii="Liberation Sans" w:hAnsi="Liberation Sans"/>
                 <w:b/>
                 <w:color w:val="172E46"/>
-                <w:sz w:val="14"/>
-              </w:rPr>
-              <w:t>12-Nov-2026</w:t>
-            </w:r>
-            <w:r>
-              <w:rPr>
-                <w:rFonts w:ascii="Liberation Sans" w:hAnsi="Liberation Sans"/>
-                <w:b w:val="0"/>
-                <w:color w:val="172E46"/>
-                <w:sz w:val="2"/>
-              </w:rPr>
-            </w:r>
-          </w:p>
-          <w:p>
-            <w:r>
-              <w:rPr>
-                <w:rFonts w:ascii="Liberation Sans" w:hAnsi="Liberation Sans"/>
-                <w:b w:val="0"/>
-                <w:color w:val="526579"/>
-                <w:sz w:val="12"/>
-              </w:rPr>
-              <w:t>Thu</w:t>
-            </w:r>
-          </w:p>
-        </w:tc>
-        <w:tc>
-          <w:tcPr>
-            <w:tcW w:type="dxa" w:w="864"/>
-            <w:tcMar>
-              <w:top w:w="60" w:type="dxa"/>
-              <w:bottom w:w="60" w:type="dxa"/>
-              <w:left w:w="40" w:type="dxa"/>
-              <w:right w:w="40" w:type="dxa"/>
-            </w:tcMar>
-            <w:shd w:fill="F0F5F8"/>
-            <w:vAlign w:val="center"/>
-          </w:tcPr>
-          <w:p>
-            <w:r>
-              <w:rPr>
-                <w:rFonts w:ascii="Liberation Sans" w:hAnsi="Liberation Sans"/>
-                <w:b w:val="0"/>
-                <w:color w:val="172E46"/>
-                <w:sz w:val="14"/>
-              </w:rPr>
-              <w:t>FN1</w:t>
-            </w:r>
-          </w:p>
-        </w:tc>
-        <w:tc>
-          <w:tcPr>
-            <w:tcW w:type="dxa" w:w="1008"/>
-            <w:tcMar>
-              <w:top w:w="60" w:type="dxa"/>
-              <w:bottom w:w="60" w:type="dxa"/>
-              <w:left w:w="40" w:type="dxa"/>
-              <w:right w:w="40" w:type="dxa"/>
-            </w:tcMar>
-            <w:shd w:fill="F0F5F8"/>
-            <w:vAlign w:val="center"/>
-          </w:tcPr>
-          <w:p>
-            <w:r>
-              <w:rPr>
-                <w:rFonts w:ascii="Liberation Sans" w:hAnsi="Liberation Sans"/>
-                <w:b w:val="0"/>
-                <w:color w:val="172E46"/>
-                <w:sz w:val="14"/>
-              </w:rPr>
-              <w:t>08:45 AM</w:t>
-            </w:r>
-          </w:p>
-        </w:tc>
-        <w:tc>
-          <w:tcPr>
-            <w:tcW w:type="dxa" w:w="1368"/>
-            <w:tcMar>
-              <w:top w:w="60" w:type="dxa"/>
-              <w:bottom w:w="60" w:type="dxa"/>
-              <w:left w:w="40" w:type="dxa"/>
-              <w:right w:w="40" w:type="dxa"/>
-            </w:tcMar>
-            <w:shd w:fill="F0F5F8"/>
-            <w:vAlign w:val="center"/>
-          </w:tcPr>
-          <w:p>
-            <w:r>
-              <w:rPr>
-                <w:rFonts w:ascii="Liberation Sans" w:hAnsi="Liberation Sans"/>
-                <w:b/>
-                <w:color w:val="172E46"/>
-                <w:sz w:val="14"/>
+                <w:sz w:val="20"/>
               </w:rPr>
               <w:t>09:30 AM - 12:30 PM</w:t>
             </w:r>
@@ -656,23 +703,26 @@
         </w:tc>
         <w:tc>
           <w:tcPr>
-            <w:tcW w:type="dxa" w:w="648"/>
+            <w:tcW w:type="dxa" w:w="781"/>
             <w:tcMar>
-              <w:top w:w="60" w:type="dxa"/>
-              <w:bottom w:w="60" w:type="dxa"/>
-              <w:left w:w="40" w:type="dxa"/>
-              <w:right w:w="40" w:type="dxa"/>
+              <w:top w:w="180" w:type="dxa"/>
+              <w:bottom w:w="180" w:type="dxa"/>
+              <w:left w:w="70" w:type="dxa"/>
+              <w:right w:w="50" w:type="dxa"/>
             </w:tcMar>
-            <w:shd w:fill="F0F5F8"/>
+            <w:shd w:fill="E8EFF5"/>
             <w:vAlign w:val="center"/>
           </w:tcPr>
           <w:p>
+            <w:pPr>
+              <w:jc w:val="center"/>
+            </w:pPr>
             <w:r>
               <w:rPr>
                 <w:rFonts w:ascii="Liberation Sans" w:hAnsi="Liberation Sans"/>
                 <w:b w:val="0"/>
                 <w:color w:val="526579"/>
-                <w:sz w:val="14"/>
+                <w:sz w:val="20"/>
               </w:rPr>
               <w:t>-</w:t>
             </w:r>
@@ -680,23 +730,26 @@
         </w:tc>
         <w:tc>
           <w:tcPr>
-            <w:tcW w:type="dxa" w:w="792"/>
+            <w:tcW w:type="dxa" w:w="923"/>
             <w:tcMar>
-              <w:top w:w="60" w:type="dxa"/>
-              <w:bottom w:w="60" w:type="dxa"/>
-              <w:left w:w="40" w:type="dxa"/>
-              <w:right w:w="40" w:type="dxa"/>
+              <w:top w:w="180" w:type="dxa"/>
+              <w:bottom w:w="180" w:type="dxa"/>
+              <w:left w:w="70" w:type="dxa"/>
+              <w:right w:w="50" w:type="dxa"/>
             </w:tcMar>
-            <w:shd w:fill="F0F5F8"/>
+            <w:shd w:fill="E8EFF5"/>
             <w:vAlign w:val="center"/>
           </w:tcPr>
           <w:p>
+            <w:pPr>
+              <w:jc w:val="center"/>
+            </w:pPr>
             <w:r>
               <w:rPr>
                 <w:rFonts w:ascii="Liberation Sans" w:hAnsi="Liberation Sans"/>
                 <w:b w:val="0"/>
                 <w:color w:val="526579"/>
-                <w:sz w:val="14"/>
+                <w:sz w:val="20"/>
               </w:rPr>
               <w:t>-</w:t>
             </w:r>
@@ -704,23 +757,26 @@
         </w:tc>
         <w:tc>
           <w:tcPr>
-            <w:tcW w:type="dxa" w:w="648"/>
+            <w:tcW w:type="dxa" w:w="781"/>
             <w:tcMar>
-              <w:top w:w="60" w:type="dxa"/>
-              <w:bottom w:w="60" w:type="dxa"/>
-              <w:left w:w="40" w:type="dxa"/>
-              <w:right w:w="40" w:type="dxa"/>
+              <w:top w:w="180" w:type="dxa"/>
+              <w:bottom w:w="180" w:type="dxa"/>
+              <w:left w:w="70" w:type="dxa"/>
+              <w:right w:w="50" w:type="dxa"/>
             </w:tcMar>
-            <w:shd w:fill="F0F5F8"/>
+            <w:shd w:fill="E8EFF5"/>
             <w:vAlign w:val="center"/>
           </w:tcPr>
           <w:p>
+            <w:pPr>
+              <w:jc w:val="center"/>
+            </w:pPr>
             <w:r>
               <w:rPr>
                 <w:rFonts w:ascii="Liberation Sans" w:hAnsi="Liberation Sans"/>
                 <w:b w:val="0"/>
                 <w:color w:val="526579"/>
-                <w:sz w:val="14"/>
+                <w:sz w:val="20"/>
               </w:rPr>
               <w:t>-</w:t>
             </w:r>
@@ -729,16 +785,43 @@
       </w:tr>
       <w:tr>
         <w:trPr>
-          <w:cantSplit/>
+          <w:trHeight w:val="1050" w:hRule="atLeast"/>
         </w:trPr>
         <w:tc>
           <w:tcPr>
-            <w:tcW w:type="dxa" w:w="504"/>
+            <w:tcW w:type="dxa" w:w="639"/>
             <w:tcMar>
-              <w:top w:w="60" w:type="dxa"/>
-              <w:bottom w:w="60" w:type="dxa"/>
-              <w:left w:w="40" w:type="dxa"/>
-              <w:right w:w="40" w:type="dxa"/>
+              <w:top w:w="180" w:type="dxa"/>
+              <w:bottom w:w="180" w:type="dxa"/>
+              <w:left w:w="70" w:type="dxa"/>
+              <w:right w:w="50" w:type="dxa"/>
+            </w:tcMar>
+            <w:shd w:fill="FFFFFF"/>
+            <w:vAlign w:val="center"/>
+          </w:tcPr>
+          <w:p>
+            <w:pPr>
+              <w:jc w:val="center"/>
+            </w:pPr>
+            <w:r>
+              <w:rPr>
+                <w:rFonts w:ascii="Liberation Sans" w:hAnsi="Liberation Sans"/>
+                <w:b/>
+                <w:color w:val="172E46"/>
+                <w:sz w:val="22"/>
+              </w:rPr>
+              <w:t>2</w:t>
+            </w:r>
+          </w:p>
+        </w:tc>
+        <w:tc>
+          <w:tcPr>
+            <w:tcW w:type="dxa" w:w="1206"/>
+            <w:tcMar>
+              <w:top w:w="180" w:type="dxa"/>
+              <w:bottom w:w="180" w:type="dxa"/>
+              <w:left w:w="70" w:type="dxa"/>
+              <w:right w:w="50" w:type="dxa"/>
             </w:tcMar>
             <w:shd w:fill="FFFFFF"/>
             <w:vAlign w:val="center"/>
@@ -749,20 +832,122 @@
                 <w:rFonts w:ascii="Liberation Sans" w:hAnsi="Liberation Sans"/>
                 <w:b/>
                 <w:color w:val="172E46"/>
-                <w:sz w:val="14"/>
+                <w:sz w:val="20"/>
               </w:rPr>
-              <w:t>2</w:t>
+              <w:t>MACSE501</w:t>
             </w:r>
           </w:p>
         </w:tc>
         <w:tc>
           <w:tcPr>
-            <w:tcW w:type="dxa" w:w="1080"/>
+            <w:tcW w:type="dxa" w:w="3052"/>
             <w:tcMar>
-              <w:top w:w="60" w:type="dxa"/>
-              <w:bottom w:w="60" w:type="dxa"/>
-              <w:left w:w="40" w:type="dxa"/>
-              <w:right w:w="40" w:type="dxa"/>
+              <w:top w:w="180" w:type="dxa"/>
+              <w:bottom w:w="180" w:type="dxa"/>
+              <w:left w:w="70" w:type="dxa"/>
+              <w:right w:w="50" w:type="dxa"/>
+            </w:tcMar>
+            <w:shd w:fill="FFFFFF"/>
+            <w:vAlign w:val="center"/>
+          </w:tcPr>
+          <w:p>
+            <w:r>
+              <w:rPr>
+                <w:rFonts w:ascii="Liberation Sans" w:hAnsi="Liberation Sans"/>
+                <w:b w:val="0"/>
+                <w:color w:val="172E46"/>
+                <w:sz w:val="20"/>
+              </w:rPr>
+              <w:t>Data Structures and Algorithm Analysis</w:t>
+            </w:r>
+          </w:p>
+        </w:tc>
+        <w:tc>
+          <w:tcPr>
+            <w:tcW w:type="dxa" w:w="852"/>
+            <w:tcMar>
+              <w:top w:w="180" w:type="dxa"/>
+              <w:bottom w:w="180" w:type="dxa"/>
+              <w:left w:w="70" w:type="dxa"/>
+              <w:right w:w="50" w:type="dxa"/>
+            </w:tcMar>
+            <w:shd w:fill="FFFFFF"/>
+            <w:vAlign w:val="center"/>
+          </w:tcPr>
+          <w:p>
+            <w:pPr>
+              <w:jc w:val="center"/>
+            </w:pPr>
+            <w:r>
+              <w:rPr>
+                <w:rFonts w:ascii="Liberation Sans" w:hAnsi="Liberation Sans"/>
+                <w:b w:val="0"/>
+                <w:color w:val="172E46"/>
+                <w:sz w:val="20"/>
+              </w:rPr>
+              <w:t>ETH</w:t>
+            </w:r>
+          </w:p>
+        </w:tc>
+        <w:tc>
+          <w:tcPr>
+            <w:tcW w:type="dxa" w:w="1490"/>
+            <w:tcMar>
+              <w:top w:w="180" w:type="dxa"/>
+              <w:bottom w:w="180" w:type="dxa"/>
+              <w:left w:w="70" w:type="dxa"/>
+              <w:right w:w="50" w:type="dxa"/>
+            </w:tcMar>
+            <w:shd w:fill="FFFFFF"/>
+            <w:vAlign w:val="center"/>
+          </w:tcPr>
+          <w:p>
+            <w:r>
+              <w:rPr>
+                <w:rFonts w:ascii="Liberation Sans" w:hAnsi="Liberation Sans"/>
+                <w:b w:val="0"/>
+                <w:color w:val="172E46"/>
+                <w:sz w:val="16"/>
+              </w:rPr>
+              <w:t>VL2026270106999</w:t>
+            </w:r>
+          </w:p>
+        </w:tc>
+        <w:tc>
+          <w:tcPr>
+            <w:tcW w:type="dxa" w:w="923"/>
+            <w:tcMar>
+              <w:top w:w="180" w:type="dxa"/>
+              <w:bottom w:w="180" w:type="dxa"/>
+              <w:left w:w="70" w:type="dxa"/>
+              <w:right w:w="50" w:type="dxa"/>
+            </w:tcMar>
+            <w:shd w:fill="FFFFFF"/>
+            <w:vAlign w:val="center"/>
+          </w:tcPr>
+          <w:p>
+            <w:pPr>
+              <w:jc w:val="center"/>
+            </w:pPr>
+            <w:r>
+              <w:rPr>
+                <w:rFonts w:ascii="Liberation Sans" w:hAnsi="Liberation Sans"/>
+                <w:b w:val="0"/>
+                <w:color w:val="172E46"/>
+                <w:sz w:val="20"/>
+              </w:rPr>
+              <w:t>B1+TB1</w:t>
+            </w:r>
+          </w:p>
+        </w:tc>
+        <w:tc>
+          <w:tcPr>
+            <w:tcW w:type="dxa" w:w="1348"/>
+            <w:tcMar>
+              <w:top w:w="180" w:type="dxa"/>
+              <w:bottom w:w="180" w:type="dxa"/>
+              <w:left w:w="70" w:type="dxa"/>
+              <w:right w:w="50" w:type="dxa"/>
             </w:tcMar>
             <w:shd w:fill="FFFFFF"/>
             <w:vAlign w:val="center"/>
@@ -773,20 +958,61 @@
                 <w:rFonts w:ascii="Liberation Sans" w:hAnsi="Liberation Sans"/>
                 <w:b/>
                 <w:color w:val="172E46"/>
-                <w:sz w:val="14"/>
+                <w:sz w:val="20"/>
               </w:rPr>
-              <w:t>MACSE501</w:t>
+              <w:t>14-Nov-2026</w:t>
+            </w:r>
+          </w:p>
+          <w:p>
+            <w:pPr>
+              <w:spacing w:before="40"/>
+            </w:pPr>
+            <w:r>
+              <w:rPr>
+                <w:rFonts w:ascii="Liberation Sans" w:hAnsi="Liberation Sans"/>
+                <w:b w:val="0"/>
+                <w:color w:val="526579"/>
+                <w:sz w:val="16"/>
+              </w:rPr>
+              <w:t>Sat</w:t>
             </w:r>
           </w:p>
         </w:tc>
         <w:tc>
           <w:tcPr>
-            <w:tcW w:type="dxa" w:w="2664"/>
+            <w:tcW w:type="dxa" w:w="994"/>
             <w:tcMar>
-              <w:top w:w="60" w:type="dxa"/>
-              <w:bottom w:w="60" w:type="dxa"/>
-              <w:left w:w="40" w:type="dxa"/>
-              <w:right w:w="40" w:type="dxa"/>
+              <w:top w:w="180" w:type="dxa"/>
+              <w:bottom w:w="180" w:type="dxa"/>
+              <w:left w:w="70" w:type="dxa"/>
+              <w:right w:w="50" w:type="dxa"/>
+            </w:tcMar>
+            <w:shd w:fill="FFFFFF"/>
+            <w:vAlign w:val="center"/>
+          </w:tcPr>
+          <w:p>
+            <w:pPr>
+              <w:jc w:val="center"/>
+            </w:pPr>
+            <w:r>
+              <w:rPr>
+                <w:rFonts w:ascii="Liberation Sans" w:hAnsi="Liberation Sans"/>
+                <w:b w:val="0"/>
+                <w:color w:val="172E46"/>
+                <w:sz w:val="20"/>
+              </w:rPr>
+              <w:t>FN1</w:t>
+            </w:r>
+          </w:p>
+        </w:tc>
+        <w:tc>
+          <w:tcPr>
+            <w:tcW w:type="dxa" w:w="1206"/>
+            <w:tcMar>
+              <w:top w:w="180" w:type="dxa"/>
+              <w:bottom w:w="180" w:type="dxa"/>
+              <w:left w:w="70" w:type="dxa"/>
+              <w:right w:w="50" w:type="dxa"/>
             </w:tcMar>
             <w:shd w:fill="FFFFFF"/>
             <w:vAlign w:val="center"/>
@@ -797,20 +1023,533 @@
                 <w:rFonts w:ascii="Liberation Sans" w:hAnsi="Liberation Sans"/>
                 <w:b w:val="0"/>
                 <w:color w:val="172E46"/>
-                <w:sz w:val="14"/>
+                <w:sz w:val="20"/>
               </w:rPr>
-              <w:t>Data Structures and Algorithm Analysis</w:t>
+              <w:t>08:45 AM</w:t>
             </w:r>
           </w:p>
         </w:tc>
         <w:tc>
           <w:tcPr>
-            <w:tcW w:type="dxa" w:w="792"/>
+            <w:tcW w:type="dxa" w:w="1632"/>
             <w:tcMar>
-              <w:top w:w="60" w:type="dxa"/>
-              <w:bottom w:w="60" w:type="dxa"/>
-              <w:left w:w="40" w:type="dxa"/>
-              <w:right w:w="40" w:type="dxa"/>
+              <w:top w:w="180" w:type="dxa"/>
+              <w:bottom w:w="180" w:type="dxa"/>
+              <w:left w:w="70" w:type="dxa"/>
+              <w:right w:w="50" w:type="dxa"/>
+            </w:tcMar>
+            <w:shd w:fill="FFFFFF"/>
+            <w:vAlign w:val="center"/>
+          </w:tcPr>
+          <w:p>
+            <w:r>
+              <w:rPr>
+                <w:rFonts w:ascii="Liberation Sans" w:hAnsi="Liberation Sans"/>
+                <w:b/>
+                <w:color w:val="172E46"/>
+                <w:sz w:val="20"/>
+              </w:rPr>
+              <w:t>09:30 AM - 12:30 PM</w:t>
+            </w:r>
+          </w:p>
+        </w:tc>
+        <w:tc>
+          <w:tcPr>
+            <w:tcW w:type="dxa" w:w="781"/>
+            <w:tcMar>
+              <w:top w:w="180" w:type="dxa"/>
+              <w:bottom w:w="180" w:type="dxa"/>
+              <w:left w:w="70" w:type="dxa"/>
+              <w:right w:w="50" w:type="dxa"/>
+            </w:tcMar>
+            <w:shd w:fill="FFFFFF"/>
+            <w:vAlign w:val="center"/>
+          </w:tcPr>
+          <w:p>
+            <w:pPr>
+              <w:jc w:val="center"/>
+            </w:pPr>
+            <w:r>
+              <w:rPr>
+                <w:rFonts w:ascii="Liberation Sans" w:hAnsi="Liberation Sans"/>
+                <w:b w:val="0"/>
+                <w:color w:val="526579"/>
+                <w:sz w:val="20"/>
+              </w:rPr>
+              <w:t>-</w:t>
+            </w:r>
+          </w:p>
+        </w:tc>
+        <w:tc>
+          <w:tcPr>
+            <w:tcW w:type="dxa" w:w="923"/>
+            <w:tcMar>
+              <w:top w:w="180" w:type="dxa"/>
+              <w:bottom w:w="180" w:type="dxa"/>
+              <w:left w:w="70" w:type="dxa"/>
+              <w:right w:w="50" w:type="dxa"/>
+            </w:tcMar>
+            <w:shd w:fill="FFFFFF"/>
+            <w:vAlign w:val="center"/>
+          </w:tcPr>
+          <w:p>
+            <w:pPr>
+              <w:jc w:val="center"/>
+            </w:pPr>
+            <w:r>
+              <w:rPr>
+                <w:rFonts w:ascii="Liberation Sans" w:hAnsi="Liberation Sans"/>
+                <w:b w:val="0"/>
+                <w:color w:val="526579"/>
+                <w:sz w:val="20"/>
+              </w:rPr>
+              <w:t>-</w:t>
+            </w:r>
+          </w:p>
+        </w:tc>
+        <w:tc>
+          <w:tcPr>
+            <w:tcW w:type="dxa" w:w="781"/>
+            <w:tcMar>
+              <w:top w:w="180" w:type="dxa"/>
+              <w:bottom w:w="180" w:type="dxa"/>
+              <w:left w:w="70" w:type="dxa"/>
+              <w:right w:w="50" w:type="dxa"/>
+            </w:tcMar>
+            <w:shd w:fill="FFFFFF"/>
+            <w:vAlign w:val="center"/>
+          </w:tcPr>
+          <w:p>
+            <w:pPr>
+              <w:jc w:val="center"/>
+            </w:pPr>
+            <w:r>
+              <w:rPr>
+                <w:rFonts w:ascii="Liberation Sans" w:hAnsi="Liberation Sans"/>
+                <w:b w:val="0"/>
+                <w:color w:val="526579"/>
+                <w:sz w:val="20"/>
+              </w:rPr>
+              <w:t>-</w:t>
+            </w:r>
+          </w:p>
+        </w:tc>
+      </w:tr>
+      <w:tr>
+        <w:trPr>
+          <w:trHeight w:val="1050" w:hRule="atLeast"/>
+        </w:trPr>
+        <w:tc>
+          <w:tcPr>
+            <w:tcW w:type="dxa" w:w="639"/>
+            <w:tcMar>
+              <w:top w:w="180" w:type="dxa"/>
+              <w:bottom w:w="180" w:type="dxa"/>
+              <w:left w:w="70" w:type="dxa"/>
+              <w:right w:w="50" w:type="dxa"/>
+            </w:tcMar>
+            <w:shd w:fill="E8EFF5"/>
+            <w:vAlign w:val="center"/>
+          </w:tcPr>
+          <w:p>
+            <w:pPr>
+              <w:jc w:val="center"/>
+            </w:pPr>
+            <w:r>
+              <w:rPr>
+                <w:rFonts w:ascii="Liberation Sans" w:hAnsi="Liberation Sans"/>
+                <w:b/>
+                <w:color w:val="172E46"/>
+                <w:sz w:val="22"/>
+              </w:rPr>
+              <w:t>3</w:t>
+            </w:r>
+          </w:p>
+        </w:tc>
+        <w:tc>
+          <w:tcPr>
+            <w:tcW w:type="dxa" w:w="1206"/>
+            <w:tcMar>
+              <w:top w:w="180" w:type="dxa"/>
+              <w:bottom w:w="180" w:type="dxa"/>
+              <w:left w:w="70" w:type="dxa"/>
+              <w:right w:w="50" w:type="dxa"/>
+            </w:tcMar>
+            <w:shd w:fill="E8EFF5"/>
+            <w:vAlign w:val="center"/>
+          </w:tcPr>
+          <w:p>
+            <w:r>
+              <w:rPr>
+                <w:rFonts w:ascii="Liberation Sans" w:hAnsi="Liberation Sans"/>
+                <w:b/>
+                <w:color w:val="172E46"/>
+                <w:sz w:val="20"/>
+              </w:rPr>
+              <w:t>MAMAT500</w:t>
+            </w:r>
+          </w:p>
+        </w:tc>
+        <w:tc>
+          <w:tcPr>
+            <w:tcW w:type="dxa" w:w="3052"/>
+            <w:tcMar>
+              <w:top w:w="180" w:type="dxa"/>
+              <w:bottom w:w="180" w:type="dxa"/>
+              <w:left w:w="70" w:type="dxa"/>
+              <w:right w:w="50" w:type="dxa"/>
+            </w:tcMar>
+            <w:shd w:fill="E8EFF5"/>
+            <w:vAlign w:val="center"/>
+          </w:tcPr>
+          <w:p>
+            <w:r>
+              <w:rPr>
+                <w:rFonts w:ascii="Liberation Sans" w:hAnsi="Liberation Sans"/>
+                <w:b w:val="0"/>
+                <w:color w:val="172E46"/>
+                <w:sz w:val="20"/>
+              </w:rPr>
+              <w:t>Applied Statistics</w:t>
+            </w:r>
+          </w:p>
+        </w:tc>
+        <w:tc>
+          <w:tcPr>
+            <w:tcW w:type="dxa" w:w="852"/>
+            <w:tcMar>
+              <w:top w:w="180" w:type="dxa"/>
+              <w:bottom w:w="180" w:type="dxa"/>
+              <w:left w:w="70" w:type="dxa"/>
+              <w:right w:w="50" w:type="dxa"/>
+            </w:tcMar>
+            <w:shd w:fill="E8EFF5"/>
+            <w:vAlign w:val="center"/>
+          </w:tcPr>
+          <w:p>
+            <w:pPr>
+              <w:jc w:val="center"/>
+            </w:pPr>
+            <w:r>
+              <w:rPr>
+                <w:rFonts w:ascii="Liberation Sans" w:hAnsi="Liberation Sans"/>
+                <w:b w:val="0"/>
+                <w:color w:val="172E46"/>
+                <w:sz w:val="20"/>
+              </w:rPr>
+              <w:t>TH</w:t>
+            </w:r>
+          </w:p>
+        </w:tc>
+        <w:tc>
+          <w:tcPr>
+            <w:tcW w:type="dxa" w:w="1490"/>
+            <w:tcMar>
+              <w:top w:w="180" w:type="dxa"/>
+              <w:bottom w:w="180" w:type="dxa"/>
+              <w:left w:w="70" w:type="dxa"/>
+              <w:right w:w="50" w:type="dxa"/>
+            </w:tcMar>
+            <w:shd w:fill="E8EFF5"/>
+            <w:vAlign w:val="center"/>
+          </w:tcPr>
+          <w:p>
+            <w:r>
+              <w:rPr>
+                <w:rFonts w:ascii="Liberation Sans" w:hAnsi="Liberation Sans"/>
+                <w:b w:val="0"/>
+                <w:color w:val="172E46"/>
+                <w:sz w:val="16"/>
+              </w:rPr>
+              <w:t>VL2026270105581</w:t>
+            </w:r>
+          </w:p>
+        </w:tc>
+        <w:tc>
+          <w:tcPr>
+            <w:tcW w:type="dxa" w:w="923"/>
+            <w:tcMar>
+              <w:top w:w="180" w:type="dxa"/>
+              <w:bottom w:w="180" w:type="dxa"/>
+              <w:left w:w="70" w:type="dxa"/>
+              <w:right w:w="50" w:type="dxa"/>
+            </w:tcMar>
+            <w:shd w:fill="E8EFF5"/>
+            <w:vAlign w:val="center"/>
+          </w:tcPr>
+          <w:p>
+            <w:pPr>
+              <w:jc w:val="center"/>
+            </w:pPr>
+            <w:r>
+              <w:rPr>
+                <w:rFonts w:ascii="Liberation Sans" w:hAnsi="Liberation Sans"/>
+                <w:b w:val="0"/>
+                <w:color w:val="172E46"/>
+                <w:sz w:val="20"/>
+              </w:rPr>
+              <w:t>D1+TD1</w:t>
+            </w:r>
+          </w:p>
+        </w:tc>
+        <w:tc>
+          <w:tcPr>
+            <w:tcW w:type="dxa" w:w="1348"/>
+            <w:tcMar>
+              <w:top w:w="180" w:type="dxa"/>
+              <w:bottom w:w="180" w:type="dxa"/>
+              <w:left w:w="70" w:type="dxa"/>
+              <w:right w:w="50" w:type="dxa"/>
+            </w:tcMar>
+            <w:shd w:fill="E8EFF5"/>
+            <w:vAlign w:val="center"/>
+          </w:tcPr>
+          <w:p>
+            <w:r>
+              <w:rPr>
+                <w:rFonts w:ascii="Liberation Sans" w:hAnsi="Liberation Sans"/>
+                <w:b/>
+                <w:color w:val="172E46"/>
+                <w:sz w:val="20"/>
+              </w:rPr>
+              <w:t>19-Nov-2026</w:t>
+            </w:r>
+          </w:p>
+          <w:p>
+            <w:pPr>
+              <w:spacing w:before="40"/>
+            </w:pPr>
+            <w:r>
+              <w:rPr>
+                <w:rFonts w:ascii="Liberation Sans" w:hAnsi="Liberation Sans"/>
+                <w:b w:val="0"/>
+                <w:color w:val="526579"/>
+                <w:sz w:val="16"/>
+              </w:rPr>
+              <w:t>Thu</w:t>
+            </w:r>
+          </w:p>
+        </w:tc>
+        <w:tc>
+          <w:tcPr>
+            <w:tcW w:type="dxa" w:w="994"/>
+            <w:tcMar>
+              <w:top w:w="180" w:type="dxa"/>
+              <w:bottom w:w="180" w:type="dxa"/>
+              <w:left w:w="70" w:type="dxa"/>
+              <w:right w:w="50" w:type="dxa"/>
+            </w:tcMar>
+            <w:shd w:fill="E8EFF5"/>
+            <w:vAlign w:val="center"/>
+          </w:tcPr>
+          <w:p>
+            <w:pPr>
+              <w:jc w:val="center"/>
+            </w:pPr>
+            <w:r>
+              <w:rPr>
+                <w:rFonts w:ascii="Liberation Sans" w:hAnsi="Liberation Sans"/>
+                <w:b w:val="0"/>
+                <w:color w:val="172E46"/>
+                <w:sz w:val="20"/>
+              </w:rPr>
+              <w:t>FN1</w:t>
+            </w:r>
+          </w:p>
+        </w:tc>
+        <w:tc>
+          <w:tcPr>
+            <w:tcW w:type="dxa" w:w="1206"/>
+            <w:tcMar>
+              <w:top w:w="180" w:type="dxa"/>
+              <w:bottom w:w="180" w:type="dxa"/>
+              <w:left w:w="70" w:type="dxa"/>
+              <w:right w:w="50" w:type="dxa"/>
+            </w:tcMar>
+            <w:shd w:fill="E8EFF5"/>
+            <w:vAlign w:val="center"/>
+          </w:tcPr>
+          <w:p>
+            <w:r>
+              <w:rPr>
+                <w:rFonts w:ascii="Liberation Sans" w:hAnsi="Liberation Sans"/>
+                <w:b w:val="0"/>
+                <w:color w:val="172E46"/>
+                <w:sz w:val="20"/>
+              </w:rPr>
+              <w:t>08:45 AM</w:t>
+            </w:r>
+          </w:p>
+        </w:tc>
+        <w:tc>
+          <w:tcPr>
+            <w:tcW w:type="dxa" w:w="1632"/>
+            <w:tcMar>
+              <w:top w:w="180" w:type="dxa"/>
+              <w:bottom w:w="180" w:type="dxa"/>
+              <w:left w:w="70" w:type="dxa"/>
+              <w:right w:w="50" w:type="dxa"/>
+            </w:tcMar>
+            <w:shd w:fill="E8EFF5"/>
+            <w:vAlign w:val="center"/>
+          </w:tcPr>
+          <w:p>
+            <w:r>
+              <w:rPr>
+                <w:rFonts w:ascii="Liberation Sans" w:hAnsi="Liberation Sans"/>
+                <w:b/>
+                <w:color w:val="172E46"/>
+                <w:sz w:val="20"/>
+              </w:rPr>
+              <w:t>09:30 AM - 12:30 PM</w:t>
+            </w:r>
+          </w:p>
+        </w:tc>
+        <w:tc>
+          <w:tcPr>
+            <w:tcW w:type="dxa" w:w="781"/>
+            <w:tcMar>
+              <w:top w:w="180" w:type="dxa"/>
+              <w:bottom w:w="180" w:type="dxa"/>
+              <w:left w:w="70" w:type="dxa"/>
+              <w:right w:w="50" w:type="dxa"/>
+            </w:tcMar>
+            <w:shd w:fill="E8EFF5"/>
+            <w:vAlign w:val="center"/>
+          </w:tcPr>
+          <w:p>
+            <w:pPr>
+              <w:jc w:val="center"/>
+            </w:pPr>
+            <w:r>
+              <w:rPr>
+                <w:rFonts w:ascii="Liberation Sans" w:hAnsi="Liberation Sans"/>
+                <w:b w:val="0"/>
+                <w:color w:val="526579"/>
+                <w:sz w:val="20"/>
+              </w:rPr>
+              <w:t>-</w:t>
+            </w:r>
+          </w:p>
+        </w:tc>
+        <w:tc>
+          <w:tcPr>
+            <w:tcW w:type="dxa" w:w="923"/>
+            <w:tcMar>
+              <w:top w:w="180" w:type="dxa"/>
+              <w:bottom w:w="180" w:type="dxa"/>
+              <w:left w:w="70" w:type="dxa"/>
+              <w:right w:w="50" w:type="dxa"/>
+            </w:tcMar>
+            <w:shd w:fill="E8EFF5"/>
+            <w:vAlign w:val="center"/>
+          </w:tcPr>
+          <w:p>
+            <w:pPr>
+              <w:jc w:val="center"/>
+            </w:pPr>
+            <w:r>
+              <w:rPr>
+                <w:rFonts w:ascii="Liberation Sans" w:hAnsi="Liberation Sans"/>
+                <w:b w:val="0"/>
+                <w:color w:val="526579"/>
+                <w:sz w:val="20"/>
+              </w:rPr>
+              <w:t>-</w:t>
+            </w:r>
+          </w:p>
+        </w:tc>
+        <w:tc>
+          <w:tcPr>
+            <w:tcW w:type="dxa" w:w="781"/>
+            <w:tcMar>
+              <w:top w:w="180" w:type="dxa"/>
+              <w:bottom w:w="180" w:type="dxa"/>
+              <w:left w:w="70" w:type="dxa"/>
+              <w:right w:w="50" w:type="dxa"/>
+            </w:tcMar>
+            <w:shd w:fill="E8EFF5"/>
+            <w:vAlign w:val="center"/>
+          </w:tcPr>
+          <w:p>
+            <w:pPr>
+              <w:jc w:val="center"/>
+            </w:pPr>
+            <w:r>
+              <w:rPr>
+                <w:rFonts w:ascii="Liberation Sans" w:hAnsi="Liberation Sans"/>
+                <w:b w:val="0"/>
+                <w:color w:val="526579"/>
+                <w:sz w:val="20"/>
+              </w:rPr>
+              <w:t>-</w:t>
+            </w:r>
+          </w:p>
+        </w:tc>
+      </w:tr>
+      <w:tr>
+        <w:trPr>
+          <w:trHeight w:val="1050" w:hRule="atLeast"/>
+        </w:trPr>
+        <w:tc>
+          <w:tcPr>
+            <w:tcW w:type="dxa" w:w="639"/>
+            <w:tcMar>
+              <w:top w:w="180" w:type="dxa"/>
+              <w:bottom w:w="180" w:type="dxa"/>
+              <w:left w:w="70" w:type="dxa"/>
+              <w:right w:w="50" w:type="dxa"/>
+            </w:tcMar>
+            <w:shd w:fill="FFFFFF"/>
+            <w:vAlign w:val="center"/>
+          </w:tcPr>
+          <w:p>
+            <w:pPr>
+              <w:jc w:val="center"/>
+            </w:pPr>
+            <w:r>
+              <w:rPr>
+                <w:rFonts w:ascii="Liberation Sans" w:hAnsi="Liberation Sans"/>
+                <w:b/>
+                <w:color w:val="172E46"/>
+                <w:sz w:val="22"/>
+              </w:rPr>
+              <w:t>4</w:t>
+            </w:r>
+          </w:p>
+        </w:tc>
+        <w:tc>
+          <w:tcPr>
+            <w:tcW w:type="dxa" w:w="1206"/>
+            <w:tcMar>
+              <w:top w:w="180" w:type="dxa"/>
+              <w:bottom w:w="180" w:type="dxa"/>
+              <w:left w:w="70" w:type="dxa"/>
+              <w:right w:w="50" w:type="dxa"/>
+            </w:tcMar>
+            <w:shd w:fill="FFFFFF"/>
+            <w:vAlign w:val="center"/>
+          </w:tcPr>
+          <w:p>
+            <w:r>
+              <w:rPr>
+                <w:rFonts w:ascii="Liberation Sans" w:hAnsi="Liberation Sans"/>
+                <w:b/>
+                <w:color w:val="172E46"/>
+                <w:sz w:val="20"/>
+              </w:rPr>
+              <w:t>MACSE504</w:t>
+            </w:r>
+          </w:p>
+        </w:tc>
+        <w:tc>
+          <w:tcPr>
+            <w:tcW w:type="dxa" w:w="3052"/>
+            <w:tcMar>
+              <w:top w:w="180" w:type="dxa"/>
+              <w:bottom w:w="180" w:type="dxa"/>
+              <w:left w:w="70" w:type="dxa"/>
+              <w:right w:w="50" w:type="dxa"/>
             </w:tcMar>
             <w:shd w:fill="FFFFFF"/>
             <w:vAlign w:val="center"/>
@@ -821,7 +1560,34 @@
                 <w:rFonts w:ascii="Liberation Sans" w:hAnsi="Liberation Sans"/>
                 <w:b w:val="0"/>
                 <w:color w:val="172E46"/>
-                <w:sz w:val="14"/>
+                <w:sz w:val="20"/>
+              </w:rPr>
+              <w:t>Machine Learning</w:t>
+            </w:r>
+          </w:p>
+        </w:tc>
+        <w:tc>
+          <w:tcPr>
+            <w:tcW w:type="dxa" w:w="852"/>
+            <w:tcMar>
+              <w:top w:w="180" w:type="dxa"/>
+              <w:bottom w:w="180" w:type="dxa"/>
+              <w:left w:w="70" w:type="dxa"/>
+              <w:right w:w="50" w:type="dxa"/>
+            </w:tcMar>
+            <w:shd w:fill="FFFFFF"/>
+            <w:vAlign w:val="center"/>
+          </w:tcPr>
+          <w:p>
+            <w:pPr>
+              <w:jc w:val="center"/>
+            </w:pPr>
+            <w:r>
+              <w:rPr>
+                <w:rFonts w:ascii="Liberation Sans" w:hAnsi="Liberation Sans"/>
+                <w:b w:val="0"/>
+                <w:color w:val="172E46"/>
+                <w:sz w:val="20"/>
               </w:rPr>
               <w:t>ETH</w:t>
             </w:r>
@@ -829,12 +1595,12 @@
         </w:tc>
         <w:tc>
           <w:tcPr>
-            <w:tcW w:type="dxa" w:w="1368"/>
+            <w:tcW w:type="dxa" w:w="1490"/>
             <w:tcMar>
-              <w:top w:w="60" w:type="dxa"/>
-              <w:bottom w:w="60" w:type="dxa"/>
-              <w:left w:w="40" w:type="dxa"/>
-              <w:right w:w="40" w:type="dxa"/>
+              <w:top w:w="180" w:type="dxa"/>
+              <w:bottom w:w="180" w:type="dxa"/>
+              <w:left w:w="70" w:type="dxa"/>
+              <w:right w:w="50" w:type="dxa"/>
             </w:tcMar>
             <w:shd w:fill="FFFFFF"/>
             <w:vAlign w:val="center"/>
@@ -845,20 +1611,112 @@
                 <w:rFonts w:ascii="Liberation Sans" w:hAnsi="Liberation Sans"/>
                 <w:b w:val="0"/>
                 <w:color w:val="172E46"/>
-                <w:sz w:val="12"/>
+                <w:sz w:val="16"/>
               </w:rPr>
-              <w:t>VL2026270106999</w:t>
+              <w:t>VL2026270106068</w:t>
             </w:r>
           </w:p>
         </w:tc>
         <w:tc>
           <w:tcPr>
-            <w:tcW w:type="dxa" w:w="792"/>
+            <w:tcW w:type="dxa" w:w="923"/>
             <w:tcMar>
-              <w:top w:w="60" w:type="dxa"/>
-              <w:bottom w:w="60" w:type="dxa"/>
-              <w:left w:w="40" w:type="dxa"/>
-              <w:right w:w="40" w:type="dxa"/>
+              <w:top w:w="180" w:type="dxa"/>
+              <w:bottom w:w="180" w:type="dxa"/>
+              <w:left w:w="70" w:type="dxa"/>
+              <w:right w:w="50" w:type="dxa"/>
+            </w:tcMar>
+            <w:shd w:fill="FFFFFF"/>
+            <w:vAlign w:val="center"/>
+          </w:tcPr>
+          <w:p>
+            <w:pPr>
+              <w:jc w:val="center"/>
+            </w:pPr>
+            <w:r>
+              <w:rPr>
+                <w:rFonts w:ascii="Liberation Sans" w:hAnsi="Liberation Sans"/>
+                <w:b w:val="0"/>
+                <w:color w:val="172E46"/>
+                <w:sz w:val="20"/>
+              </w:rPr>
+              <w:t>E1+TE1</w:t>
+            </w:r>
+          </w:p>
+        </w:tc>
+        <w:tc>
+          <w:tcPr>
+            <w:tcW w:type="dxa" w:w="1348"/>
+            <w:tcMar>
+              <w:top w:w="180" w:type="dxa"/>
+              <w:bottom w:w="180" w:type="dxa"/>
+              <w:left w:w="70" w:type="dxa"/>
+              <w:right w:w="50" w:type="dxa"/>
+            </w:tcMar>
+            <w:shd w:fill="FFFFFF"/>
+            <w:vAlign w:val="center"/>
+          </w:tcPr>
+          <w:p>
+            <w:r>
+              <w:rPr>
+                <w:rFonts w:ascii="Liberation Sans" w:hAnsi="Liberation Sans"/>
+                <w:b/>
+                <w:color w:val="172E46"/>
+                <w:sz w:val="20"/>
+              </w:rPr>
+              <w:t>23-Nov-2026</w:t>
+            </w:r>
+          </w:p>
+          <w:p>
+            <w:pPr>
+              <w:spacing w:before="40"/>
+            </w:pPr>
+            <w:r>
+              <w:rPr>
+                <w:rFonts w:ascii="Liberation Sans" w:hAnsi="Liberation Sans"/>
+                <w:b w:val="0"/>
+                <w:color w:val="526579"/>
+                <w:sz w:val="16"/>
+              </w:rPr>
+              <w:t>Mon</w:t>
+            </w:r>
+          </w:p>
+        </w:tc>
+        <w:tc>
+          <w:tcPr>
+            <w:tcW w:type="dxa" w:w="994"/>
+            <w:tcMar>
+              <w:top w:w="180" w:type="dxa"/>
+              <w:bottom w:w="180" w:type="dxa"/>
+              <w:left w:w="70" w:type="dxa"/>
+              <w:right w:w="50" w:type="dxa"/>
+            </w:tcMar>
+            <w:shd w:fill="FFFFFF"/>
+            <w:vAlign w:val="center"/>
+          </w:tcPr>
+          <w:p>
+            <w:pPr>
+              <w:jc w:val="center"/>
+            </w:pPr>
+            <w:r>
+              <w:rPr>
+                <w:rFonts w:ascii="Liberation Sans" w:hAnsi="Liberation Sans"/>
+                <w:b w:val="0"/>
+                <w:color w:val="172E46"/>
+                <w:sz w:val="20"/>
+              </w:rPr>
+              <w:t>FN1</w:t>
+            </w:r>
+          </w:p>
+        </w:tc>
+        <w:tc>
+          <w:tcPr>
+            <w:tcW w:type="dxa" w:w="1206"/>
+            <w:tcMar>
+              <w:top w:w="180" w:type="dxa"/>
+              <w:bottom w:w="180" w:type="dxa"/>
+              <w:left w:w="70" w:type="dxa"/>
+              <w:right w:w="50" w:type="dxa"/>
             </w:tcMar>
             <w:shd w:fill="FFFFFF"/>
             <w:vAlign w:val="center"/>
@@ -869,20 +1727,20 @@
                 <w:rFonts w:ascii="Liberation Sans" w:hAnsi="Liberation Sans"/>
                 <w:b w:val="0"/>
                 <w:color w:val="172E46"/>
-                <w:sz w:val="14"/>
+                <w:sz w:val="20"/>
               </w:rPr>
-              <w:t>B1+TB1</w:t>
+              <w:t>08:45 AM</w:t>
             </w:r>
           </w:p>
         </w:tc>
         <w:tc>
           <w:tcPr>
-            <w:tcW w:type="dxa" w:w="1080"/>
+            <w:tcW w:type="dxa" w:w="1632"/>
             <w:tcMar>
-              <w:top w:w="60" w:type="dxa"/>
-              <w:bottom w:w="60" w:type="dxa"/>
-              <w:left w:w="40" w:type="dxa"/>
-              <w:right w:w="40" w:type="dxa"/>
+              <w:top w:w="180" w:type="dxa"/>
+              <w:bottom w:w="180" w:type="dxa"/>
+              <w:left w:w="70" w:type="dxa"/>
+              <w:right w:w="50" w:type="dxa"/>
             </w:tcMar>
             <w:shd w:fill="FFFFFF"/>
             <w:vAlign w:val="center"/>
@@ -893,39 +1751,509 @@
                 <w:rFonts w:ascii="Liberation Sans" w:hAnsi="Liberation Sans"/>
                 <w:b/>
                 <w:color w:val="172E46"/>
-                <w:sz w:val="14"/>
+                <w:sz w:val="20"/>
               </w:rPr>
-              <w:t>14-Nov-2026</w:t>
+              <w:t>09:30 AM - 12:30 PM</w:t>
             </w:r>
+          </w:p>
+        </w:tc>
+        <w:tc>
+          <w:tcPr>
+            <w:tcW w:type="dxa" w:w="781"/>
+            <w:tcMar>
+              <w:top w:w="180" w:type="dxa"/>
+              <w:bottom w:w="180" w:type="dxa"/>
+              <w:left w:w="70" w:type="dxa"/>
+              <w:right w:w="50" w:type="dxa"/>
+            </w:tcMar>
+            <w:shd w:fill="FFFFFF"/>
+            <w:vAlign w:val="center"/>
+          </w:tcPr>
+          <w:p>
+            <w:pPr>
+              <w:jc w:val="center"/>
+            </w:pPr>
+            <w:r>
+              <w:rPr>
+                <w:rFonts w:ascii="Liberation Sans" w:hAnsi="Liberation Sans"/>
+                <w:b w:val="0"/>
+                <w:color w:val="526579"/>
+                <w:sz w:val="20"/>
+              </w:rPr>
+              <w:t>-</w:t>
+            </w:r>
+          </w:p>
+        </w:tc>
+        <w:tc>
+          <w:tcPr>
+            <w:tcW w:type="dxa" w:w="923"/>
+            <w:tcMar>
+              <w:top w:w="180" w:type="dxa"/>
+              <w:bottom w:w="180" w:type="dxa"/>
+              <w:left w:w="70" w:type="dxa"/>
+              <w:right w:w="50" w:type="dxa"/>
+            </w:tcMar>
+            <w:shd w:fill="FFFFFF"/>
+            <w:vAlign w:val="center"/>
+          </w:tcPr>
+          <w:p>
+            <w:pPr>
+              <w:jc w:val="center"/>
+            </w:pPr>
+            <w:r>
+              <w:rPr>
+                <w:rFonts w:ascii="Liberation Sans" w:hAnsi="Liberation Sans"/>
+                <w:b w:val="0"/>
+                <w:color w:val="526579"/>
+                <w:sz w:val="20"/>
+              </w:rPr>
+              <w:t>-</w:t>
+            </w:r>
+          </w:p>
+        </w:tc>
+        <w:tc>
+          <w:tcPr>
+            <w:tcW w:type="dxa" w:w="781"/>
+            <w:tcMar>
+              <w:top w:w="180" w:type="dxa"/>
+              <w:bottom w:w="180" w:type="dxa"/>
+              <w:left w:w="70" w:type="dxa"/>
+              <w:right w:w="50" w:type="dxa"/>
+            </w:tcMar>
+            <w:shd w:fill="FFFFFF"/>
+            <w:vAlign w:val="center"/>
+          </w:tcPr>
+          <w:p>
+            <w:pPr>
+              <w:jc w:val="center"/>
+            </w:pPr>
+            <w:r>
+              <w:rPr>
+                <w:rFonts w:ascii="Liberation Sans" w:hAnsi="Liberation Sans"/>
+                <w:b w:val="0"/>
+                <w:color w:val="526579"/>
+                <w:sz w:val="20"/>
+              </w:rPr>
+              <w:t>-</w:t>
+            </w:r>
+          </w:p>
+        </w:tc>
+      </w:tr>
+      <w:tr>
+        <w:trPr>
+          <w:trHeight w:val="1050" w:hRule="atLeast"/>
+        </w:trPr>
+        <w:tc>
+          <w:tcPr>
+            <w:tcW w:type="dxa" w:w="639"/>
+            <w:tcMar>
+              <w:top w:w="180" w:type="dxa"/>
+              <w:bottom w:w="180" w:type="dxa"/>
+              <w:left w:w="70" w:type="dxa"/>
+              <w:right w:w="50" w:type="dxa"/>
+            </w:tcMar>
+            <w:shd w:fill="E8EFF5"/>
+            <w:vAlign w:val="center"/>
+          </w:tcPr>
+          <w:p>
+            <w:pPr>
+              <w:jc w:val="center"/>
+            </w:pPr>
+            <w:r>
+              <w:rPr>
+                <w:rFonts w:ascii="Liberation Sans" w:hAnsi="Liberation Sans"/>
+                <w:b/>
+                <w:color w:val="172E46"/>
+                <w:sz w:val="22"/>
+              </w:rPr>
+              <w:t>5</w:t>
+            </w:r>
+          </w:p>
+        </w:tc>
+        <w:tc>
+          <w:tcPr>
+            <w:tcW w:type="dxa" w:w="1206"/>
+            <w:tcMar>
+              <w:top w:w="180" w:type="dxa"/>
+              <w:bottom w:w="180" w:type="dxa"/>
+              <w:left w:w="70" w:type="dxa"/>
+              <w:right w:w="50" w:type="dxa"/>
+            </w:tcMar>
+            <w:shd w:fill="E8EFF5"/>
+            <w:vAlign w:val="center"/>
+          </w:tcPr>
+          <w:p>
+            <w:r>
+              <w:rPr>
+                <w:rFonts w:ascii="Liberation Sans" w:hAnsi="Liberation Sans"/>
+                <w:b/>
+                <w:color w:val="172E46"/>
+                <w:sz w:val="20"/>
+              </w:rPr>
+              <w:t>MACSE503</w:t>
+            </w:r>
+          </w:p>
+        </w:tc>
+        <w:tc>
+          <w:tcPr>
+            <w:tcW w:type="dxa" w:w="3052"/>
+            <w:tcMar>
+              <w:top w:w="180" w:type="dxa"/>
+              <w:bottom w:w="180" w:type="dxa"/>
+              <w:left w:w="70" w:type="dxa"/>
+              <w:right w:w="50" w:type="dxa"/>
+            </w:tcMar>
+            <w:shd w:fill="E8EFF5"/>
+            <w:vAlign w:val="center"/>
+          </w:tcPr>
+          <w:p>
             <w:r>
               <w:rPr>
                 <w:rFonts w:ascii="Liberation Sans" w:hAnsi="Liberation Sans"/>
                 <w:b w:val="0"/>
                 <w:color w:val="172E46"/>
-                <w:sz w:val="2"/>
+                <w:sz w:val="20"/>
               </w:rPr>
+              <w:t>Data Engineering</w:t>
             </w:r>
           </w:p>
+        </w:tc>
+        <w:tc>
+          <w:tcPr>
+            <w:tcW w:type="dxa" w:w="852"/>
+            <w:tcMar>
+              <w:top w:w="180" w:type="dxa"/>
+              <w:bottom w:w="180" w:type="dxa"/>
+              <w:left w:w="70" w:type="dxa"/>
+              <w:right w:w="50" w:type="dxa"/>
+            </w:tcMar>
+            <w:shd w:fill="E8EFF5"/>
+            <w:vAlign w:val="center"/>
+          </w:tcPr>
+          <w:p>
+            <w:pPr>
+              <w:jc w:val="center"/>
+            </w:pPr>
+            <w:r>
+              <w:rPr>
+                <w:rFonts w:ascii="Liberation Sans" w:hAnsi="Liberation Sans"/>
+                <w:b w:val="0"/>
+                <w:color w:val="172E46"/>
+                <w:sz w:val="20"/>
+              </w:rPr>
+              <w:t>ETH</w:t>
+            </w:r>
+          </w:p>
+        </w:tc>
+        <w:tc>
+          <w:tcPr>
+            <w:tcW w:type="dxa" w:w="1490"/>
+            <w:tcMar>
+              <w:top w:w="180" w:type="dxa"/>
+              <w:bottom w:w="180" w:type="dxa"/>
+              <w:left w:w="70" w:type="dxa"/>
+              <w:right w:w="50" w:type="dxa"/>
+            </w:tcMar>
+            <w:shd w:fill="E8EFF5"/>
+            <w:vAlign w:val="center"/>
+          </w:tcPr>
           <w:p>
             <w:r>
               <w:rPr>
                 <w:rFonts w:ascii="Liberation Sans" w:hAnsi="Liberation Sans"/>
                 <w:b w:val="0"/>
-                <w:color w:val="526579"/>
-                <w:sz w:val="12"/>
+                <w:color w:val="172E46"/>
+                <w:sz w:val="16"/>
               </w:rPr>
-              <w:t>Sat</w:t>
+              <w:t>VL2026270106818</w:t>
             </w:r>
           </w:p>
         </w:tc>
         <w:tc>
           <w:tcPr>
-            <w:tcW w:type="dxa" w:w="864"/>
+            <w:tcW w:type="dxa" w:w="923"/>
             <w:tcMar>
-              <w:top w:w="60" w:type="dxa"/>
-              <w:bottom w:w="60" w:type="dxa"/>
-              <w:left w:w="40" w:type="dxa"/>
-              <w:right w:w="40" w:type="dxa"/>
+              <w:top w:w="180" w:type="dxa"/>
+              <w:bottom w:w="180" w:type="dxa"/>
+              <w:left w:w="70" w:type="dxa"/>
+              <w:right w:w="50" w:type="dxa"/>
+            </w:tcMar>
+            <w:shd w:fill="E8EFF5"/>
+            <w:vAlign w:val="center"/>
+          </w:tcPr>
+          <w:p>
+            <w:pPr>
+              <w:jc w:val="center"/>
+            </w:pPr>
+            <w:r>
+              <w:rPr>
+                <w:rFonts w:ascii="Liberation Sans" w:hAnsi="Liberation Sans"/>
+                <w:b w:val="0"/>
+                <w:color w:val="172E46"/>
+                <w:sz w:val="20"/>
+              </w:rPr>
+              <w:t>F1+TF1</w:t>
+            </w:r>
+          </w:p>
+        </w:tc>
+        <w:tc>
+          <w:tcPr>
+            <w:tcW w:type="dxa" w:w="1348"/>
+            <w:tcMar>
+              <w:top w:w="180" w:type="dxa"/>
+              <w:bottom w:w="180" w:type="dxa"/>
+              <w:left w:w="70" w:type="dxa"/>
+              <w:right w:w="50" w:type="dxa"/>
+            </w:tcMar>
+            <w:shd w:fill="E8EFF5"/>
+            <w:vAlign w:val="center"/>
+          </w:tcPr>
+          <w:p>
+            <w:r>
+              <w:rPr>
+                <w:rFonts w:ascii="Liberation Sans" w:hAnsi="Liberation Sans"/>
+                <w:b/>
+                <w:color w:val="172E46"/>
+                <w:sz w:val="20"/>
+              </w:rPr>
+              <w:t>25-Nov-2026</w:t>
+            </w:r>
+          </w:p>
+          <w:p>
+            <w:pPr>
+              <w:spacing w:before="40"/>
+            </w:pPr>
+            <w:r>
+              <w:rPr>
+                <w:rFonts w:ascii="Liberation Sans" w:hAnsi="Liberation Sans"/>
+                <w:b w:val="0"/>
+                <w:color w:val="526579"/>
+                <w:sz w:val="16"/>
+              </w:rPr>
+              <w:t>Wed</w:t>
+            </w:r>
+          </w:p>
+        </w:tc>
+        <w:tc>
+          <w:tcPr>
+            <w:tcW w:type="dxa" w:w="994"/>
+            <w:tcMar>
+              <w:top w:w="180" w:type="dxa"/>
+              <w:bottom w:w="180" w:type="dxa"/>
+              <w:left w:w="70" w:type="dxa"/>
+              <w:right w:w="50" w:type="dxa"/>
+            </w:tcMar>
+            <w:shd w:fill="E8EFF5"/>
+            <w:vAlign w:val="center"/>
+          </w:tcPr>
+          <w:p>
+            <w:pPr>
+              <w:jc w:val="center"/>
+            </w:pPr>
+            <w:r>
+              <w:rPr>
+                <w:rFonts w:ascii="Liberation Sans" w:hAnsi="Liberation Sans"/>
+                <w:b w:val="0"/>
+                <w:color w:val="172E46"/>
+                <w:sz w:val="20"/>
+              </w:rPr>
+              <w:t>FN1</w:t>
+            </w:r>
+          </w:p>
+        </w:tc>
+        <w:tc>
+          <w:tcPr>
+            <w:tcW w:type="dxa" w:w="1206"/>
+            <w:tcMar>
+              <w:top w:w="180" w:type="dxa"/>
+              <w:bottom w:w="180" w:type="dxa"/>
+              <w:left w:w="70" w:type="dxa"/>
+              <w:right w:w="50" w:type="dxa"/>
+            </w:tcMar>
+            <w:shd w:fill="E8EFF5"/>
+            <w:vAlign w:val="center"/>
+          </w:tcPr>
+          <w:p>
+            <w:r>
+              <w:rPr>
+                <w:rFonts w:ascii="Liberation Sans" w:hAnsi="Liberation Sans"/>
+                <w:b w:val="0"/>
+                <w:color w:val="172E46"/>
+                <w:sz w:val="20"/>
+              </w:rPr>
+              <w:t>08:45 AM</w:t>
+            </w:r>
+          </w:p>
+        </w:tc>
+        <w:tc>
+          <w:tcPr>
+            <w:tcW w:type="dxa" w:w="1632"/>
+            <w:tcMar>
+              <w:top w:w="180" w:type="dxa"/>
+              <w:bottom w:w="180" w:type="dxa"/>
+              <w:left w:w="70" w:type="dxa"/>
+              <w:right w:w="50" w:type="dxa"/>
+            </w:tcMar>
+            <w:shd w:fill="E8EFF5"/>
+            <w:vAlign w:val="center"/>
+          </w:tcPr>
+          <w:p>
+            <w:r>
+              <w:rPr>
+                <w:rFonts w:ascii="Liberation Sans" w:hAnsi="Liberation Sans"/>
+                <w:b/>
+                <w:color w:val="172E46"/>
+                <w:sz w:val="20"/>
+              </w:rPr>
+              <w:t>09:30 AM - 12:30 PM</w:t>
+            </w:r>
+          </w:p>
+        </w:tc>
+        <w:tc>
+          <w:tcPr>
+            <w:tcW w:type="dxa" w:w="781"/>
+            <w:tcMar>
+              <w:top w:w="180" w:type="dxa"/>
+              <w:bottom w:w="180" w:type="dxa"/>
+              <w:left w:w="70" w:type="dxa"/>
+              <w:right w:w="50" w:type="dxa"/>
+            </w:tcMar>
+            <w:shd w:fill="E8EFF5"/>
+            <w:vAlign w:val="center"/>
+          </w:tcPr>
+          <w:p>
+            <w:pPr>
+              <w:jc w:val="center"/>
+            </w:pPr>
+            <w:r>
+              <w:rPr>
+                <w:rFonts w:ascii="Liberation Sans" w:hAnsi="Liberation Sans"/>
+                <w:b w:val="0"/>
+                <w:color w:val="526579"/>
+                <w:sz w:val="20"/>
+              </w:rPr>
+              <w:t>-</w:t>
+            </w:r>
+          </w:p>
+        </w:tc>
+        <w:tc>
+          <w:tcPr>
+            <w:tcW w:type="dxa" w:w="923"/>
+            <w:tcMar>
+              <w:top w:w="180" w:type="dxa"/>
+              <w:bottom w:w="180" w:type="dxa"/>
+              <w:left w:w="70" w:type="dxa"/>
+              <w:right w:w="50" w:type="dxa"/>
+            </w:tcMar>
+            <w:shd w:fill="E8EFF5"/>
+            <w:vAlign w:val="center"/>
+          </w:tcPr>
+          <w:p>
+            <w:pPr>
+              <w:jc w:val="center"/>
+            </w:pPr>
+            <w:r>
+              <w:rPr>
+                <w:rFonts w:ascii="Liberation Sans" w:hAnsi="Liberation Sans"/>
+                <w:b w:val="0"/>
+                <w:color w:val="526579"/>
+                <w:sz w:val="20"/>
+              </w:rPr>
+              <w:t>-</w:t>
+            </w:r>
+          </w:p>
+        </w:tc>
+        <w:tc>
+          <w:tcPr>
+            <w:tcW w:type="dxa" w:w="781"/>
+            <w:tcMar>
+              <w:top w:w="180" w:type="dxa"/>
+              <w:bottom w:w="180" w:type="dxa"/>
+              <w:left w:w="70" w:type="dxa"/>
+              <w:right w:w="50" w:type="dxa"/>
+            </w:tcMar>
+            <w:shd w:fill="E8EFF5"/>
+            <w:vAlign w:val="center"/>
+          </w:tcPr>
+          <w:p>
+            <w:pPr>
+              <w:jc w:val="center"/>
+            </w:pPr>
+            <w:r>
+              <w:rPr>
+                <w:rFonts w:ascii="Liberation Sans" w:hAnsi="Liberation Sans"/>
+                <w:b w:val="0"/>
+                <w:color w:val="526579"/>
+                <w:sz w:val="20"/>
+              </w:rPr>
+              <w:t>-</w:t>
+            </w:r>
+          </w:p>
+        </w:tc>
+      </w:tr>
+      <w:tr>
+        <w:trPr>
+          <w:trHeight w:val="1050" w:hRule="atLeast"/>
+        </w:trPr>
+        <w:tc>
+          <w:tcPr>
+            <w:tcW w:type="dxa" w:w="639"/>
+            <w:tcMar>
+              <w:top w:w="180" w:type="dxa"/>
+              <w:bottom w:w="180" w:type="dxa"/>
+              <w:left w:w="70" w:type="dxa"/>
+              <w:right w:w="50" w:type="dxa"/>
+            </w:tcMar>
+            <w:shd w:fill="FFFFFF"/>
+            <w:vAlign w:val="center"/>
+          </w:tcPr>
+          <w:p>
+            <w:pPr>
+              <w:jc w:val="center"/>
+            </w:pPr>
+            <w:r>
+              <w:rPr>
+                <w:rFonts w:ascii="Liberation Sans" w:hAnsi="Liberation Sans"/>
+                <w:b/>
+                <w:color w:val="172E46"/>
+                <w:sz w:val="22"/>
+              </w:rPr>
+              <w:t>6</w:t>
+            </w:r>
+          </w:p>
+        </w:tc>
+        <w:tc>
+          <w:tcPr>
+            <w:tcW w:type="dxa" w:w="1206"/>
+            <w:tcMar>
+              <w:top w:w="180" w:type="dxa"/>
+              <w:bottom w:w="180" w:type="dxa"/>
+              <w:left w:w="70" w:type="dxa"/>
+              <w:right w:w="50" w:type="dxa"/>
+            </w:tcMar>
+            <w:shd w:fill="FFFFFF"/>
+            <w:vAlign w:val="center"/>
+          </w:tcPr>
+          <w:p>
+            <w:r>
+              <w:rPr>
+                <w:rFonts w:ascii="Liberation Sans" w:hAnsi="Liberation Sans"/>
+                <w:b/>
+                <w:color w:val="172E46"/>
+                <w:sz w:val="20"/>
+              </w:rPr>
+              <w:t>MASTS601</w:t>
+            </w:r>
+          </w:p>
+        </w:tc>
+        <w:tc>
+          <w:tcPr>
+            <w:tcW w:type="dxa" w:w="3052"/>
+            <w:tcMar>
+              <w:top w:w="180" w:type="dxa"/>
+              <w:bottom w:w="180" w:type="dxa"/>
+              <w:left w:w="70" w:type="dxa"/>
+              <w:right w:w="50" w:type="dxa"/>
             </w:tcMar>
             <w:shd w:fill="FFFFFF"/>
             <w:vAlign w:val="center"/>
@@ -936,20 +2264,47 @@
                 <w:rFonts w:ascii="Liberation Sans" w:hAnsi="Liberation Sans"/>
                 <w:b w:val="0"/>
                 <w:color w:val="172E46"/>
-                <w:sz w:val="14"/>
+                <w:sz w:val="20"/>
               </w:rPr>
-              <w:t>FN1</w:t>
+              <w:t>Competitive Coding I</w:t>
             </w:r>
           </w:p>
         </w:tc>
         <w:tc>
           <w:tcPr>
-            <w:tcW w:type="dxa" w:w="1008"/>
+            <w:tcW w:type="dxa" w:w="852"/>
             <w:tcMar>
-              <w:top w:w="60" w:type="dxa"/>
-              <w:bottom w:w="60" w:type="dxa"/>
-              <w:left w:w="40" w:type="dxa"/>
-              <w:right w:w="40" w:type="dxa"/>
+              <w:top w:w="180" w:type="dxa"/>
+              <w:bottom w:w="180" w:type="dxa"/>
+              <w:left w:w="70" w:type="dxa"/>
+              <w:right w:w="50" w:type="dxa"/>
+            </w:tcMar>
+            <w:shd w:fill="FFFFFF"/>
+            <w:vAlign w:val="center"/>
+          </w:tcPr>
+          <w:p>
+            <w:pPr>
+              <w:jc w:val="center"/>
+            </w:pPr>
+            <w:r>
+              <w:rPr>
+                <w:rFonts w:ascii="Liberation Sans" w:hAnsi="Liberation Sans"/>
+                <w:b w:val="0"/>
+                <w:color w:val="172E46"/>
+                <w:sz w:val="20"/>
+              </w:rPr>
+              <w:t>SS</w:t>
+            </w:r>
+          </w:p>
+        </w:tc>
+        <w:tc>
+          <w:tcPr>
+            <w:tcW w:type="dxa" w:w="1490"/>
+            <w:tcMar>
+              <w:top w:w="180" w:type="dxa"/>
+              <w:bottom w:w="180" w:type="dxa"/>
+              <w:left w:w="70" w:type="dxa"/>
+              <w:right w:w="50" w:type="dxa"/>
             </w:tcMar>
             <w:shd w:fill="FFFFFF"/>
             <w:vAlign w:val="center"/>
@@ -960,20 +2315,47 @@
                 <w:rFonts w:ascii="Liberation Sans" w:hAnsi="Liberation Sans"/>
                 <w:b w:val="0"/>
                 <w:color w:val="172E46"/>
-                <w:sz w:val="14"/>
+                <w:sz w:val="16"/>
               </w:rPr>
-              <w:t>08:45 AM</w:t>
+              <w:t>VL2026270104814</w:t>
             </w:r>
           </w:p>
         </w:tc>
         <w:tc>
           <w:tcPr>
-            <w:tcW w:type="dxa" w:w="1368"/>
+            <w:tcW w:type="dxa" w:w="923"/>
             <w:tcMar>
-              <w:top w:w="60" w:type="dxa"/>
-              <w:bottom w:w="60" w:type="dxa"/>
-              <w:left w:w="40" w:type="dxa"/>
-              <w:right w:w="40" w:type="dxa"/>
+              <w:top w:w="180" w:type="dxa"/>
+              <w:bottom w:w="180" w:type="dxa"/>
+              <w:left w:w="70" w:type="dxa"/>
+              <w:right w:w="50" w:type="dxa"/>
+            </w:tcMar>
+            <w:shd w:fill="FFFFFF"/>
+            <w:vAlign w:val="center"/>
+          </w:tcPr>
+          <w:p>
+            <w:pPr>
+              <w:jc w:val="center"/>
+            </w:pPr>
+            <w:r>
+              <w:rPr>
+                <w:rFonts w:ascii="Liberation Sans" w:hAnsi="Liberation Sans"/>
+                <w:b w:val="0"/>
+                <w:color w:val="172E46"/>
+                <w:sz w:val="20"/>
+              </w:rPr>
+              <w:t>G1+TG1</w:t>
+            </w:r>
+          </w:p>
+        </w:tc>
+        <w:tc>
+          <w:tcPr>
+            <w:tcW w:type="dxa" w:w="1348"/>
+            <w:tcMar>
+              <w:top w:w="180" w:type="dxa"/>
+              <w:bottom w:w="180" w:type="dxa"/>
+              <w:left w:w="70" w:type="dxa"/>
+              <w:right w:w="50" w:type="dxa"/>
             </w:tcMar>
             <w:shd w:fill="FFFFFF"/>
             <w:vAlign w:val="center"/>
@@ -984,20 +2366,61 @@
                 <w:rFonts w:ascii="Liberation Sans" w:hAnsi="Liberation Sans"/>
                 <w:b/>
                 <w:color w:val="172E46"/>
-                <w:sz w:val="14"/>
+                <w:sz w:val="20"/>
               </w:rPr>
-              <w:t>09:30 AM - 12:30 PM</w:t>
+              <w:t>27-Nov-2026</w:t>
+            </w:r>
+          </w:p>
+          <w:p>
+            <w:pPr>
+              <w:spacing w:before="40"/>
+            </w:pPr>
+            <w:r>
+              <w:rPr>
+                <w:rFonts w:ascii="Liberation Sans" w:hAnsi="Liberation Sans"/>
+                <w:b w:val="0"/>
+                <w:color w:val="526579"/>
+                <w:sz w:val="16"/>
+              </w:rPr>
+              <w:t>Fri</w:t>
             </w:r>
           </w:p>
         </w:tc>
         <w:tc>
           <w:tcPr>
-            <w:tcW w:type="dxa" w:w="648"/>
+            <w:tcW w:type="dxa" w:w="994"/>
             <w:tcMar>
-              <w:top w:w="60" w:type="dxa"/>
-              <w:bottom w:w="60" w:type="dxa"/>
-              <w:left w:w="40" w:type="dxa"/>
-              <w:right w:w="40" w:type="dxa"/>
+              <w:top w:w="180" w:type="dxa"/>
+              <w:bottom w:w="180" w:type="dxa"/>
+              <w:left w:w="70" w:type="dxa"/>
+              <w:right w:w="50" w:type="dxa"/>
+            </w:tcMar>
+            <w:shd w:fill="FFFFFF"/>
+            <w:vAlign w:val="center"/>
+          </w:tcPr>
+          <w:p>
+            <w:pPr>
+              <w:jc w:val="center"/>
+            </w:pPr>
+            <w:r>
+              <w:rPr>
+                <w:rFonts w:ascii="Liberation Sans" w:hAnsi="Liberation Sans"/>
+                <w:b w:val="0"/>
+                <w:color w:val="172E46"/>
+                <w:sz w:val="20"/>
+              </w:rPr>
+              <w:t>FN3</w:t>
+            </w:r>
+          </w:p>
+        </w:tc>
+        <w:tc>
+          <w:tcPr>
+            <w:tcW w:type="dxa" w:w="1206"/>
+            <w:tcMar>
+              <w:top w:w="180" w:type="dxa"/>
+              <w:bottom w:w="180" w:type="dxa"/>
+              <w:left w:w="70" w:type="dxa"/>
+              <w:right w:w="50" w:type="dxa"/>
             </w:tcMar>
             <w:shd w:fill="FFFFFF"/>
             <w:vAlign w:val="center"/>
@@ -1007,410 +2430,21 @@
               <w:rPr>
                 <w:rFonts w:ascii="Liberation Sans" w:hAnsi="Liberation Sans"/>
                 <w:b w:val="0"/>
-                <w:color w:val="526579"/>
-                <w:sz w:val="14"/>
+                <w:color w:val="172E46"/>
+                <w:sz w:val="20"/>
               </w:rPr>
-              <w:t>-</w:t>
+              <w:t>10:30 AM</w:t>
             </w:r>
           </w:p>
         </w:tc>
         <w:tc>
           <w:tcPr>
-            <w:tcW w:type="dxa" w:w="792"/>
+            <w:tcW w:type="dxa" w:w="1632"/>
             <w:tcMar>
-              <w:top w:w="60" w:type="dxa"/>
-              <w:bottom w:w="60" w:type="dxa"/>
-              <w:left w:w="40" w:type="dxa"/>
-              <w:right w:w="40" w:type="dxa"/>
-            </w:tcMar>
-            <w:shd w:fill="FFFFFF"/>
-            <w:vAlign w:val="center"/>
-          </w:tcPr>
-          <w:p>
-            <w:r>
-              <w:rPr>
-                <w:rFonts w:ascii="Liberation Sans" w:hAnsi="Liberation Sans"/>
-                <w:b w:val="0"/>
-                <w:color w:val="526579"/>
-                <w:sz w:val="14"/>
-              </w:rPr>
-              <w:t>-</w:t>
-            </w:r>
-          </w:p>
-        </w:tc>
-        <w:tc>
-          <w:tcPr>
-            <w:tcW w:type="dxa" w:w="648"/>
-            <w:tcMar>
-              <w:top w:w="60" w:type="dxa"/>
-              <w:bottom w:w="60" w:type="dxa"/>
-              <w:left w:w="40" w:type="dxa"/>
-              <w:right w:w="40" w:type="dxa"/>
-            </w:tcMar>
-            <w:shd w:fill="FFFFFF"/>
-            <w:vAlign w:val="center"/>
-          </w:tcPr>
-          <w:p>
-            <w:r>
-              <w:rPr>
-                <w:rFonts w:ascii="Liberation Sans" w:hAnsi="Liberation Sans"/>
-                <w:b w:val="0"/>
-                <w:color w:val="526579"/>
-                <w:sz w:val="14"/>
-              </w:rPr>
-              <w:t>-</w:t>
-            </w:r>
-          </w:p>
-        </w:tc>
-      </w:tr>
-      <w:tr>
-        <w:trPr>
-          <w:cantSplit/>
-        </w:trPr>
-        <w:tc>
-          <w:tcPr>
-            <w:tcW w:type="dxa" w:w="504"/>
-            <w:tcMar>
-              <w:top w:w="60" w:type="dxa"/>
-              <w:bottom w:w="60" w:type="dxa"/>
-              <w:left w:w="40" w:type="dxa"/>
-              <w:right w:w="40" w:type="dxa"/>
-            </w:tcMar>
-            <w:shd w:fill="F0F5F8"/>
-            <w:vAlign w:val="center"/>
-          </w:tcPr>
-          <w:p>
-            <w:r>
-              <w:rPr>
-                <w:rFonts w:ascii="Liberation Sans" w:hAnsi="Liberation Sans"/>
-                <w:b/>
-                <w:color w:val="172E46"/>
-                <w:sz w:val="14"/>
-              </w:rPr>
-              <w:t>3</w:t>
-            </w:r>
-          </w:p>
-        </w:tc>
-        <w:tc>
-          <w:tcPr>
-            <w:tcW w:type="dxa" w:w="1080"/>
-            <w:tcMar>
-              <w:top w:w="60" w:type="dxa"/>
-              <w:bottom w:w="60" w:type="dxa"/>
-              <w:left w:w="40" w:type="dxa"/>
-              <w:right w:w="40" w:type="dxa"/>
-            </w:tcMar>
-            <w:shd w:fill="F0F5F8"/>
-            <w:vAlign w:val="center"/>
-          </w:tcPr>
-          <w:p>
-            <w:r>
-              <w:rPr>
-                <w:rFonts w:ascii="Liberation Sans" w:hAnsi="Liberation Sans"/>
-                <w:b/>
-                <w:color w:val="172E46"/>
-                <w:sz w:val="14"/>
-              </w:rPr>
-              <w:t>MAMAT500</w:t>
-            </w:r>
-          </w:p>
-        </w:tc>
-        <w:tc>
-          <w:tcPr>
-            <w:tcW w:type="dxa" w:w="2664"/>
-            <w:tcMar>
-              <w:top w:w="60" w:type="dxa"/>
-              <w:bottom w:w="60" w:type="dxa"/>
-              <w:left w:w="40" w:type="dxa"/>
-              <w:right w:w="40" w:type="dxa"/>
-            </w:tcMar>
-            <w:shd w:fill="F0F5F8"/>
-            <w:vAlign w:val="center"/>
-          </w:tcPr>
-          <w:p>
-            <w:r>
-              <w:rPr>
-                <w:rFonts w:ascii="Liberation Sans" w:hAnsi="Liberation Sans"/>
-                <w:b w:val="0"/>
-                <w:color w:val="172E46"/>
-                <w:sz w:val="14"/>
-              </w:rPr>
-              <w:t>Applied Statistics</w:t>
-            </w:r>
-          </w:p>
-        </w:tc>
-        <w:tc>
-          <w:tcPr>
-            <w:tcW w:type="dxa" w:w="792"/>
-            <w:tcMar>
-              <w:top w:w="60" w:type="dxa"/>
-              <w:bottom w:w="60" w:type="dxa"/>
-              <w:left w:w="40" w:type="dxa"/>
-              <w:right w:w="40" w:type="dxa"/>
-            </w:tcMar>
-            <w:shd w:fill="F0F5F8"/>
-            <w:vAlign w:val="center"/>
-          </w:tcPr>
-          <w:p>
-            <w:r>
-              <w:rPr>
-                <w:rFonts w:ascii="Liberation Sans" w:hAnsi="Liberation Sans"/>
-                <w:b w:val="0"/>
-                <w:color w:val="172E46"/>
-                <w:sz w:val="14"/>
-              </w:rPr>
-              <w:t>TH</w:t>
-            </w:r>
-          </w:p>
-        </w:tc>
-        <w:tc>
-          <w:tcPr>
-            <w:tcW w:type="dxa" w:w="1368"/>
-            <w:tcMar>
-              <w:top w:w="60" w:type="dxa"/>
-              <w:bottom w:w="60" w:type="dxa"/>
-              <w:left w:w="40" w:type="dxa"/>
-              <w:right w:w="40" w:type="dxa"/>
-            </w:tcMar>
-            <w:shd w:fill="F0F5F8"/>
-            <w:vAlign w:val="center"/>
-          </w:tcPr>
-          <w:p>
-            <w:r>
-              <w:rPr>
-                <w:rFonts w:ascii="Liberation Sans" w:hAnsi="Liberation Sans"/>
-                <w:b w:val="0"/>
-                <w:color w:val="172E46"/>
-                <w:sz w:val="12"/>
-              </w:rPr>
-              <w:t>VL2026270105581</w:t>
-            </w:r>
-          </w:p>
-        </w:tc>
-        <w:tc>
-          <w:tcPr>
-            <w:tcW w:type="dxa" w:w="792"/>
-            <w:tcMar>
-              <w:top w:w="60" w:type="dxa"/>
-              <w:bottom w:w="60" w:type="dxa"/>
-              <w:left w:w="40" w:type="dxa"/>
-              <w:right w:w="40" w:type="dxa"/>
-            </w:tcMar>
-            <w:shd w:fill="F0F5F8"/>
-            <w:vAlign w:val="center"/>
-          </w:tcPr>
-          <w:p>
-            <w:r>
-              <w:rPr>
-                <w:rFonts w:ascii="Liberation Sans" w:hAnsi="Liberation Sans"/>
-                <w:b w:val="0"/>
-                <w:color w:val="172E46"/>
-                <w:sz w:val="14"/>
-              </w:rPr>
-              <w:t>D1+TD1</w:t>
-            </w:r>
-          </w:p>
-        </w:tc>
-        <w:tc>
-          <w:tcPr>
-            <w:tcW w:type="dxa" w:w="1080"/>
-            <w:tcMar>
-              <w:top w:w="60" w:type="dxa"/>
-              <w:bottom w:w="60" w:type="dxa"/>
-              <w:left w:w="40" w:type="dxa"/>
-              <w:right w:w="40" w:type="dxa"/>
-            </w:tcMar>
-            <w:shd w:fill="F0F5F8"/>
-            <w:vAlign w:val="center"/>
-          </w:tcPr>
-          <w:p>
-            <w:r>
-              <w:rPr>
-                <w:rFonts w:ascii="Liberation Sans" w:hAnsi="Liberation Sans"/>
-                <w:b/>
-                <w:color w:val="172E46"/>
-                <w:sz w:val="14"/>
-              </w:rPr>
-              <w:t>19-Nov-2026</w:t>
-            </w:r>
-            <w:r>
-              <w:rPr>
-                <w:rFonts w:ascii="Liberation Sans" w:hAnsi="Liberation Sans"/>
-                <w:b w:val="0"/>
-                <w:color w:val="172E46"/>
-                <w:sz w:val="2"/>
-              </w:rPr>
-            </w:r>
-          </w:p>
-          <w:p>
-            <w:r>
-              <w:rPr>
-                <w:rFonts w:ascii="Liberation Sans" w:hAnsi="Liberation Sans"/>
-                <w:b w:val="0"/>
-                <w:color w:val="526579"/>
-                <w:sz w:val="12"/>
-              </w:rPr>
-              <w:t>Thu</w:t>
-            </w:r>
-          </w:p>
-        </w:tc>
-        <w:tc>
-          <w:tcPr>
-            <w:tcW w:type="dxa" w:w="864"/>
-            <w:tcMar>
-              <w:top w:w="60" w:type="dxa"/>
-              <w:bottom w:w="60" w:type="dxa"/>
-              <w:left w:w="40" w:type="dxa"/>
-              <w:right w:w="40" w:type="dxa"/>
-            </w:tcMar>
-            <w:shd w:fill="F0F5F8"/>
-            <w:vAlign w:val="center"/>
-          </w:tcPr>
-          <w:p>
-            <w:r>
-              <w:rPr>
-                <w:rFonts w:ascii="Liberation Sans" w:hAnsi="Liberation Sans"/>
-                <w:b w:val="0"/>
-                <w:color w:val="172E46"/>
-                <w:sz w:val="14"/>
-              </w:rPr>
-              <w:t>FN1</w:t>
-            </w:r>
-          </w:p>
-        </w:tc>
-        <w:tc>
-          <w:tcPr>
-            <w:tcW w:type="dxa" w:w="1008"/>
-            <w:tcMar>
-              <w:top w:w="60" w:type="dxa"/>
-              <w:bottom w:w="60" w:type="dxa"/>
-              <w:left w:w="40" w:type="dxa"/>
-              <w:right w:w="40" w:type="dxa"/>
-            </w:tcMar>
-            <w:shd w:fill="F0F5F8"/>
-            <w:vAlign w:val="center"/>
-          </w:tcPr>
-          <w:p>
-            <w:r>
-              <w:rPr>
-                <w:rFonts w:ascii="Liberation Sans" w:hAnsi="Liberation Sans"/>
-                <w:b w:val="0"/>
-                <w:color w:val="172E46"/>
-                <w:sz w:val="14"/>
-              </w:rPr>
-              <w:t>08:45 AM</w:t>
-            </w:r>
-          </w:p>
-        </w:tc>
-        <w:tc>
-          <w:tcPr>
-            <w:tcW w:type="dxa" w:w="1368"/>
-            <w:tcMar>
-              <w:top w:w="60" w:type="dxa"/>
-              <w:bottom w:w="60" w:type="dxa"/>
-              <w:left w:w="40" w:type="dxa"/>
-              <w:right w:w="40" w:type="dxa"/>
-            </w:tcMar>
-            <w:shd w:fill="F0F5F8"/>
-            <w:vAlign w:val="center"/>
-          </w:tcPr>
-          <w:p>
-            <w:r>
-              <w:rPr>
-                <w:rFonts w:ascii="Liberation Sans" w:hAnsi="Liberation Sans"/>
-                <w:b/>
-                <w:color w:val="172E46"/>
-                <w:sz w:val="14"/>
-              </w:rPr>
-              <w:t>09:30 AM - 12:30 PM</w:t>
-            </w:r>
-          </w:p>
-        </w:tc>
-        <w:tc>
-          <w:tcPr>
-            <w:tcW w:type="dxa" w:w="648"/>
-            <w:tcMar>
-              <w:top w:w="60" w:type="dxa"/>
-              <w:bottom w:w="60" w:type="dxa"/>
-              <w:left w:w="40" w:type="dxa"/>
-              <w:right w:w="40" w:type="dxa"/>
-            </w:tcMar>
-            <w:shd w:fill="F0F5F8"/>
-            <w:vAlign w:val="center"/>
-          </w:tcPr>
-          <w:p>
-            <w:r>
-              <w:rPr>
-                <w:rFonts w:ascii="Liberation Sans" w:hAnsi="Liberation Sans"/>
-                <w:b w:val="0"/>
-                <w:color w:val="526579"/>
-                <w:sz w:val="14"/>
-              </w:rPr>
-              <w:t>-</w:t>
-            </w:r>
-          </w:p>
-        </w:tc>
-        <w:tc>
-          <w:tcPr>
-            <w:tcW w:type="dxa" w:w="792"/>
-            <w:tcMar>
-              <w:top w:w="60" w:type="dxa"/>
-              <w:bottom w:w="60" w:type="dxa"/>
-              <w:left w:w="40" w:type="dxa"/>
-              <w:right w:w="40" w:type="dxa"/>
-            </w:tcMar>
-            <w:shd w:fill="F0F5F8"/>
-            <w:vAlign w:val="center"/>
-          </w:tcPr>
-          <w:p>
-            <w:r>
-              <w:rPr>
-                <w:rFonts w:ascii="Liberation Sans" w:hAnsi="Liberation Sans"/>
-                <w:b w:val="0"/>
-                <w:color w:val="526579"/>
-                <w:sz w:val="14"/>
-              </w:rPr>
-              <w:t>-</w:t>
-            </w:r>
-          </w:p>
-        </w:tc>
-        <w:tc>
-          <w:tcPr>
-            <w:tcW w:type="dxa" w:w="648"/>
-            <w:tcMar>
-              <w:top w:w="60" w:type="dxa"/>
-              <w:bottom w:w="60" w:type="dxa"/>
-              <w:left w:w="40" w:type="dxa"/>
-              <w:right w:w="40" w:type="dxa"/>
-            </w:tcMar>
-            <w:shd w:fill="F0F5F8"/>
-            <w:vAlign w:val="center"/>
-          </w:tcPr>
-          <w:p>
-            <w:r>
-              <w:rPr>
-                <w:rFonts w:ascii="Liberation Sans" w:hAnsi="Liberation Sans"/>
-                <w:b w:val="0"/>
-                <w:color w:val="526579"/>
-                <w:sz w:val="14"/>
-              </w:rPr>
-              <w:t>-</w:t>
-            </w:r>
-          </w:p>
-        </w:tc>
-      </w:tr>
-      <w:tr>
-        <w:trPr>
-          <w:cantSplit/>
-        </w:trPr>
-        <w:tc>
-          <w:tcPr>
-            <w:tcW w:type="dxa" w:w="504"/>
-            <w:tcMar>
-              <w:top w:w="60" w:type="dxa"/>
-              <w:bottom w:w="60" w:type="dxa"/>
-              <w:left w:w="40" w:type="dxa"/>
-              <w:right w:w="40" w:type="dxa"/>
+              <w:top w:w="180" w:type="dxa"/>
+              <w:bottom w:w="180" w:type="dxa"/>
+              <w:left w:w="70" w:type="dxa"/>
+              <w:right w:w="50" w:type="dxa"/>
             </w:tcMar>
             <w:shd w:fill="FFFFFF"/>
             <w:vAlign w:val="center"/>
@@ -1421,22 +2455,135 @@
                 <w:rFonts w:ascii="Liberation Sans" w:hAnsi="Liberation Sans"/>
                 <w:b/>
                 <w:color w:val="172E46"/>
-                <w:sz w:val="14"/>
+                <w:sz w:val="20"/>
               </w:rPr>
-              <w:t>4</w:t>
+              <w:t>11:00 AM - 12:30 PM</w:t>
             </w:r>
           </w:p>
         </w:tc>
         <w:tc>
           <w:tcPr>
-            <w:tcW w:type="dxa" w:w="1080"/>
+            <w:tcW w:type="dxa" w:w="781"/>
             <w:tcMar>
-              <w:top w:w="60" w:type="dxa"/>
-              <w:bottom w:w="60" w:type="dxa"/>
-              <w:left w:w="40" w:type="dxa"/>
-              <w:right w:w="40" w:type="dxa"/>
+              <w:top w:w="180" w:type="dxa"/>
+              <w:bottom w:w="180" w:type="dxa"/>
+              <w:left w:w="70" w:type="dxa"/>
+              <w:right w:w="50" w:type="dxa"/>
             </w:tcMar>
             <w:shd w:fill="FFFFFF"/>
+            <w:vAlign w:val="center"/>
+          </w:tcPr>
+          <w:p>
+            <w:pPr>
+              <w:jc w:val="center"/>
+            </w:pPr>
+            <w:r>
+              <w:rPr>
+                <w:rFonts w:ascii="Liberation Sans" w:hAnsi="Liberation Sans"/>
+                <w:b w:val="0"/>
+                <w:color w:val="526579"/>
+                <w:sz w:val="20"/>
+              </w:rPr>
+              <w:t>-</w:t>
+            </w:r>
+          </w:p>
+        </w:tc>
+        <w:tc>
+          <w:tcPr>
+            <w:tcW w:type="dxa" w:w="923"/>
+            <w:tcMar>
+              <w:top w:w="180" w:type="dxa"/>
+              <w:bottom w:w="180" w:type="dxa"/>
+              <w:left w:w="70" w:type="dxa"/>
+              <w:right w:w="50" w:type="dxa"/>
+            </w:tcMar>
+            <w:shd w:fill="FFFFFF"/>
+            <w:vAlign w:val="center"/>
+          </w:tcPr>
+          <w:p>
+            <w:pPr>
+              <w:jc w:val="center"/>
+            </w:pPr>
+            <w:r>
+              <w:rPr>
+                <w:rFonts w:ascii="Liberation Sans" w:hAnsi="Liberation Sans"/>
+                <w:b w:val="0"/>
+                <w:color w:val="526579"/>
+                <w:sz w:val="20"/>
+              </w:rPr>
+              <w:t>-</w:t>
+            </w:r>
+          </w:p>
+        </w:tc>
+        <w:tc>
+          <w:tcPr>
+            <w:tcW w:type="dxa" w:w="781"/>
+            <w:tcMar>
+              <w:top w:w="180" w:type="dxa"/>
+              <w:bottom w:w="180" w:type="dxa"/>
+              <w:left w:w="70" w:type="dxa"/>
+              <w:right w:w="50" w:type="dxa"/>
+            </w:tcMar>
+            <w:shd w:fill="FFFFFF"/>
+            <w:vAlign w:val="center"/>
+          </w:tcPr>
+          <w:p>
+            <w:pPr>
+              <w:jc w:val="center"/>
+            </w:pPr>
+            <w:r>
+              <w:rPr>
+                <w:rFonts w:ascii="Liberation Sans" w:hAnsi="Liberation Sans"/>
+                <w:b w:val="0"/>
+                <w:color w:val="526579"/>
+                <w:sz w:val="20"/>
+              </w:rPr>
+              <w:t>-</w:t>
+            </w:r>
+          </w:p>
+        </w:tc>
+      </w:tr>
+      <w:tr>
+        <w:trPr>
+          <w:trHeight w:val="1050" w:hRule="atLeast"/>
+        </w:trPr>
+        <w:tc>
+          <w:tcPr>
+            <w:tcW w:type="dxa" w:w="639"/>
+            <w:tcMar>
+              <w:top w:w="180" w:type="dxa"/>
+              <w:bottom w:w="180" w:type="dxa"/>
+              <w:left w:w="70" w:type="dxa"/>
+              <w:right w:w="50" w:type="dxa"/>
+            </w:tcMar>
+            <w:shd w:fill="E8EFF5"/>
+            <w:vAlign w:val="center"/>
+          </w:tcPr>
+          <w:p>
+            <w:pPr>
+              <w:jc w:val="center"/>
+            </w:pPr>
+            <w:r>
+              <w:rPr>
+                <w:rFonts w:ascii="Liberation Sans" w:hAnsi="Liberation Sans"/>
+                <w:b/>
+                <w:color w:val="172E46"/>
+                <w:sz w:val="22"/>
+              </w:rPr>
+              <w:t>7</w:t>
+            </w:r>
+          </w:p>
+        </w:tc>
+        <w:tc>
+          <w:tcPr>
+            <w:tcW w:type="dxa" w:w="1206"/>
+            <w:tcMar>
+              <w:top w:w="180" w:type="dxa"/>
+              <w:bottom w:w="180" w:type="dxa"/>
+              <w:left w:w="70" w:type="dxa"/>
+              <w:right w:w="50" w:type="dxa"/>
+            </w:tcMar>
+            <w:shd w:fill="E8EFF5"/>
             <w:vAlign w:val="center"/>
           </w:tcPr>
           <w:p>
@@ -1445,22 +2592,22 @@
                 <w:rFonts w:ascii="Liberation Sans" w:hAnsi="Liberation Sans"/>
                 <w:b/>
                 <w:color w:val="172E46"/>
-                <w:sz w:val="14"/>
+                <w:sz w:val="20"/>
               </w:rPr>
-              <w:t>MACSE504</w:t>
+              <w:t>MAENG501</w:t>
             </w:r>
           </w:p>
         </w:tc>
         <w:tc>
           <w:tcPr>
-            <w:tcW w:type="dxa" w:w="2664"/>
+            <w:tcW w:type="dxa" w:w="3052"/>
             <w:tcMar>
-              <w:top w:w="60" w:type="dxa"/>
-              <w:bottom w:w="60" w:type="dxa"/>
-              <w:left w:w="40" w:type="dxa"/>
-              <w:right w:w="40" w:type="dxa"/>
+              <w:top w:w="180" w:type="dxa"/>
+              <w:bottom w:w="180" w:type="dxa"/>
+              <w:left w:w="70" w:type="dxa"/>
+              <w:right w:w="50" w:type="dxa"/>
             </w:tcMar>
-            <w:shd w:fill="FFFFFF"/>
+            <w:shd w:fill="E8EFF5"/>
             <w:vAlign w:val="center"/>
           </w:tcPr>
           <w:p>
@@ -1469,22 +2616,49 @@
                 <w:rFonts w:ascii="Liberation Sans" w:hAnsi="Liberation Sans"/>
                 <w:b w:val="0"/>
                 <w:color w:val="172E46"/>
-                <w:sz w:val="14"/>
+                <w:sz w:val="20"/>
               </w:rPr>
-              <w:t>Machine Learning</w:t>
+              <w:t>Technical Report Writing</w:t>
             </w:r>
           </w:p>
         </w:tc>
         <w:tc>
           <w:tcPr>
-            <w:tcW w:type="dxa" w:w="792"/>
+            <w:tcW w:type="dxa" w:w="852"/>
             <w:tcMar>
-              <w:top w:w="60" w:type="dxa"/>
-              <w:bottom w:w="60" w:type="dxa"/>
-              <w:left w:w="40" w:type="dxa"/>
-              <w:right w:w="40" w:type="dxa"/>
+              <w:top w:w="180" w:type="dxa"/>
+              <w:bottom w:w="180" w:type="dxa"/>
+              <w:left w:w="70" w:type="dxa"/>
+              <w:right w:w="50" w:type="dxa"/>
             </w:tcMar>
-            <w:shd w:fill="FFFFFF"/>
+            <w:shd w:fill="E8EFF5"/>
+            <w:vAlign w:val="center"/>
+          </w:tcPr>
+          <w:p>
+            <w:pPr>
+              <w:jc w:val="center"/>
+            </w:pPr>
+            <w:r>
+              <w:rPr>
+                <w:rFonts w:ascii="Liberation Sans" w:hAnsi="Liberation Sans"/>
+                <w:b w:val="0"/>
+                <w:color w:val="172E46"/>
+                <w:sz w:val="20"/>
+              </w:rPr>
+              <w:t>ETH</w:t>
+            </w:r>
+          </w:p>
+        </w:tc>
+        <w:tc>
+          <w:tcPr>
+            <w:tcW w:type="dxa" w:w="1490"/>
+            <w:tcMar>
+              <w:top w:w="180" w:type="dxa"/>
+              <w:bottom w:w="180" w:type="dxa"/>
+              <w:left w:w="70" w:type="dxa"/>
+              <w:right w:w="50" w:type="dxa"/>
+            </w:tcMar>
+            <w:shd w:fill="E8EFF5"/>
             <w:vAlign w:val="center"/>
           </w:tcPr>
           <w:p>
@@ -1493,22 +2667,114 @@
                 <w:rFonts w:ascii="Liberation Sans" w:hAnsi="Liberation Sans"/>
                 <w:b w:val="0"/>
                 <w:color w:val="172E46"/>
-                <w:sz w:val="14"/>
+                <w:sz w:val="16"/>
               </w:rPr>
-              <w:t>ETH</w:t>
+              <w:t>VL2026270106586</w:t>
             </w:r>
           </w:p>
         </w:tc>
         <w:tc>
           <w:tcPr>
-            <w:tcW w:type="dxa" w:w="1368"/>
+            <w:tcW w:type="dxa" w:w="923"/>
             <w:tcMar>
-              <w:top w:w="60" w:type="dxa"/>
-              <w:bottom w:w="60" w:type="dxa"/>
-              <w:left w:w="40" w:type="dxa"/>
-              <w:right w:w="40" w:type="dxa"/>
+              <w:top w:w="180" w:type="dxa"/>
+              <w:bottom w:w="180" w:type="dxa"/>
+              <w:left w:w="70" w:type="dxa"/>
+              <w:right w:w="50" w:type="dxa"/>
             </w:tcMar>
-            <w:shd w:fill="FFFFFF"/>
+            <w:shd w:fill="E8EFF5"/>
+            <w:vAlign w:val="center"/>
+          </w:tcPr>
+          <w:p>
+            <w:pPr>
+              <w:jc w:val="center"/>
+            </w:pPr>
+            <w:r>
+              <w:rPr>
+                <w:rFonts w:ascii="Liberation Sans" w:hAnsi="Liberation Sans"/>
+                <w:b w:val="0"/>
+                <w:color w:val="172E46"/>
+                <w:sz w:val="20"/>
+              </w:rPr>
+              <w:t>TAA1</w:t>
+            </w:r>
+          </w:p>
+        </w:tc>
+        <w:tc>
+          <w:tcPr>
+            <w:tcW w:type="dxa" w:w="1348"/>
+            <w:tcMar>
+              <w:top w:w="180" w:type="dxa"/>
+              <w:bottom w:w="180" w:type="dxa"/>
+              <w:left w:w="70" w:type="dxa"/>
+              <w:right w:w="50" w:type="dxa"/>
+            </w:tcMar>
+            <w:shd w:fill="E8EFF5"/>
+            <w:vAlign w:val="center"/>
+          </w:tcPr>
+          <w:p>
+            <w:r>
+              <w:rPr>
+                <w:rFonts w:ascii="Liberation Sans" w:hAnsi="Liberation Sans"/>
+                <w:b/>
+                <w:color w:val="172E46"/>
+                <w:sz w:val="20"/>
+              </w:rPr>
+              <w:t>01-Dec-2026</w:t>
+            </w:r>
+          </w:p>
+          <w:p>
+            <w:pPr>
+              <w:spacing w:before="40"/>
+            </w:pPr>
+            <w:r>
+              <w:rPr>
+                <w:rFonts w:ascii="Liberation Sans" w:hAnsi="Liberation Sans"/>
+                <w:b w:val="0"/>
+                <w:color w:val="526579"/>
+                <w:sz w:val="16"/>
+              </w:rPr>
+              <w:t>Tue</w:t>
+            </w:r>
+          </w:p>
+        </w:tc>
+        <w:tc>
+          <w:tcPr>
+            <w:tcW w:type="dxa" w:w="994"/>
+            <w:tcMar>
+              <w:top w:w="180" w:type="dxa"/>
+              <w:bottom w:w="180" w:type="dxa"/>
+              <w:left w:w="70" w:type="dxa"/>
+              <w:right w:w="50" w:type="dxa"/>
+            </w:tcMar>
+            <w:shd w:fill="E8EFF5"/>
+            <w:vAlign w:val="center"/>
+          </w:tcPr>
+          <w:p>
+            <w:pPr>
+              <w:jc w:val="center"/>
+            </w:pPr>
+            <w:r>
+              <w:rPr>
+                <w:rFonts w:ascii="Liberation Sans" w:hAnsi="Liberation Sans"/>
+                <w:b w:val="0"/>
+                <w:color w:val="172E46"/>
+                <w:sz w:val="20"/>
+              </w:rPr>
+              <w:t>FN1</w:t>
+            </w:r>
+          </w:p>
+        </w:tc>
+        <w:tc>
+          <w:tcPr>
+            <w:tcW w:type="dxa" w:w="1206"/>
+            <w:tcMar>
+              <w:top w:w="180" w:type="dxa"/>
+              <w:bottom w:w="180" w:type="dxa"/>
+              <w:left w:w="70" w:type="dxa"/>
+              <w:right w:w="50" w:type="dxa"/>
+            </w:tcMar>
+            <w:shd w:fill="E8EFF5"/>
             <w:vAlign w:val="center"/>
           </w:tcPr>
           <w:p>
@@ -1517,46 +2783,22 @@
                 <w:rFonts w:ascii="Liberation Sans" w:hAnsi="Liberation Sans"/>
                 <w:b w:val="0"/>
                 <w:color w:val="172E46"/>
-                <w:sz w:val="12"/>
+                <w:sz w:val="20"/>
               </w:rPr>
-              <w:t>VL2026270106068</w:t>
+              <w:t>08:45 AM</w:t>
             </w:r>
           </w:p>
         </w:tc>
         <w:tc>
           <w:tcPr>
-            <w:tcW w:type="dxa" w:w="792"/>
+            <w:tcW w:type="dxa" w:w="1632"/>
             <w:tcMar>
-              <w:top w:w="60" w:type="dxa"/>
-              <w:bottom w:w="60" w:type="dxa"/>
-              <w:left w:w="40" w:type="dxa"/>
-              <w:right w:w="40" w:type="dxa"/>
+              <w:top w:w="180" w:type="dxa"/>
+              <w:bottom w:w="180" w:type="dxa"/>
+              <w:left w:w="70" w:type="dxa"/>
+              <w:right w:w="50" w:type="dxa"/>
             </w:tcMar>
-            <w:shd w:fill="FFFFFF"/>
-            <w:vAlign w:val="center"/>
-          </w:tcPr>
-          <w:p>
-            <w:r>
-              <w:rPr>
-                <w:rFonts w:ascii="Liberation Sans" w:hAnsi="Liberation Sans"/>
-                <w:b w:val="0"/>
-                <w:color w:val="172E46"/>
-                <w:sz w:val="14"/>
-              </w:rPr>
-              <w:t>E1+TE1</w:t>
-            </w:r>
-          </w:p>
-        </w:tc>
-        <w:tc>
-          <w:tcPr>
-            <w:tcW w:type="dxa" w:w="1080"/>
-            <w:tcMar>
-              <w:top w:w="60" w:type="dxa"/>
-              <w:bottom w:w="60" w:type="dxa"/>
-              <w:left w:w="40" w:type="dxa"/>
-              <w:right w:w="40" w:type="dxa"/>
-            </w:tcMar>
-            <w:shd w:fill="FFFFFF"/>
+            <w:shd w:fill="E8EFF5"/>
             <w:vAlign w:val="center"/>
           </w:tcPr>
           <w:p>
@@ -1565,98 +2807,7 @@
                 <w:rFonts w:ascii="Liberation Sans" w:hAnsi="Liberation Sans"/>
                 <w:b/>
                 <w:color w:val="172E46"/>
-                <w:sz w:val="14"/>
-              </w:rPr>
-              <w:t>23-Nov-2026</w:t>
-            </w:r>
-            <w:r>
-              <w:rPr>
-                <w:rFonts w:ascii="Liberation Sans" w:hAnsi="Liberation Sans"/>
-                <w:b w:val="0"/>
-                <w:color w:val="172E46"/>
-                <w:sz w:val="2"/>
-              </w:rPr>
-            </w:r>
-          </w:p>
-          <w:p>
-            <w:r>
-              <w:rPr>
-                <w:rFonts w:ascii="Liberation Sans" w:hAnsi="Liberation Sans"/>
-                <w:b w:val="0"/>
-                <w:color w:val="526579"/>
-                <w:sz w:val="12"/>
-              </w:rPr>
-              <w:t>Mon</w:t>
-            </w:r>
-          </w:p>
-        </w:tc>
-        <w:tc>
-          <w:tcPr>
-            <w:tcW w:type="dxa" w:w="864"/>
-            <w:tcMar>
-              <w:top w:w="60" w:type="dxa"/>
-              <w:bottom w:w="60" w:type="dxa"/>
-              <w:left w:w="40" w:type="dxa"/>
-              <w:right w:w="40" w:type="dxa"/>
-            </w:tcMar>
-            <w:shd w:fill="FFFFFF"/>
-            <w:vAlign w:val="center"/>
-          </w:tcPr>
-          <w:p>
-            <w:r>
-              <w:rPr>
-                <w:rFonts w:ascii="Liberation Sans" w:hAnsi="Liberation Sans"/>
-                <w:b w:val="0"/>
-                <w:color w:val="172E46"/>
-                <w:sz w:val="14"/>
-              </w:rPr>
-              <w:t>FN1</w:t>
-            </w:r>
-          </w:p>
-        </w:tc>
-        <w:tc>
-          <w:tcPr>
-            <w:tcW w:type="dxa" w:w="1008"/>
-            <w:tcMar>
-              <w:top w:w="60" w:type="dxa"/>
-              <w:bottom w:w="60" w:type="dxa"/>
-              <w:left w:w="40" w:type="dxa"/>
-              <w:right w:w="40" w:type="dxa"/>
-            </w:tcMar>
-            <w:shd w:fill="FFFFFF"/>
-            <w:vAlign w:val="center"/>
-          </w:tcPr>
-          <w:p>
-            <w:r>
-              <w:rPr>
-                <w:rFonts w:ascii="Liberation Sans" w:hAnsi="Liberation Sans"/>
-                <w:b w:val="0"/>
-                <w:color w:val="172E46"/>
-                <w:sz w:val="14"/>
-              </w:rPr>
-              <w:t>08:45 AM</w:t>
-            </w:r>
-          </w:p>
-        </w:tc>
-        <w:tc>
-          <w:tcPr>
-            <w:tcW w:type="dxa" w:w="1368"/>
-            <w:tcMar>
-              <w:top w:w="60" w:type="dxa"/>
-              <w:bottom w:w="60" w:type="dxa"/>
-              <w:left w:w="40" w:type="dxa"/>
-              <w:right w:w="40" w:type="dxa"/>
-            </w:tcMar>
-            <w:shd w:fill="FFFFFF"/>
-            <w:vAlign w:val="center"/>
-          </w:tcPr>
-          <w:p>
-            <w:r>
-              <w:rPr>
-                <w:rFonts w:ascii="Liberation Sans" w:hAnsi="Liberation Sans"/>
-                <w:b/>
-                <w:color w:val="172E46"/>
-                <w:sz w:val="14"/>
+                <w:sz w:val="20"/>
               </w:rPr>
               <w:t>09:30 AM - 12:30 PM</w:t>
             </w:r>
@@ -1664,23 +2815,26 @@
         </w:tc>
         <w:tc>
           <w:tcPr>
-            <w:tcW w:type="dxa" w:w="648"/>
+            <w:tcW w:type="dxa" w:w="781"/>
             <w:tcMar>
-              <w:top w:w="60" w:type="dxa"/>
-              <w:bottom w:w="60" w:type="dxa"/>
-              <w:left w:w="40" w:type="dxa"/>
-              <w:right w:w="40" w:type="dxa"/>
+              <w:top w:w="180" w:type="dxa"/>
+              <w:bottom w:w="180" w:type="dxa"/>
+              <w:left w:w="70" w:type="dxa"/>
+              <w:right w:w="50" w:type="dxa"/>
             </w:tcMar>
-            <w:shd w:fill="FFFFFF"/>
+            <w:shd w:fill="E8EFF5"/>
             <w:vAlign w:val="center"/>
           </w:tcPr>
           <w:p>
+            <w:pPr>
+              <w:jc w:val="center"/>
+            </w:pPr>
             <w:r>
               <w:rPr>
                 <w:rFonts w:ascii="Liberation Sans" w:hAnsi="Liberation Sans"/>
                 <w:b w:val="0"/>
                 <w:color w:val="526579"/>
-                <w:sz w:val="14"/>
+                <w:sz w:val="20"/>
               </w:rPr>
               <w:t>-</w:t>
             </w:r>
@@ -1688,23 +2842,26 @@
         </w:tc>
         <w:tc>
           <w:tcPr>
-            <w:tcW w:type="dxa" w:w="792"/>
+            <w:tcW w:type="dxa" w:w="923"/>
             <w:tcMar>
-              <w:top w:w="60" w:type="dxa"/>
-              <w:bottom w:w="60" w:type="dxa"/>
-              <w:left w:w="40" w:type="dxa"/>
-              <w:right w:w="40" w:type="dxa"/>
+              <w:top w:w="180" w:type="dxa"/>
+              <w:bottom w:w="180" w:type="dxa"/>
+              <w:left w:w="70" w:type="dxa"/>
+              <w:right w:w="50" w:type="dxa"/>
             </w:tcMar>
-            <w:shd w:fill="FFFFFF"/>
+            <w:shd w:fill="E8EFF5"/>
             <w:vAlign w:val="center"/>
           </w:tcPr>
           <w:p>
+            <w:pPr>
+              <w:jc w:val="center"/>
+            </w:pPr>
             <w:r>
               <w:rPr>
                 <w:rFonts w:ascii="Liberation Sans" w:hAnsi="Liberation Sans"/>
                 <w:b w:val="0"/>
                 <w:color w:val="526579"/>
-                <w:sz w:val="14"/>
+                <w:sz w:val="20"/>
               </w:rPr>
               <w:t>-</w:t>
             </w:r>
@@ -1712,1031 +2869,26 @@
         </w:tc>
         <w:tc>
           <w:tcPr>
-            <w:tcW w:type="dxa" w:w="648"/>
+            <w:tcW w:type="dxa" w:w="781"/>
             <w:tcMar>
-              <w:top w:w="60" w:type="dxa"/>
-              <w:bottom w:w="60" w:type="dxa"/>
-              <w:left w:w="40" w:type="dxa"/>
-              <w:right w:w="40" w:type="dxa"/>
+              <w:top w:w="180" w:type="dxa"/>
+              <w:bottom w:w="180" w:type="dxa"/>
+              <w:left w:w="70" w:type="dxa"/>
+              <w:right w:w="50" w:type="dxa"/>
             </w:tcMar>
-            <w:shd w:fill="FFFFFF"/>
+            <w:shd w:fill="E8EFF5"/>
             <w:vAlign w:val="center"/>
           </w:tcPr>
           <w:p>
+            <w:pPr>
+              <w:jc w:val="center"/>
+            </w:pPr>
             <w:r>
               <w:rPr>
                 <w:rFonts w:ascii="Liberation Sans" w:hAnsi="Liberation Sans"/>
                 <w:b w:val="0"/>
                 <w:color w:val="526579"/>
-                <w:sz w:val="14"/>
-              </w:rPr>
-              <w:t>-</w:t>
-            </w:r>
-          </w:p>
-        </w:tc>
-      </w:tr>
-      <w:tr>
-        <w:trPr>
-          <w:cantSplit/>
-        </w:trPr>
-        <w:tc>
-          <w:tcPr>
-            <w:tcW w:type="dxa" w:w="504"/>
-            <w:tcMar>
-              <w:top w:w="60" w:type="dxa"/>
-              <w:bottom w:w="60" w:type="dxa"/>
-              <w:left w:w="40" w:type="dxa"/>
-              <w:right w:w="40" w:type="dxa"/>
-            </w:tcMar>
-            <w:shd w:fill="F0F5F8"/>
-            <w:vAlign w:val="center"/>
-          </w:tcPr>
-          <w:p>
-            <w:r>
-              <w:rPr>
-                <w:rFonts w:ascii="Liberation Sans" w:hAnsi="Liberation Sans"/>
-                <w:b/>
-                <w:color w:val="172E46"/>
-                <w:sz w:val="14"/>
-              </w:rPr>
-              <w:t>5</w:t>
-            </w:r>
-          </w:p>
-        </w:tc>
-        <w:tc>
-          <w:tcPr>
-            <w:tcW w:type="dxa" w:w="1080"/>
-            <w:tcMar>
-              <w:top w:w="60" w:type="dxa"/>
-              <w:bottom w:w="60" w:type="dxa"/>
-              <w:left w:w="40" w:type="dxa"/>
-              <w:right w:w="40" w:type="dxa"/>
-            </w:tcMar>
-            <w:shd w:fill="F0F5F8"/>
-            <w:vAlign w:val="center"/>
-          </w:tcPr>
-          <w:p>
-            <w:r>
-              <w:rPr>
-                <w:rFonts w:ascii="Liberation Sans" w:hAnsi="Liberation Sans"/>
-                <w:b/>
-                <w:color w:val="172E46"/>
-                <w:sz w:val="14"/>
-              </w:rPr>
-              <w:t>MACSE503</w:t>
-            </w:r>
-          </w:p>
-        </w:tc>
-        <w:tc>
-          <w:tcPr>
-            <w:tcW w:type="dxa" w:w="2664"/>
-            <w:tcMar>
-              <w:top w:w="60" w:type="dxa"/>
-              <w:bottom w:w="60" w:type="dxa"/>
-              <w:left w:w="40" w:type="dxa"/>
-              <w:right w:w="40" w:type="dxa"/>
-            </w:tcMar>
-            <w:shd w:fill="F0F5F8"/>
-            <w:vAlign w:val="center"/>
-          </w:tcPr>
-          <w:p>
-            <w:r>
-              <w:rPr>
-                <w:rFonts w:ascii="Liberation Sans" w:hAnsi="Liberation Sans"/>
-                <w:b w:val="0"/>
-                <w:color w:val="172E46"/>
-                <w:sz w:val="14"/>
-              </w:rPr>
-              <w:t>Data Engineering</w:t>
-            </w:r>
-          </w:p>
-        </w:tc>
-        <w:tc>
-          <w:tcPr>
-            <w:tcW w:type="dxa" w:w="792"/>
-            <w:tcMar>
-              <w:top w:w="60" w:type="dxa"/>
-              <w:bottom w:w="60" w:type="dxa"/>
-              <w:left w:w="40" w:type="dxa"/>
-              <w:right w:w="40" w:type="dxa"/>
-            </w:tcMar>
-            <w:shd w:fill="F0F5F8"/>
-            <w:vAlign w:val="center"/>
-          </w:tcPr>
-          <w:p>
-            <w:r>
-              <w:rPr>
-                <w:rFonts w:ascii="Liberation Sans" w:hAnsi="Liberation Sans"/>
-                <w:b w:val="0"/>
-                <w:color w:val="172E46"/>
-                <w:sz w:val="14"/>
-              </w:rPr>
-              <w:t>ETH</w:t>
-            </w:r>
-          </w:p>
-        </w:tc>
-        <w:tc>
-          <w:tcPr>
-            <w:tcW w:type="dxa" w:w="1368"/>
-            <w:tcMar>
-              <w:top w:w="60" w:type="dxa"/>
-              <w:bottom w:w="60" w:type="dxa"/>
-              <w:left w:w="40" w:type="dxa"/>
-              <w:right w:w="40" w:type="dxa"/>
-            </w:tcMar>
-            <w:shd w:fill="F0F5F8"/>
-            <w:vAlign w:val="center"/>
-          </w:tcPr>
-          <w:p>
-            <w:r>
-              <w:rPr>
-                <w:rFonts w:ascii="Liberation Sans" w:hAnsi="Liberation Sans"/>
-                <w:b w:val="0"/>
-                <w:color w:val="172E46"/>
-                <w:sz w:val="12"/>
-              </w:rPr>
-              <w:t>VL2026270106818</w:t>
-            </w:r>
-          </w:p>
-        </w:tc>
-        <w:tc>
-          <w:tcPr>
-            <w:tcW w:type="dxa" w:w="792"/>
-            <w:tcMar>
-              <w:top w:w="60" w:type="dxa"/>
-              <w:bottom w:w="60" w:type="dxa"/>
-              <w:left w:w="40" w:type="dxa"/>
-              <w:right w:w="40" w:type="dxa"/>
-            </w:tcMar>
-            <w:shd w:fill="F0F5F8"/>
-            <w:vAlign w:val="center"/>
-          </w:tcPr>
-          <w:p>
-            <w:r>
-              <w:rPr>
-                <w:rFonts w:ascii="Liberation Sans" w:hAnsi="Liberation Sans"/>
-                <w:b w:val="0"/>
-                <w:color w:val="172E46"/>
-                <w:sz w:val="14"/>
-              </w:rPr>
-              <w:t>F1+TF1</w:t>
-            </w:r>
-          </w:p>
-        </w:tc>
-        <w:tc>
-          <w:tcPr>
-            <w:tcW w:type="dxa" w:w="1080"/>
-            <w:tcMar>
-              <w:top w:w="60" w:type="dxa"/>
-              <w:bottom w:w="60" w:type="dxa"/>
-              <w:left w:w="40" w:type="dxa"/>
-              <w:right w:w="40" w:type="dxa"/>
-            </w:tcMar>
-            <w:shd w:fill="F0F5F8"/>
-            <w:vAlign w:val="center"/>
-          </w:tcPr>
-          <w:p>
-            <w:r>
-              <w:rPr>
-                <w:rFonts w:ascii="Liberation Sans" w:hAnsi="Liberation Sans"/>
-                <w:b/>
-                <w:color w:val="172E46"/>
-                <w:sz w:val="14"/>
-              </w:rPr>
-              <w:t>25-Nov-2026</w:t>
-            </w:r>
-            <w:r>
-              <w:rPr>
-                <w:rFonts w:ascii="Liberation Sans" w:hAnsi="Liberation Sans"/>
-                <w:b w:val="0"/>
-                <w:color w:val="172E46"/>
-                <w:sz w:val="2"/>
-              </w:rPr>
-            </w:r>
-          </w:p>
-          <w:p>
-            <w:r>
-              <w:rPr>
-                <w:rFonts w:ascii="Liberation Sans" w:hAnsi="Liberation Sans"/>
-                <w:b w:val="0"/>
-                <w:color w:val="526579"/>
-                <w:sz w:val="12"/>
-              </w:rPr>
-              <w:t>Wed</w:t>
-            </w:r>
-          </w:p>
-        </w:tc>
-        <w:tc>
-          <w:tcPr>
-            <w:tcW w:type="dxa" w:w="864"/>
-            <w:tcMar>
-              <w:top w:w="60" w:type="dxa"/>
-              <w:bottom w:w="60" w:type="dxa"/>
-              <w:left w:w="40" w:type="dxa"/>
-              <w:right w:w="40" w:type="dxa"/>
-            </w:tcMar>
-            <w:shd w:fill="F0F5F8"/>
-            <w:vAlign w:val="center"/>
-          </w:tcPr>
-          <w:p>
-            <w:r>
-              <w:rPr>
-                <w:rFonts w:ascii="Liberation Sans" w:hAnsi="Liberation Sans"/>
-                <w:b w:val="0"/>
-                <w:color w:val="172E46"/>
-                <w:sz w:val="14"/>
-              </w:rPr>
-              <w:t>FN1</w:t>
-            </w:r>
-          </w:p>
-        </w:tc>
-        <w:tc>
-          <w:tcPr>
-            <w:tcW w:type="dxa" w:w="1008"/>
-            <w:tcMar>
-              <w:top w:w="60" w:type="dxa"/>
-              <w:bottom w:w="60" w:type="dxa"/>
-              <w:left w:w="40" w:type="dxa"/>
-              <w:right w:w="40" w:type="dxa"/>
-            </w:tcMar>
-            <w:shd w:fill="F0F5F8"/>
-            <w:vAlign w:val="center"/>
-          </w:tcPr>
-          <w:p>
-            <w:r>
-              <w:rPr>
-                <w:rFonts w:ascii="Liberation Sans" w:hAnsi="Liberation Sans"/>
-                <w:b w:val="0"/>
-                <w:color w:val="172E46"/>
-                <w:sz w:val="14"/>
-              </w:rPr>
-              <w:t>08:45 AM</w:t>
-            </w:r>
-          </w:p>
-        </w:tc>
-        <w:tc>
-          <w:tcPr>
-            <w:tcW w:type="dxa" w:w="1368"/>
-            <w:tcMar>
-              <w:top w:w="60" w:type="dxa"/>
-              <w:bottom w:w="60" w:type="dxa"/>
-              <w:left w:w="40" w:type="dxa"/>
-              <w:right w:w="40" w:type="dxa"/>
-            </w:tcMar>
-            <w:shd w:fill="F0F5F8"/>
-            <w:vAlign w:val="center"/>
-          </w:tcPr>
-          <w:p>
-            <w:r>
-              <w:rPr>
-                <w:rFonts w:ascii="Liberation Sans" w:hAnsi="Liberation Sans"/>
-                <w:b/>
-                <w:color w:val="172E46"/>
-                <w:sz w:val="14"/>
-              </w:rPr>
-              <w:t>09:30 AM - 12:30 PM</w:t>
-            </w:r>
-          </w:p>
-        </w:tc>
-        <w:tc>
-          <w:tcPr>
-            <w:tcW w:type="dxa" w:w="648"/>
-            <w:tcMar>
-              <w:top w:w="60" w:type="dxa"/>
-              <w:bottom w:w="60" w:type="dxa"/>
-              <w:left w:w="40" w:type="dxa"/>
-              <w:right w:w="40" w:type="dxa"/>
-            </w:tcMar>
-            <w:shd w:fill="F0F5F8"/>
-            <w:vAlign w:val="center"/>
-          </w:tcPr>
-          <w:p>
-            <w:r>
-              <w:rPr>
-                <w:rFonts w:ascii="Liberation Sans" w:hAnsi="Liberation Sans"/>
-                <w:b w:val="0"/>
-                <w:color w:val="526579"/>
-                <w:sz w:val="14"/>
-              </w:rPr>
-              <w:t>-</w:t>
-            </w:r>
-          </w:p>
-        </w:tc>
-        <w:tc>
-          <w:tcPr>
-            <w:tcW w:type="dxa" w:w="792"/>
-            <w:tcMar>
-              <w:top w:w="60" w:type="dxa"/>
-              <w:bottom w:w="60" w:type="dxa"/>
-              <w:left w:w="40" w:type="dxa"/>
-              <w:right w:w="40" w:type="dxa"/>
-            </w:tcMar>
-            <w:shd w:fill="F0F5F8"/>
-            <w:vAlign w:val="center"/>
-          </w:tcPr>
-          <w:p>
-            <w:r>
-              <w:rPr>
-                <w:rFonts w:ascii="Liberation Sans" w:hAnsi="Liberation Sans"/>
-                <w:b w:val="0"/>
-                <w:color w:val="526579"/>
-                <w:sz w:val="14"/>
-              </w:rPr>
-              <w:t>-</w:t>
-            </w:r>
-          </w:p>
-        </w:tc>
-        <w:tc>
-          <w:tcPr>
-            <w:tcW w:type="dxa" w:w="648"/>
-            <w:tcMar>
-              <w:top w:w="60" w:type="dxa"/>
-              <w:bottom w:w="60" w:type="dxa"/>
-              <w:left w:w="40" w:type="dxa"/>
-              <w:right w:w="40" w:type="dxa"/>
-            </w:tcMar>
-            <w:shd w:fill="F0F5F8"/>
-            <w:vAlign w:val="center"/>
-          </w:tcPr>
-          <w:p>
-            <w:r>
-              <w:rPr>
-                <w:rFonts w:ascii="Liberation Sans" w:hAnsi="Liberation Sans"/>
-                <w:b w:val="0"/>
-                <w:color w:val="526579"/>
-                <w:sz w:val="14"/>
-              </w:rPr>
-              <w:t>-</w:t>
-            </w:r>
-          </w:p>
-        </w:tc>
-      </w:tr>
-      <w:tr>
-        <w:trPr>
-          <w:cantSplit/>
-        </w:trPr>
-        <w:tc>
-          <w:tcPr>
-            <w:tcW w:type="dxa" w:w="504"/>
-            <w:tcMar>
-              <w:top w:w="60" w:type="dxa"/>
-              <w:bottom w:w="60" w:type="dxa"/>
-              <w:left w:w="40" w:type="dxa"/>
-              <w:right w:w="40" w:type="dxa"/>
-            </w:tcMar>
-            <w:shd w:fill="FFFFFF"/>
-            <w:vAlign w:val="center"/>
-          </w:tcPr>
-          <w:p>
-            <w:r>
-              <w:rPr>
-                <w:rFonts w:ascii="Liberation Sans" w:hAnsi="Liberation Sans"/>
-                <w:b/>
-                <w:color w:val="172E46"/>
-                <w:sz w:val="14"/>
-              </w:rPr>
-              <w:t>6</w:t>
-            </w:r>
-          </w:p>
-        </w:tc>
-        <w:tc>
-          <w:tcPr>
-            <w:tcW w:type="dxa" w:w="1080"/>
-            <w:tcMar>
-              <w:top w:w="60" w:type="dxa"/>
-              <w:bottom w:w="60" w:type="dxa"/>
-              <w:left w:w="40" w:type="dxa"/>
-              <w:right w:w="40" w:type="dxa"/>
-            </w:tcMar>
-            <w:shd w:fill="FFFFFF"/>
-            <w:vAlign w:val="center"/>
-          </w:tcPr>
-          <w:p>
-            <w:r>
-              <w:rPr>
-                <w:rFonts w:ascii="Liberation Sans" w:hAnsi="Liberation Sans"/>
-                <w:b/>
-                <w:color w:val="172E46"/>
-                <w:sz w:val="14"/>
-              </w:rPr>
-              <w:t>MASTS601</w:t>
-            </w:r>
-          </w:p>
-        </w:tc>
-        <w:tc>
-          <w:tcPr>
-            <w:tcW w:type="dxa" w:w="2664"/>
-            <w:tcMar>
-              <w:top w:w="60" w:type="dxa"/>
-              <w:bottom w:w="60" w:type="dxa"/>
-              <w:left w:w="40" w:type="dxa"/>
-              <w:right w:w="40" w:type="dxa"/>
-            </w:tcMar>
-            <w:shd w:fill="FFFFFF"/>
-            <w:vAlign w:val="center"/>
-          </w:tcPr>
-          <w:p>
-            <w:r>
-              <w:rPr>
-                <w:rFonts w:ascii="Liberation Sans" w:hAnsi="Liberation Sans"/>
-                <w:b w:val="0"/>
-                <w:color w:val="172E46"/>
-                <w:sz w:val="14"/>
-              </w:rPr>
-              <w:t>Competitive Coding I</w:t>
-            </w:r>
-          </w:p>
-        </w:tc>
-        <w:tc>
-          <w:tcPr>
-            <w:tcW w:type="dxa" w:w="792"/>
-            <w:tcMar>
-              <w:top w:w="60" w:type="dxa"/>
-              <w:bottom w:w="60" w:type="dxa"/>
-              <w:left w:w="40" w:type="dxa"/>
-              <w:right w:w="40" w:type="dxa"/>
-            </w:tcMar>
-            <w:shd w:fill="FFFFFF"/>
-            <w:vAlign w:val="center"/>
-          </w:tcPr>
-          <w:p>
-            <w:r>
-              <w:rPr>
-                <w:rFonts w:ascii="Liberation Sans" w:hAnsi="Liberation Sans"/>
-                <w:b w:val="0"/>
-                <w:color w:val="172E46"/>
-                <w:sz w:val="14"/>
-              </w:rPr>
-              <w:t>SS</w:t>
-            </w:r>
-          </w:p>
-        </w:tc>
-        <w:tc>
-          <w:tcPr>
-            <w:tcW w:type="dxa" w:w="1368"/>
-            <w:tcMar>
-              <w:top w:w="60" w:type="dxa"/>
-              <w:bottom w:w="60" w:type="dxa"/>
-              <w:left w:w="40" w:type="dxa"/>
-              <w:right w:w="40" w:type="dxa"/>
-            </w:tcMar>
-            <w:shd w:fill="FFFFFF"/>
-            <w:vAlign w:val="center"/>
-          </w:tcPr>
-          <w:p>
-            <w:r>
-              <w:rPr>
-                <w:rFonts w:ascii="Liberation Sans" w:hAnsi="Liberation Sans"/>
-                <w:b w:val="0"/>
-                <w:color w:val="172E46"/>
-                <w:sz w:val="12"/>
-              </w:rPr>
-              <w:t>VL2026270104814</w:t>
-            </w:r>
-          </w:p>
-        </w:tc>
-        <w:tc>
-          <w:tcPr>
-            <w:tcW w:type="dxa" w:w="792"/>
-            <w:tcMar>
-              <w:top w:w="60" w:type="dxa"/>
-              <w:bottom w:w="60" w:type="dxa"/>
-              <w:left w:w="40" w:type="dxa"/>
-              <w:right w:w="40" w:type="dxa"/>
-            </w:tcMar>
-            <w:shd w:fill="FFFFFF"/>
-            <w:vAlign w:val="center"/>
-          </w:tcPr>
-          <w:p>
-            <w:r>
-              <w:rPr>
-                <w:rFonts w:ascii="Liberation Sans" w:hAnsi="Liberation Sans"/>
-                <w:b w:val="0"/>
-                <w:color w:val="172E46"/>
-                <w:sz w:val="14"/>
-              </w:rPr>
-              <w:t>G1+TG1</w:t>
-            </w:r>
-          </w:p>
-        </w:tc>
-        <w:tc>
-          <w:tcPr>
-            <w:tcW w:type="dxa" w:w="1080"/>
-            <w:tcMar>
-              <w:top w:w="60" w:type="dxa"/>
-              <w:bottom w:w="60" w:type="dxa"/>
-              <w:left w:w="40" w:type="dxa"/>
-              <w:right w:w="40" w:type="dxa"/>
-            </w:tcMar>
-            <w:shd w:fill="FFFFFF"/>
-            <w:vAlign w:val="center"/>
-          </w:tcPr>
-          <w:p>
-            <w:r>
-              <w:rPr>
-                <w:rFonts w:ascii="Liberation Sans" w:hAnsi="Liberation Sans"/>
-                <w:b/>
-                <w:color w:val="172E46"/>
-                <w:sz w:val="14"/>
-              </w:rPr>
-              <w:t>27-Nov-2026</w:t>
-            </w:r>
-            <w:r>
-              <w:rPr>
-                <w:rFonts w:ascii="Liberation Sans" w:hAnsi="Liberation Sans"/>
-                <w:b w:val="0"/>
-                <w:color w:val="172E46"/>
-                <w:sz w:val="2"/>
-              </w:rPr>
-            </w:r>
-          </w:p>
-          <w:p>
-            <w:r>
-              <w:rPr>
-                <w:rFonts w:ascii="Liberation Sans" w:hAnsi="Liberation Sans"/>
-                <w:b w:val="0"/>
-                <w:color w:val="526579"/>
-                <w:sz w:val="12"/>
-              </w:rPr>
-              <w:t>Fri</w:t>
-            </w:r>
-          </w:p>
-        </w:tc>
-        <w:tc>
-          <w:tcPr>
-            <w:tcW w:type="dxa" w:w="864"/>
-            <w:tcMar>
-              <w:top w:w="60" w:type="dxa"/>
-              <w:bottom w:w="60" w:type="dxa"/>
-              <w:left w:w="40" w:type="dxa"/>
-              <w:right w:w="40" w:type="dxa"/>
-            </w:tcMar>
-            <w:shd w:fill="FFFFFF"/>
-            <w:vAlign w:val="center"/>
-          </w:tcPr>
-          <w:p>
-            <w:r>
-              <w:rPr>
-                <w:rFonts w:ascii="Liberation Sans" w:hAnsi="Liberation Sans"/>
-                <w:b w:val="0"/>
-                <w:color w:val="172E46"/>
-                <w:sz w:val="14"/>
-              </w:rPr>
-              <w:t>FN3</w:t>
-            </w:r>
-          </w:p>
-        </w:tc>
-        <w:tc>
-          <w:tcPr>
-            <w:tcW w:type="dxa" w:w="1008"/>
-            <w:tcMar>
-              <w:top w:w="60" w:type="dxa"/>
-              <w:bottom w:w="60" w:type="dxa"/>
-              <w:left w:w="40" w:type="dxa"/>
-              <w:right w:w="40" w:type="dxa"/>
-            </w:tcMar>
-            <w:shd w:fill="FFFFFF"/>
-            <w:vAlign w:val="center"/>
-          </w:tcPr>
-          <w:p>
-            <w:r>
-              <w:rPr>
-                <w:rFonts w:ascii="Liberation Sans" w:hAnsi="Liberation Sans"/>
-                <w:b w:val="0"/>
-                <w:color w:val="172E46"/>
-                <w:sz w:val="14"/>
-              </w:rPr>
-              <w:t>10:30 AM</w:t>
-            </w:r>
-          </w:p>
-        </w:tc>
-        <w:tc>
-          <w:tcPr>
-            <w:tcW w:type="dxa" w:w="1368"/>
-            <w:tcMar>
-              <w:top w:w="60" w:type="dxa"/>
-              <w:bottom w:w="60" w:type="dxa"/>
-              <w:left w:w="40" w:type="dxa"/>
-              <w:right w:w="40" w:type="dxa"/>
-            </w:tcMar>
-            <w:shd w:fill="FFFFFF"/>
-            <w:vAlign w:val="center"/>
-          </w:tcPr>
-          <w:p>
-            <w:r>
-              <w:rPr>
-                <w:rFonts w:ascii="Liberation Sans" w:hAnsi="Liberation Sans"/>
-                <w:b/>
-                <w:color w:val="172E46"/>
-                <w:sz w:val="14"/>
-              </w:rPr>
-              <w:t>11:00 AM - 12:30 PM</w:t>
-            </w:r>
-          </w:p>
-        </w:tc>
-        <w:tc>
-          <w:tcPr>
-            <w:tcW w:type="dxa" w:w="648"/>
-            <w:tcMar>
-              <w:top w:w="60" w:type="dxa"/>
-              <w:bottom w:w="60" w:type="dxa"/>
-              <w:left w:w="40" w:type="dxa"/>
-              <w:right w:w="40" w:type="dxa"/>
-            </w:tcMar>
-            <w:shd w:fill="FFFFFF"/>
-            <w:vAlign w:val="center"/>
-          </w:tcPr>
-          <w:p>
-            <w:r>
-              <w:rPr>
-                <w:rFonts w:ascii="Liberation Sans" w:hAnsi="Liberation Sans"/>
-                <w:b w:val="0"/>
-                <w:color w:val="526579"/>
-                <w:sz w:val="14"/>
-              </w:rPr>
-              <w:t>-</w:t>
-            </w:r>
-          </w:p>
-        </w:tc>
-        <w:tc>
-          <w:tcPr>
-            <w:tcW w:type="dxa" w:w="792"/>
-            <w:tcMar>
-              <w:top w:w="60" w:type="dxa"/>
-              <w:bottom w:w="60" w:type="dxa"/>
-              <w:left w:w="40" w:type="dxa"/>
-              <w:right w:w="40" w:type="dxa"/>
-            </w:tcMar>
-            <w:shd w:fill="FFFFFF"/>
-            <w:vAlign w:val="center"/>
-          </w:tcPr>
-          <w:p>
-            <w:r>
-              <w:rPr>
-                <w:rFonts w:ascii="Liberation Sans" w:hAnsi="Liberation Sans"/>
-                <w:b w:val="0"/>
-                <w:color w:val="526579"/>
-                <w:sz w:val="14"/>
-              </w:rPr>
-              <w:t>-</w:t>
-            </w:r>
-          </w:p>
-        </w:tc>
-        <w:tc>
-          <w:tcPr>
-            <w:tcW w:type="dxa" w:w="648"/>
-            <w:tcMar>
-              <w:top w:w="60" w:type="dxa"/>
-              <w:bottom w:w="60" w:type="dxa"/>
-              <w:left w:w="40" w:type="dxa"/>
-              <w:right w:w="40" w:type="dxa"/>
-            </w:tcMar>
-            <w:shd w:fill="FFFFFF"/>
-            <w:vAlign w:val="center"/>
-          </w:tcPr>
-          <w:p>
-            <w:r>
-              <w:rPr>
-                <w:rFonts w:ascii="Liberation Sans" w:hAnsi="Liberation Sans"/>
-                <w:b w:val="0"/>
-                <w:color w:val="526579"/>
-                <w:sz w:val="14"/>
-              </w:rPr>
-              <w:t>-</w:t>
-            </w:r>
-          </w:p>
-        </w:tc>
-      </w:tr>
-      <w:tr>
-        <w:trPr>
-          <w:cantSplit/>
-        </w:trPr>
-        <w:tc>
-          <w:tcPr>
-            <w:tcW w:type="dxa" w:w="504"/>
-            <w:tcMar>
-              <w:top w:w="60" w:type="dxa"/>
-              <w:bottom w:w="60" w:type="dxa"/>
-              <w:left w:w="40" w:type="dxa"/>
-              <w:right w:w="40" w:type="dxa"/>
-            </w:tcMar>
-            <w:shd w:fill="F0F5F8"/>
-            <w:vAlign w:val="center"/>
-          </w:tcPr>
-          <w:p>
-            <w:r>
-              <w:rPr>
-                <w:rFonts w:ascii="Liberation Sans" w:hAnsi="Liberation Sans"/>
-                <w:b/>
-                <w:color w:val="172E46"/>
-                <w:sz w:val="14"/>
-              </w:rPr>
-              <w:t>7</w:t>
-            </w:r>
-          </w:p>
-        </w:tc>
-        <w:tc>
-          <w:tcPr>
-            <w:tcW w:type="dxa" w:w="1080"/>
-            <w:tcMar>
-              <w:top w:w="60" w:type="dxa"/>
-              <w:bottom w:w="60" w:type="dxa"/>
-              <w:left w:w="40" w:type="dxa"/>
-              <w:right w:w="40" w:type="dxa"/>
-            </w:tcMar>
-            <w:shd w:fill="F0F5F8"/>
-            <w:vAlign w:val="center"/>
-          </w:tcPr>
-          <w:p>
-            <w:r>
-              <w:rPr>
-                <w:rFonts w:ascii="Liberation Sans" w:hAnsi="Liberation Sans"/>
-                <w:b/>
-                <w:color w:val="172E46"/>
-                <w:sz w:val="14"/>
-              </w:rPr>
-              <w:t>MAENG501</w:t>
-            </w:r>
-          </w:p>
-        </w:tc>
-        <w:tc>
-          <w:tcPr>
-            <w:tcW w:type="dxa" w:w="2664"/>
-            <w:tcMar>
-              <w:top w:w="60" w:type="dxa"/>
-              <w:bottom w:w="60" w:type="dxa"/>
-              <w:left w:w="40" w:type="dxa"/>
-              <w:right w:w="40" w:type="dxa"/>
-            </w:tcMar>
-            <w:shd w:fill="F0F5F8"/>
-            <w:vAlign w:val="center"/>
-          </w:tcPr>
-          <w:p>
-            <w:r>
-              <w:rPr>
-                <w:rFonts w:ascii="Liberation Sans" w:hAnsi="Liberation Sans"/>
-                <w:b w:val="0"/>
-                <w:color w:val="172E46"/>
-                <w:sz w:val="14"/>
-              </w:rPr>
-              <w:t>Technical Report Writing</w:t>
-            </w:r>
-          </w:p>
-        </w:tc>
-        <w:tc>
-          <w:tcPr>
-            <w:tcW w:type="dxa" w:w="792"/>
-            <w:tcMar>
-              <w:top w:w="60" w:type="dxa"/>
-              <w:bottom w:w="60" w:type="dxa"/>
-              <w:left w:w="40" w:type="dxa"/>
-              <w:right w:w="40" w:type="dxa"/>
-            </w:tcMar>
-            <w:shd w:fill="F0F5F8"/>
-            <w:vAlign w:val="center"/>
-          </w:tcPr>
-          <w:p>
-            <w:r>
-              <w:rPr>
-                <w:rFonts w:ascii="Liberation Sans" w:hAnsi="Liberation Sans"/>
-                <w:b w:val="0"/>
-                <w:color w:val="172E46"/>
-                <w:sz w:val="14"/>
-              </w:rPr>
-              <w:t>ETH</w:t>
-            </w:r>
-          </w:p>
-        </w:tc>
-        <w:tc>
-          <w:tcPr>
-            <w:tcW w:type="dxa" w:w="1368"/>
-            <w:tcMar>
-              <w:top w:w="60" w:type="dxa"/>
-              <w:bottom w:w="60" w:type="dxa"/>
-              <w:left w:w="40" w:type="dxa"/>
-              <w:right w:w="40" w:type="dxa"/>
-            </w:tcMar>
-            <w:shd w:fill="F0F5F8"/>
-            <w:vAlign w:val="center"/>
-          </w:tcPr>
-          <w:p>
-            <w:r>
-              <w:rPr>
-                <w:rFonts w:ascii="Liberation Sans" w:hAnsi="Liberation Sans"/>
-                <w:b w:val="0"/>
-                <w:color w:val="172E46"/>
-                <w:sz w:val="12"/>
-              </w:rPr>
-              <w:t>VL2026270106586</w:t>
-            </w:r>
-          </w:p>
-        </w:tc>
-        <w:tc>
-          <w:tcPr>
-            <w:tcW w:type="dxa" w:w="792"/>
-            <w:tcMar>
-              <w:top w:w="60" w:type="dxa"/>
-              <w:bottom w:w="60" w:type="dxa"/>
-              <w:left w:w="40" w:type="dxa"/>
-              <w:right w:w="40" w:type="dxa"/>
-            </w:tcMar>
-            <w:shd w:fill="F0F5F8"/>
-            <w:vAlign w:val="center"/>
-          </w:tcPr>
-          <w:p>
-            <w:r>
-              <w:rPr>
-                <w:rFonts w:ascii="Liberation Sans" w:hAnsi="Liberation Sans"/>
-                <w:b w:val="0"/>
-                <w:color w:val="172E46"/>
-                <w:sz w:val="14"/>
-              </w:rPr>
-              <w:t>TAA1</w:t>
-            </w:r>
-          </w:p>
-        </w:tc>
-        <w:tc>
-          <w:tcPr>
-            <w:tcW w:type="dxa" w:w="1080"/>
-            <w:tcMar>
-              <w:top w:w="60" w:type="dxa"/>
-              <w:bottom w:w="60" w:type="dxa"/>
-              <w:left w:w="40" w:type="dxa"/>
-              <w:right w:w="40" w:type="dxa"/>
-            </w:tcMar>
-            <w:shd w:fill="F0F5F8"/>
-            <w:vAlign w:val="center"/>
-          </w:tcPr>
-          <w:p>
-            <w:r>
-              <w:rPr>
-                <w:rFonts w:ascii="Liberation Sans" w:hAnsi="Liberation Sans"/>
-                <w:b/>
-                <w:color w:val="172E46"/>
-                <w:sz w:val="14"/>
-              </w:rPr>
-              <w:t>01-Dec-2026</w:t>
-            </w:r>
-            <w:r>
-              <w:rPr>
-                <w:rFonts w:ascii="Liberation Sans" w:hAnsi="Liberation Sans"/>
-                <w:b w:val="0"/>
-                <w:color w:val="172E46"/>
-                <w:sz w:val="2"/>
-              </w:rPr>
-            </w:r>
-          </w:p>
-          <w:p>
-            <w:r>
-              <w:rPr>
-                <w:rFonts w:ascii="Liberation Sans" w:hAnsi="Liberation Sans"/>
-                <w:b w:val="0"/>
-                <w:color w:val="526579"/>
-                <w:sz w:val="12"/>
-              </w:rPr>
-              <w:t>Tue</w:t>
-            </w:r>
-          </w:p>
-        </w:tc>
-        <w:tc>
-          <w:tcPr>
-            <w:tcW w:type="dxa" w:w="864"/>
-            <w:tcMar>
-              <w:top w:w="60" w:type="dxa"/>
-              <w:bottom w:w="60" w:type="dxa"/>
-              <w:left w:w="40" w:type="dxa"/>
-              <w:right w:w="40" w:type="dxa"/>
-            </w:tcMar>
-            <w:shd w:fill="F0F5F8"/>
-            <w:vAlign w:val="center"/>
-          </w:tcPr>
-          <w:p>
-            <w:r>
-              <w:rPr>
-                <w:rFonts w:ascii="Liberation Sans" w:hAnsi="Liberation Sans"/>
-                <w:b w:val="0"/>
-                <w:color w:val="172E46"/>
-                <w:sz w:val="14"/>
-              </w:rPr>
-              <w:t>FN1</w:t>
-            </w:r>
-          </w:p>
-        </w:tc>
-        <w:tc>
-          <w:tcPr>
-            <w:tcW w:type="dxa" w:w="1008"/>
-            <w:tcMar>
-              <w:top w:w="60" w:type="dxa"/>
-              <w:bottom w:w="60" w:type="dxa"/>
-              <w:left w:w="40" w:type="dxa"/>
-              <w:right w:w="40" w:type="dxa"/>
-            </w:tcMar>
-            <w:shd w:fill="F0F5F8"/>
-            <w:vAlign w:val="center"/>
-          </w:tcPr>
-          <w:p>
-            <w:r>
-              <w:rPr>
-                <w:rFonts w:ascii="Liberation Sans" w:hAnsi="Liberation Sans"/>
-                <w:b w:val="0"/>
-                <w:color w:val="172E46"/>
-                <w:sz w:val="14"/>
-              </w:rPr>
-              <w:t>08:45 AM</w:t>
-            </w:r>
-          </w:p>
-        </w:tc>
-        <w:tc>
-          <w:tcPr>
-            <w:tcW w:type="dxa" w:w="1368"/>
-            <w:tcMar>
-              <w:top w:w="60" w:type="dxa"/>
-              <w:bottom w:w="60" w:type="dxa"/>
-              <w:left w:w="40" w:type="dxa"/>
-              <w:right w:w="40" w:type="dxa"/>
-            </w:tcMar>
-            <w:shd w:fill="F0F5F8"/>
-            <w:vAlign w:val="center"/>
-          </w:tcPr>
-          <w:p>
-            <w:r>
-              <w:rPr>
-                <w:rFonts w:ascii="Liberation Sans" w:hAnsi="Liberation Sans"/>
-                <w:b/>
-                <w:color w:val="172E46"/>
-                <w:sz w:val="14"/>
-              </w:rPr>
-              <w:t>09:30 AM - 12:30 PM</w:t>
-            </w:r>
-          </w:p>
-        </w:tc>
-        <w:tc>
-          <w:tcPr>
-            <w:tcW w:type="dxa" w:w="648"/>
-            <w:tcMar>
-              <w:top w:w="60" w:type="dxa"/>
-              <w:bottom w:w="60" w:type="dxa"/>
-              <w:left w:w="40" w:type="dxa"/>
-              <w:right w:w="40" w:type="dxa"/>
-            </w:tcMar>
-            <w:shd w:fill="F0F5F8"/>
-            <w:vAlign w:val="center"/>
-          </w:tcPr>
-          <w:p>
-            <w:r>
-              <w:rPr>
-                <w:rFonts w:ascii="Liberation Sans" w:hAnsi="Liberation Sans"/>
-                <w:b w:val="0"/>
-                <w:color w:val="526579"/>
-                <w:sz w:val="14"/>
-              </w:rPr>
-              <w:t>-</w:t>
-            </w:r>
-          </w:p>
-        </w:tc>
-        <w:tc>
-          <w:tcPr>
-            <w:tcW w:type="dxa" w:w="792"/>
-            <w:tcMar>
-              <w:top w:w="60" w:type="dxa"/>
-              <w:bottom w:w="60" w:type="dxa"/>
-              <w:left w:w="40" w:type="dxa"/>
-              <w:right w:w="40" w:type="dxa"/>
-            </w:tcMar>
-            <w:shd w:fill="F0F5F8"/>
-            <w:vAlign w:val="center"/>
-          </w:tcPr>
-          <w:p>
-            <w:r>
-              <w:rPr>
-                <w:rFonts w:ascii="Liberation Sans" w:hAnsi="Liberation Sans"/>
-                <w:b w:val="0"/>
-                <w:color w:val="526579"/>
-                <w:sz w:val="14"/>
-              </w:rPr>
-              <w:t>-</w:t>
-            </w:r>
-          </w:p>
-        </w:tc>
-        <w:tc>
-          <w:tcPr>
-            <w:tcW w:type="dxa" w:w="648"/>
-            <w:tcMar>
-              <w:top w:w="60" w:type="dxa"/>
-              <w:bottom w:w="60" w:type="dxa"/>
-              <w:left w:w="40" w:type="dxa"/>
-              <w:right w:w="40" w:type="dxa"/>
-            </w:tcMar>
-            <w:shd w:fill="F0F5F8"/>
-            <w:vAlign w:val="center"/>
-          </w:tcPr>
-          <w:p>
-            <w:r>
-              <w:rPr>
-                <w:rFonts w:ascii="Liberation Sans" w:hAnsi="Liberation Sans"/>
-                <w:b w:val="0"/>
-                <w:color w:val="526579"/>
-                <w:sz w:val="14"/>
+                <w:sz w:val="20"/>
               </w:rPr>
               <w:t>-</w:t>
             </w:r>
@@ -2746,14 +2898,14 @@
     </w:tbl>
     <w:p>
       <w:pPr>
-        <w:spacing w:before="160"/>
+        <w:spacing w:before="200"/>
       </w:pPr>
       <w:r>
         <w:rPr>
           <w:rFonts w:ascii="Liberation Sans" w:hAnsi="Liberation Sans"/>
           <w:b/>
           <w:color w:val="007F83"/>
-          <w:sz w:val="16"/>
+          <w:sz w:val="18"/>
         </w:rPr>
         <w:t>NOTES</w:t>
       </w:r>
@@ -2762,28 +2914,26 @@
       <w:r>
         <w:rPr>
           <w:rFonts w:ascii="Liberation Sans" w:hAnsi="Liberation Sans"/>
-          <w:b w:val="0"/>
           <w:color w:val="526579"/>
-          <w:sz w:val="14"/>
+          <w:sz w:val="16"/>
         </w:rPr>
-        <w:t>FAT - Final Assessment: 3-hour papers (09:30 AM-12:30 PM) except Competitive Coding I (1.5 hr: 11:00 AM-12:30 PM). All FN1 report at 08:45 AM, FN3 at 10:30 AM. Venue/Seat not allotted yet.</w:t>
+        <w:t>FAT - 3-hour papers (09:30 AM-12:30 PM) except Competitive Coding I (1.5 hr). FN1 report 08:45 AM, FN3 10:30 AM. Venue/Seat not allotted yet.</w:t>
       </w:r>
     </w:p>
     <w:p>
       <w:r>
         <w:rPr>
           <w:rFonts w:ascii="Liberation Sans" w:hAnsi="Liberation Sans"/>
-          <w:b w:val="0"/>
           <w:color w:val="526579"/>
-          <w:sz w:val="12"/>
+          <w:sz w:val="14"/>
         </w:rPr>
-        <w:t>Source: Official VTOP timetable screenshots supplied. Dates and times reproduced as shown; weekdays calculated for 2026.</w:t>
+        <w:t>Source: Official VTOP timetable. Dates/times as per screenshot; weekdays calculated for 2026.</w:t>
       </w:r>
     </w:p>
     <w:sectPr>
       <w:footerReference w:type="default" r:id="rId9"/>
       <w:pgSz w:w="16834" w:h="11909"/>
-      <w:pgMar w:top="576" w:right="504" w:bottom="576" w:left="504" w:header="216" w:footer="216" w:gutter="0"/>
+      <w:pgMar w:top="432" w:right="504" w:bottom="432" w:left="504" w:header="144" w:footer="144" w:gutter="0"/>
       <w:cols w:space="720"/>
       <w:docGrid w:linePitch="360"/>
     </w:sectPr>
@@ -2803,7 +2953,7 @@
         <w:rFonts w:ascii="Liberation Sans" w:hAnsi="Liberation Sans"/>
         <w:b/>
         <w:color w:val="526579"/>
-        <w:sz w:val="14"/>
+        <w:sz w:val="16"/>
       </w:rPr>
       <w:t>HASNAIN MAKADA  |  ACADEMIC SCHEDULE</w:t>
     </w:r>
@@ -3175,12 +3325,12 @@
     <w:qFormat/>
     <w:rsid w:val="00FC693F"/>
     <w:pPr>
-      <w:spacing w:after="0"/>
+      <w:spacing w:after="0" w:before="0" w:line="240" w:lineRule="auto"/>
     </w:pPr>
     <w:rPr>
       <w:rFonts w:ascii="Liberation Sans" w:hAnsi="Liberation Sans"/>
       <w:color w:val="172E46"/>
-      <w:sz w:val="16"/>
+      <w:sz w:val="20"/>
     </w:rPr>
   </w:style>
   <w:style w:type="paragraph" w:styleId="Header">

</xml_diff>